<commit_message>
Add Gimpo birth statistics and PDF/HTML versions of meeting materials
Fill the birth-trend table with Gimpo's 2025 registered births (2,574),
deaths, population change, Gyeonggi city comparison, and add PDF and
HTML renderings of the handout alongside the Word file.

Co-Authored-By: Claude Fable 5.1 <noreply@anthropic.com>
Claude-Session: https://claude.ai/code/session_01YQpD7bdbUWBdDGpeeL147H
</commit_message>
<xml_diff>
--- a/meetings/2026-09-19-관리사-정기회의-자료.docx
+++ b/meetings/2026-09-19-관리사-정기회의-자료.docx
@@ -1220,7 +1220,7 @@
                 <w:sz w:val="18"/>
                 <w:szCs w:val="18"/>
               </w:rPr>
-              <w:t xml:space="preserve">전년 대비 +16,100명(+6.8%)</w:t>
+              <w:t xml:space="preserve">전년 대비 +16,100명(+6.8%), 2010년 이후 최다</w:t>
             </w:r>
           </w:p>
         </w:tc>
@@ -1417,7 +1417,7 @@
                 <w:sz w:val="18"/>
                 <w:szCs w:val="18"/>
               </w:rPr>
-              <w:t xml:space="preserve">김포시 인구 (2025년 12월 31일)</w:t>
+              <w:t xml:space="preserve">경기도 출생아 수 (2025년)</w:t>
             </w:r>
           </w:p>
         </w:tc>
@@ -1443,7 +1443,7 @@
                 <w:sz w:val="18"/>
                 <w:szCs w:val="18"/>
               </w:rPr>
-              <w:t xml:space="preserve">517,351명</w:t>
+              <w:t xml:space="preserve">77,702명</w:t>
             </w:r>
           </w:p>
         </w:tc>
@@ -1469,7 +1469,7 @@
                 <w:sz w:val="18"/>
                 <w:szCs w:val="18"/>
               </w:rPr>
-              <w:t xml:space="preserve">김포시 주요통계</w:t>
+              <w:t xml:space="preserve">전국 최다. 화성 8,116 · 수원 7,060 · 용인 5,906 · 고양 5,522명</w:t>
             </w:r>
           </w:p>
         </w:tc>
@@ -1495,12 +1495,12 @@
             <w:r>
               <w:rPr>
                 <w:rFonts w:ascii="맑은 고딕" w:cs="맑은 고딕" w:eastAsia="맑은 고딕" w:hAnsi="맑은 고딕"/>
-                <w:b w:val="false"/>
-                <w:bCs w:val="false"/>
-                <w:sz w:val="18"/>
-                <w:szCs w:val="18"/>
-              </w:rPr>
-              <w:t xml:space="preserve">김포시 출생아 수 (2025년)</w:t>
+                <w:b/>
+                <w:bCs/>
+                <w:sz w:val="18"/>
+                <w:szCs w:val="18"/>
+              </w:rPr>
+              <w:t xml:space="preserve">김포시 출생 등록 (2025년)</w:t>
             </w:r>
           </w:p>
         </w:tc>
@@ -1521,12 +1521,12 @@
             <w:r>
               <w:rPr>
                 <w:rFonts w:ascii="맑은 고딕" w:cs="맑은 고딕" w:eastAsia="맑은 고딕" w:hAnsi="맑은 고딕"/>
-                <w:b w:val="false"/>
-                <w:bCs w:val="false"/>
-                <w:sz w:val="18"/>
-                <w:szCs w:val="18"/>
-              </w:rPr>
-              <w:t xml:space="preserve">[기입]</w:t>
+                <w:b/>
+                <w:bCs/>
+                <w:sz w:val="18"/>
+                <w:szCs w:val="18"/>
+              </w:rPr>
+              <w:t xml:space="preserve">2,574명</w:t>
             </w:r>
           </w:p>
         </w:tc>
@@ -1552,7 +1552,7 @@
                 <w:sz w:val="18"/>
                 <w:szCs w:val="18"/>
               </w:rPr>
-              <w:t xml:space="preserve">김포시 인구브리핑 확인</w:t>
+              <w:t xml:space="preserve">김포시 주요통계(주민등록 기준, 2025. 12. 31.)</w:t>
             </w:r>
           </w:p>
         </w:tc>
@@ -1583,7 +1583,7 @@
                 <w:sz w:val="18"/>
                 <w:szCs w:val="18"/>
               </w:rPr>
-              <w:t xml:space="preserve">김포시 출생아 수 (2026년 1~8월)</w:t>
+              <w:t xml:space="preserve">김포시 사망 (2025년)</w:t>
             </w:r>
           </w:p>
         </w:tc>
@@ -1609,6 +1609,255 @@
                 <w:sz w:val="18"/>
                 <w:szCs w:val="18"/>
               </w:rPr>
+              <w:t xml:space="preserve">2,715명</w:t>
+            </w:r>
+          </w:p>
+        </w:tc>
+        <w:tc>
+          <w:tcPr>
+            <w:tcW w:type="dxa" w:w="3855"/>
+            <w:tcMar>
+              <w:top w:type="dxa" w:w="60"/>
+              <w:left w:type="dxa" w:w="100"/>
+              <w:bottom w:type="dxa" w:w="60"/>
+              <w:right w:type="dxa" w:w="100"/>
+            </w:tcMar>
+          </w:tcPr>
+          <w:p>
+            <w:pPr>
+              <w:spacing w:after="0"/>
+            </w:pPr>
+            <w:r>
+              <w:rPr>
+                <w:rFonts w:ascii="맑은 고딕" w:cs="맑은 고딕" w:eastAsia="맑은 고딕" w:hAnsi="맑은 고딕"/>
+                <w:b w:val="false"/>
+                <w:bCs w:val="false"/>
+                <w:sz w:val="18"/>
+                <w:szCs w:val="18"/>
+              </w:rPr>
+              <w:t xml:space="preserve">출생보다 사망이 141명 많음(자연감소)</w:t>
+            </w:r>
+          </w:p>
+        </w:tc>
+      </w:tr>
+      <w:tr>
+        <w:trPr>
+          <w:tblHeader w:val="false"/>
+        </w:trPr>
+        <w:tc>
+          <w:tcPr>
+            <w:tcW w:type="dxa" w:w="1928"/>
+            <w:tcMar>
+              <w:top w:type="dxa" w:w="60"/>
+              <w:left w:type="dxa" w:w="100"/>
+              <w:bottom w:type="dxa" w:w="60"/>
+              <w:right w:type="dxa" w:w="100"/>
+            </w:tcMar>
+          </w:tcPr>
+          <w:p>
+            <w:pPr>
+              <w:spacing w:after="0"/>
+            </w:pPr>
+            <w:r>
+              <w:rPr>
+                <w:rFonts w:ascii="맑은 고딕" w:cs="맑은 고딕" w:eastAsia="맑은 고딕" w:hAnsi="맑은 고딕"/>
+                <w:b w:val="false"/>
+                <w:bCs w:val="false"/>
+                <w:sz w:val="18"/>
+                <w:szCs w:val="18"/>
+              </w:rPr>
+              <w:t xml:space="preserve">김포시 인구 (2025년 12월 31일)</w:t>
+            </w:r>
+          </w:p>
+        </w:tc>
+        <w:tc>
+          <w:tcPr>
+            <w:tcW w:type="dxa" w:w="3855"/>
+            <w:tcMar>
+              <w:top w:type="dxa" w:w="60"/>
+              <w:left w:type="dxa" w:w="100"/>
+              <w:bottom w:type="dxa" w:w="60"/>
+              <w:right w:type="dxa" w:w="100"/>
+            </w:tcMar>
+          </w:tcPr>
+          <w:p>
+            <w:pPr>
+              <w:spacing w:after="0"/>
+            </w:pPr>
+            <w:r>
+              <w:rPr>
+                <w:rFonts w:ascii="맑은 고딕" w:cs="맑은 고딕" w:eastAsia="맑은 고딕" w:hAnsi="맑은 고딕"/>
+                <w:b w:val="false"/>
+                <w:bCs w:val="false"/>
+                <w:sz w:val="18"/>
+                <w:szCs w:val="18"/>
+              </w:rPr>
+              <w:t xml:space="preserve">517,351명</w:t>
+            </w:r>
+          </w:p>
+        </w:tc>
+        <w:tc>
+          <w:tcPr>
+            <w:tcW w:type="dxa" w:w="3855"/>
+            <w:tcMar>
+              <w:top w:type="dxa" w:w="60"/>
+              <w:left w:type="dxa" w:w="100"/>
+              <w:bottom w:type="dxa" w:w="60"/>
+              <w:right w:type="dxa" w:w="100"/>
+            </w:tcMar>
+          </w:tcPr>
+          <w:p>
+            <w:pPr>
+              <w:spacing w:after="0"/>
+            </w:pPr>
+            <w:r>
+              <w:rPr>
+                <w:rFonts w:ascii="맑은 고딕" w:cs="맑은 고딕" w:eastAsia="맑은 고딕" w:hAnsi="맑은 고딕"/>
+                <w:b w:val="false"/>
+                <w:bCs w:val="false"/>
+                <w:sz w:val="18"/>
+                <w:szCs w:val="18"/>
+              </w:rPr>
+              <w:t xml:space="preserve">2024년 말 512,461명 대비 +4,890명</w:t>
+            </w:r>
+          </w:p>
+        </w:tc>
+      </w:tr>
+      <w:tr>
+        <w:trPr>
+          <w:tblHeader w:val="false"/>
+        </w:trPr>
+        <w:tc>
+          <w:tcPr>
+            <w:tcW w:type="dxa" w:w="1928"/>
+            <w:tcMar>
+              <w:top w:type="dxa" w:w="60"/>
+              <w:left w:type="dxa" w:w="100"/>
+              <w:bottom w:type="dxa" w:w="60"/>
+              <w:right w:type="dxa" w:w="100"/>
+            </w:tcMar>
+          </w:tcPr>
+          <w:p>
+            <w:pPr>
+              <w:spacing w:after="0"/>
+            </w:pPr>
+            <w:r>
+              <w:rPr>
+                <w:rFonts w:ascii="맑은 고딕" w:cs="맑은 고딕" w:eastAsia="맑은 고딕" w:hAnsi="맑은 고딕"/>
+                <w:b w:val="false"/>
+                <w:bCs w:val="false"/>
+                <w:sz w:val="18"/>
+                <w:szCs w:val="18"/>
+              </w:rPr>
+              <w:t xml:space="preserve">김포시 조출생률 (2025년, 계산치)</w:t>
+            </w:r>
+          </w:p>
+        </w:tc>
+        <w:tc>
+          <w:tcPr>
+            <w:tcW w:type="dxa" w:w="3855"/>
+            <w:tcMar>
+              <w:top w:type="dxa" w:w="60"/>
+              <w:left w:type="dxa" w:w="100"/>
+              <w:bottom w:type="dxa" w:w="60"/>
+              <w:right w:type="dxa" w:w="100"/>
+            </w:tcMar>
+          </w:tcPr>
+          <w:p>
+            <w:pPr>
+              <w:spacing w:after="0"/>
+            </w:pPr>
+            <w:r>
+              <w:rPr>
+                <w:rFonts w:ascii="맑은 고딕" w:cs="맑은 고딕" w:eastAsia="맑은 고딕" w:hAnsi="맑은 고딕"/>
+                <w:b w:val="false"/>
+                <w:bCs w:val="false"/>
+                <w:sz w:val="18"/>
+                <w:szCs w:val="18"/>
+              </w:rPr>
+              <w:t xml:space="preserve">인구 1,000명당 약 5.0명</w:t>
+            </w:r>
+          </w:p>
+        </w:tc>
+        <w:tc>
+          <w:tcPr>
+            <w:tcW w:type="dxa" w:w="3855"/>
+            <w:tcMar>
+              <w:top w:type="dxa" w:w="60"/>
+              <w:left w:type="dxa" w:w="100"/>
+              <w:bottom w:type="dxa" w:w="60"/>
+              <w:right w:type="dxa" w:w="100"/>
+            </w:tcMar>
+          </w:tcPr>
+          <w:p>
+            <w:pPr>
+              <w:spacing w:after="0"/>
+            </w:pPr>
+            <w:r>
+              <w:rPr>
+                <w:rFonts w:ascii="맑은 고딕" w:cs="맑은 고딕" w:eastAsia="맑은 고딕" w:hAnsi="맑은 고딕"/>
+                <w:b w:val="false"/>
+                <w:bCs w:val="false"/>
+                <w:sz w:val="18"/>
+                <w:szCs w:val="18"/>
+              </w:rPr>
+              <w:t xml:space="preserve">2,574 ÷ 517,351. 전국 2024년 4.7명과 비슷한 수준</w:t>
+            </w:r>
+          </w:p>
+        </w:tc>
+      </w:tr>
+      <w:tr>
+        <w:trPr>
+          <w:tblHeader w:val="false"/>
+        </w:trPr>
+        <w:tc>
+          <w:tcPr>
+            <w:tcW w:type="dxa" w:w="1928"/>
+            <w:tcMar>
+              <w:top w:type="dxa" w:w="60"/>
+              <w:left w:type="dxa" w:w="100"/>
+              <w:bottom w:type="dxa" w:w="60"/>
+              <w:right w:type="dxa" w:w="100"/>
+            </w:tcMar>
+          </w:tcPr>
+          <w:p>
+            <w:pPr>
+              <w:spacing w:after="0"/>
+            </w:pPr>
+            <w:r>
+              <w:rPr>
+                <w:rFonts w:ascii="맑은 고딕" w:cs="맑은 고딕" w:eastAsia="맑은 고딕" w:hAnsi="맑은 고딕"/>
+                <w:b w:val="false"/>
+                <w:bCs w:val="false"/>
+                <w:sz w:val="18"/>
+                <w:szCs w:val="18"/>
+              </w:rPr>
+              <w:t xml:space="preserve">김포시 출생 등록 (2026년 1~8월)</w:t>
+            </w:r>
+          </w:p>
+        </w:tc>
+        <w:tc>
+          <w:tcPr>
+            <w:tcW w:type="dxa" w:w="3855"/>
+            <w:tcMar>
+              <w:top w:type="dxa" w:w="60"/>
+              <w:left w:type="dxa" w:w="100"/>
+              <w:bottom w:type="dxa" w:w="60"/>
+              <w:right w:type="dxa" w:w="100"/>
+            </w:tcMar>
+          </w:tcPr>
+          <w:p>
+            <w:pPr>
+              <w:spacing w:after="0"/>
+            </w:pPr>
+            <w:r>
+              <w:rPr>
+                <w:rFonts w:ascii="맑은 고딕" w:cs="맑은 고딕" w:eastAsia="맑은 고딕" w:hAnsi="맑은 고딕"/>
+                <w:b w:val="false"/>
+                <w:bCs w:val="false"/>
+                <w:sz w:val="18"/>
+                <w:szCs w:val="18"/>
+              </w:rPr>
               <w:t xml:space="preserve">[기입]</w:t>
             </w:r>
           </w:p>
@@ -1635,7 +1884,7 @@
                 <w:sz w:val="18"/>
                 <w:szCs w:val="18"/>
               </w:rPr>
-              <w:t xml:space="preserve">전년 동기 대비 증감</w:t>
+              <w:t xml:space="preserve">김포시 인구브리핑(매월 게시) 확인, 전년 동기 대비 증감</w:t>
             </w:r>
           </w:p>
         </w:tc>
@@ -1661,7 +1910,43 @@
           <w:sz w:val="20"/>
           <w:szCs w:val="20"/>
         </w:rPr>
-        <w:t xml:space="preserve">전국적으로는 출생아 수가 2024년부터 반등해 2026년까지 증가세가 이어지고 있습니다. 김포시의 최신 출생아 수와 합계출산율은 김포시 인구브리핑(김포시청 홈페이지) 수치를 확인해 회의 전 표에 채워 주십시오.</w:t>
+        <w:t xml:space="preserve">전국과 경기도는 2024년부터 출생아 수가 반등해 2026년까지 증가세입니다. 김포시는 2025년 출생 등록 2,574명으로, 인구 51만 도시로는 화성·수원·용인·고양보다 출생 규모가 작고, 2025년에는 사망이 출생을 넘는 자연감소를 기록했습니다.</w:t>
+      </w:r>
+    </w:p>
+    <w:p>
+      <w:pPr>
+        <w:pStyle w:val="ListParagraph"/>
+        <w:numPr>
+          <w:ilvl w:val="0"/>
+          <w:numId w:val="3"/>
+        </w:numPr>
+        <w:spacing w:after="60"/>
+      </w:pPr>
+      <w:r>
+        <w:rPr>
+          <w:rFonts w:ascii="맑은 고딕" w:cs="맑은 고딕" w:eastAsia="맑은 고딕" w:hAnsi="맑은 고딕"/>
+          <w:sz w:val="20"/>
+          <w:szCs w:val="20"/>
+        </w:rPr>
+        <w:t xml:space="preserve">김포시 출생 수치는 주민등록 출생등록 기준(행정안전부)이며, 통계청 출생신고 기준과는 소폭 차이가 있을 수 있습니다. 2026년 월별 수치는 김포시청 인구브리핑에서 확인해 회의 전 표에 채워 주십시오.</w:t>
+      </w:r>
+    </w:p>
+    <w:p>
+      <w:pPr>
+        <w:pStyle w:val="ListParagraph"/>
+        <w:numPr>
+          <w:ilvl w:val="0"/>
+          <w:numId w:val="3"/>
+        </w:numPr>
+        <w:spacing w:after="60"/>
+      </w:pPr>
+      <w:r>
+        <w:rPr>
+          <w:rFonts w:ascii="맑은 고딕" w:cs="맑은 고딕" w:eastAsia="맑은 고딕" w:hAnsi="맑은 고딕"/>
+          <w:sz w:val="20"/>
+          <w:szCs w:val="20"/>
+        </w:rPr>
+        <w:t xml:space="preserve">시사점: 전국 출생 반등 흐름 속에서도 김포시 출생 규모는 정체에 가깝습니다. 김포시 한 곳의 산모 수요만으로는 성장에 한계가 있어, 인근 지역 확대(2-3)와 가사·돌봄 영역 확대(안건 3·4)가 필요합니다.</w:t>
       </w:r>
     </w:p>
     <w:p>
@@ -8035,6 +8320,60 @@
           <w:szCs w:val="20"/>
         </w:rPr>
         <w:t xml:space="preserve">김포시청, 「주요통계 목록(2025년 12월 말 기준 인구현황)」 https://www.gimpo.go.kr/portal/selectBbsNttView.do?key=1145&amp;bbsNo=236&amp;searchCnd=all&amp;deleteAt=N&amp;pageUnit=10&amp;pageIndex=1&amp;nttNo=961541</w:t>
+      </w:r>
+    </w:p>
+    <w:p>
+      <w:pPr>
+        <w:pStyle w:val="ListParagraph"/>
+        <w:numPr>
+          <w:ilvl w:val="0"/>
+          <w:numId w:val="3"/>
+        </w:numPr>
+        <w:spacing w:after="60"/>
+      </w:pPr>
+      <w:r>
+        <w:rPr>
+          <w:rFonts w:ascii="맑은 고딕" w:cs="맑은 고딕" w:eastAsia="맑은 고딕" w:hAnsi="맑은 고딕"/>
+          <w:sz w:val="20"/>
+          <w:szCs w:val="20"/>
+        </w:rPr>
+        <w:t xml:space="preserve">김포시청, 「통계로 보는 김포」 및 주요통계(2025년 12월 31일 기준 출생·사망·인구) https://www.gimpo.go.kr/portal/contents.do?key=1144</w:t>
+      </w:r>
+    </w:p>
+    <w:p>
+      <w:pPr>
+        <w:pStyle w:val="ListParagraph"/>
+        <w:numPr>
+          <w:ilvl w:val="0"/>
+          <w:numId w:val="3"/>
+        </w:numPr>
+        <w:spacing w:after="60"/>
+      </w:pPr>
+      <w:r>
+        <w:rPr>
+          <w:rFonts w:ascii="맑은 고딕" w:cs="맑은 고딕" w:eastAsia="맑은 고딕" w:hAnsi="맑은 고딕"/>
+          <w:sz w:val="20"/>
+          <w:szCs w:val="20"/>
+        </w:rPr>
+        <w:t xml:space="preserve">네이트뉴스(연합뉴스), 「김포시 인구 10년새 44% 증가…51만2천명」(2026. 1. 9.) https://news.nate.com/view/20260109n21107</w:t>
+      </w:r>
+    </w:p>
+    <w:p>
+      <w:pPr>
+        <w:pStyle w:val="ListParagraph"/>
+        <w:numPr>
+          <w:ilvl w:val="0"/>
+          <w:numId w:val="3"/>
+        </w:numPr>
+        <w:spacing w:after="60"/>
+      </w:pPr>
+      <w:r>
+        <w:rPr>
+          <w:rFonts w:ascii="맑은 고딕" w:cs="맑은 고딕" w:eastAsia="맑은 고딕" w:hAnsi="맑은 고딕"/>
+          <w:sz w:val="20"/>
+          <w:szCs w:val="20"/>
+        </w:rPr>
+        <w:t xml:space="preserve">서울Pn, 「화성시, 2025년 출생아 수 8천116명…3년 연속 전국 '1위'」(경기도 시군별 출생아 수) https://go.seoul.co.kr/news/newsView.php?id=20260108500090</w:t>
       </w:r>
     </w:p>
     <w:p>

</xml_diff>

<commit_message>
Distinguish Gimpo registered population from total population incl. foreigners
Co-Authored-By: Claude Fable 5.1 <noreply@anthropic.com>
Claude-Session: https://claude.ai/code/session_01YQpD7bdbUWBdDGpeeL147H
</commit_message>
<xml_diff>
--- a/meetings/2026-09-19-관리사-정기회의-자료.docx
+++ b/meetings/2026-09-19-관리사-정기회의-자료.docx
@@ -1666,7 +1666,7 @@
                 <w:sz w:val="18"/>
                 <w:szCs w:val="18"/>
               </w:rPr>
-              <w:t xml:space="preserve">김포시 인구 (2025년 12월 31일)</w:t>
+              <w:t xml:space="preserve">김포시 주민등록 인구(내국인)</w:t>
             </w:r>
           </w:p>
         </w:tc>
@@ -1692,7 +1692,7 @@
                 <w:sz w:val="18"/>
                 <w:szCs w:val="18"/>
               </w:rPr>
-              <w:t xml:space="preserve">517,351명</w:t>
+              <w:t xml:space="preserve">약 48만 명대</w:t>
             </w:r>
           </w:p>
         </w:tc>
@@ -1718,7 +1718,7 @@
                 <w:sz w:val="18"/>
                 <w:szCs w:val="18"/>
               </w:rPr>
-              <w:t xml:space="preserve">2024년 말 512,461명 대비 +4,890명</w:t>
+              <w:t xml:space="preserve">통계청·행정안전부 기준. 정확한 수치는 김포시 인구브리핑 확인 → [기입]</w:t>
             </w:r>
           </w:p>
         </w:tc>
@@ -1749,7 +1749,7 @@
                 <w:sz w:val="18"/>
                 <w:szCs w:val="18"/>
               </w:rPr>
-              <w:t xml:space="preserve">김포시 조출생률 (2025년, 계산치)</w:t>
+              <w:t xml:space="preserve">김포시 총인구 (2025년 12월 31일)</w:t>
             </w:r>
           </w:p>
         </w:tc>
@@ -1775,7 +1775,7 @@
                 <w:sz w:val="18"/>
                 <w:szCs w:val="18"/>
               </w:rPr>
-              <w:t xml:space="preserve">인구 1,000명당 약 5.0명</w:t>
+              <w:t xml:space="preserve">517,351명</w:t>
             </w:r>
           </w:p>
         </w:tc>
@@ -1801,7 +1801,7 @@
                 <w:sz w:val="18"/>
                 <w:szCs w:val="18"/>
               </w:rPr>
-              <w:t xml:space="preserve">2,574 ÷ 517,351. 전국 2024년 4.7명과 비슷한 수준</w:t>
+              <w:t xml:space="preserve">김포시 주요통계. 등록외국인·국내거소자 약 3만 명 포함</w:t>
             </w:r>
           </w:p>
         </w:tc>
@@ -1832,6 +1832,89 @@
                 <w:sz w:val="18"/>
                 <w:szCs w:val="18"/>
               </w:rPr>
+              <w:t xml:space="preserve">김포시 조출생률 (2025년, 계산치)</w:t>
+            </w:r>
+          </w:p>
+        </w:tc>
+        <w:tc>
+          <w:tcPr>
+            <w:tcW w:type="dxa" w:w="3855"/>
+            <w:tcMar>
+              <w:top w:type="dxa" w:w="60"/>
+              <w:left w:type="dxa" w:w="100"/>
+              <w:bottom w:type="dxa" w:w="60"/>
+              <w:right w:type="dxa" w:w="100"/>
+            </w:tcMar>
+          </w:tcPr>
+          <w:p>
+            <w:pPr>
+              <w:spacing w:after="0"/>
+            </w:pPr>
+            <w:r>
+              <w:rPr>
+                <w:rFonts w:ascii="맑은 고딕" w:cs="맑은 고딕" w:eastAsia="맑은 고딕" w:hAnsi="맑은 고딕"/>
+                <w:b w:val="false"/>
+                <w:bCs w:val="false"/>
+                <w:sz w:val="18"/>
+                <w:szCs w:val="18"/>
+              </w:rPr>
+              <w:t xml:space="preserve">인구 1,000명당 약 5.0~5.3명</w:t>
+            </w:r>
+          </w:p>
+        </w:tc>
+        <w:tc>
+          <w:tcPr>
+            <w:tcW w:type="dxa" w:w="3855"/>
+            <w:tcMar>
+              <w:top w:type="dxa" w:w="60"/>
+              <w:left w:type="dxa" w:w="100"/>
+              <w:bottom w:type="dxa" w:w="60"/>
+              <w:right w:type="dxa" w:w="100"/>
+            </w:tcMar>
+          </w:tcPr>
+          <w:p>
+            <w:pPr>
+              <w:spacing w:after="0"/>
+            </w:pPr>
+            <w:r>
+              <w:rPr>
+                <w:rFonts w:ascii="맑은 고딕" w:cs="맑은 고딕" w:eastAsia="맑은 고딕" w:hAnsi="맑은 고딕"/>
+                <w:b w:val="false"/>
+                <w:bCs w:val="false"/>
+                <w:sz w:val="18"/>
+                <w:szCs w:val="18"/>
+              </w:rPr>
+              <w:t xml:space="preserve">총인구 기준 5.0명, 주민등록 인구 기준 약 5.3명. 전국 2024년 4.7명과 비슷한 수준</w:t>
+            </w:r>
+          </w:p>
+        </w:tc>
+      </w:tr>
+      <w:tr>
+        <w:trPr>
+          <w:tblHeader w:val="false"/>
+        </w:trPr>
+        <w:tc>
+          <w:tcPr>
+            <w:tcW w:type="dxa" w:w="1928"/>
+            <w:tcMar>
+              <w:top w:type="dxa" w:w="60"/>
+              <w:left w:type="dxa" w:w="100"/>
+              <w:bottom w:type="dxa" w:w="60"/>
+              <w:right w:type="dxa" w:w="100"/>
+            </w:tcMar>
+          </w:tcPr>
+          <w:p>
+            <w:pPr>
+              <w:spacing w:after="0"/>
+            </w:pPr>
+            <w:r>
+              <w:rPr>
+                <w:rFonts w:ascii="맑은 고딕" w:cs="맑은 고딕" w:eastAsia="맑은 고딕" w:hAnsi="맑은 고딕"/>
+                <w:b w:val="false"/>
+                <w:bCs w:val="false"/>
+                <w:sz w:val="18"/>
+                <w:szCs w:val="18"/>
+              </w:rPr>
               <w:t xml:space="preserve">김포시 출생 등록 (2026년 1~8월)</w:t>
             </w:r>
           </w:p>
@@ -1910,7 +1993,25 @@
           <w:sz w:val="20"/>
           <w:szCs w:val="20"/>
         </w:rPr>
-        <w:t xml:space="preserve">전국과 경기도는 2024년부터 출생아 수가 반등해 2026년까지 증가세입니다. 김포시는 2025년 출생 등록 2,574명으로, 인구 51만 도시로는 화성·수원·용인·고양보다 출생 규모가 작고, 2025년에는 사망이 출생을 넘는 자연감소를 기록했습니다.</w:t>
+        <w:t xml:space="preserve">전국과 경기도는 2024년부터 출생아 수가 반등해 2026년까지 증가세입니다. 김포시는 2025년 출생 등록 2,574명으로, 주민등록 인구 48만 도시로는 화성·수원·용인·고양보다 출생 규모가 작고, 2025년에는 사망이 출생을 넘는 자연감소를 기록했습니다.</w:t>
+      </w:r>
+    </w:p>
+    <w:p>
+      <w:pPr>
+        <w:pStyle w:val="ListParagraph"/>
+        <w:numPr>
+          <w:ilvl w:val="0"/>
+          <w:numId w:val="3"/>
+        </w:numPr>
+        <w:spacing w:after="60"/>
+      </w:pPr>
+      <w:r>
+        <w:rPr>
+          <w:rFonts w:ascii="맑은 고딕" w:cs="맑은 고딕" w:eastAsia="맑은 고딕" w:hAnsi="맑은 고딕"/>
+          <w:sz w:val="20"/>
+          <w:szCs w:val="20"/>
+        </w:rPr>
+        <w:t xml:space="preserve">김포시 인구는 기준에 따라 다릅니다. 통계청·행정안전부의 주민등록 인구(내국인)는 48만 명대이고, 김포시청 주요통계의 총인구(51만 7천 명)는 등록외국인과 국내거소자를 더한 숫자입니다. 회의에서는 '주민등록 인구 48만, 외국인 포함 51만'으로 말씀하시면 됩니다.</w:t>
       </w:r>
     </w:p>
     <w:p>

</xml_diff>

<commit_message>
Add one-page statistics summary appendix for on-screen display
Co-Authored-By: Claude Fable 5.1 <noreply@anthropic.com>
Claude-Session: https://claude.ai/code/session_01YQpD7bdbUWBdDGpeeL147H
</commit_message>
<xml_diff>
--- a/meetings/2026-09-19-관리사-정기회의-자료.docx
+++ b/meetings/2026-09-19-관리사-정기회의-자료.docx
@@ -544,6 +544,24 @@
           <w:szCs w:val="20"/>
         </w:rPr>
         <w:t xml:space="preserve">기타 안내 및 폐회</w:t>
+      </w:r>
+    </w:p>
+    <w:p>
+      <w:pPr>
+        <w:pStyle w:val="ListParagraph"/>
+        <w:numPr>
+          <w:ilvl w:val="0"/>
+          <w:numId w:val="2"/>
+        </w:numPr>
+        <w:spacing w:after="60"/>
+      </w:pPr>
+      <w:r>
+        <w:rPr>
+          <w:rFonts w:ascii="맑은 고딕" w:cs="맑은 고딕" w:eastAsia="맑은 고딕" w:hAnsi="맑은 고딕"/>
+          <w:sz w:val="20"/>
+          <w:szCs w:val="20"/>
+        </w:rPr>
+        <w:t xml:space="preserve">부록 A. 회의용 통계 요약표 / 부록 B. 참고 자료</w:t>
       </w:r>
     </w:p>
     <w:p>
@@ -8173,7 +8191,2336 @@
           <w:sz w:val="28"/>
           <w:szCs w:val="28"/>
         </w:rPr>
-        <w:t xml:space="preserve">부록. 참고 자료(출처)</w:t>
+        <w:t xml:space="preserve">부록 A. 회의용 통계 요약표 (화면 표시용)</w:t>
+      </w:r>
+    </w:p>
+    <w:p>
+      <w:pPr>
+        <w:pStyle w:val="Heading2"/>
+        <w:spacing w:after="100" w:before="200"/>
+      </w:pPr>
+      <w:r>
+        <w:rPr>
+          <w:rFonts w:ascii="맑은 고딕" w:cs="맑은 고딕" w:eastAsia="맑은 고딕" w:hAnsi="맑은 고딕"/>
+          <w:b/>
+          <w:bCs/>
+          <w:color w:val="2E5C8A"/>
+          <w:sz w:val="23"/>
+          <w:szCs w:val="23"/>
+        </w:rPr>
+        <w:t xml:space="preserve">A-1. 출생·인구 현황</w:t>
+      </w:r>
+    </w:p>
+    <w:tbl>
+      <w:tblPr>
+        <w:tblW w:type="dxa" w:w="9638"/>
+        <w:tblBorders>
+          <w:top w:val="single" w:color="auto" w:sz="4"/>
+          <w:left w:val="single" w:color="auto" w:sz="4"/>
+          <w:bottom w:val="single" w:color="auto" w:sz="4"/>
+          <w:right w:val="single" w:color="auto" w:sz="4"/>
+          <w:insideH w:val="single" w:color="auto" w:sz="4"/>
+          <w:insideV w:val="single" w:color="auto" w:sz="4"/>
+        </w:tblBorders>
+        <w:tblLayout w:type="fixed"/>
+      </w:tblPr>
+      <w:tblGrid>
+        <w:gridCol w:w="1928"/>
+        <w:gridCol w:w="3855"/>
+        <w:gridCol w:w="3855"/>
+      </w:tblGrid>
+      <w:tr>
+        <w:trPr>
+          <w:tblHeader/>
+        </w:trPr>
+        <w:tc>
+          <w:tcPr>
+            <w:tcW w:type="dxa" w:w="1928"/>
+            <w:shd w:fill="D9E2F3" w:color="auto" w:val="clear"/>
+            <w:tcMar>
+              <w:top w:type="dxa" w:w="60"/>
+              <w:left w:type="dxa" w:w="100"/>
+              <w:bottom w:type="dxa" w:w="60"/>
+              <w:right w:type="dxa" w:w="100"/>
+            </w:tcMar>
+          </w:tcPr>
+          <w:p>
+            <w:pPr>
+              <w:spacing w:after="0"/>
+            </w:pPr>
+            <w:r>
+              <w:rPr>
+                <w:rFonts w:ascii="맑은 고딕" w:cs="맑은 고딕" w:eastAsia="맑은 고딕" w:hAnsi="맑은 고딕"/>
+                <w:b/>
+                <w:bCs/>
+                <w:sz w:val="18"/>
+                <w:szCs w:val="18"/>
+              </w:rPr>
+              <w:t xml:space="preserve">구분</w:t>
+            </w:r>
+          </w:p>
+        </w:tc>
+        <w:tc>
+          <w:tcPr>
+            <w:tcW w:type="dxa" w:w="3855"/>
+            <w:shd w:fill="D9E2F3" w:color="auto" w:val="clear"/>
+            <w:tcMar>
+              <w:top w:type="dxa" w:w="60"/>
+              <w:left w:type="dxa" w:w="100"/>
+              <w:bottom w:type="dxa" w:w="60"/>
+              <w:right w:type="dxa" w:w="100"/>
+            </w:tcMar>
+          </w:tcPr>
+          <w:p>
+            <w:pPr>
+              <w:spacing w:after="0"/>
+            </w:pPr>
+            <w:r>
+              <w:rPr>
+                <w:rFonts w:ascii="맑은 고딕" w:cs="맑은 고딕" w:eastAsia="맑은 고딕" w:hAnsi="맑은 고딕"/>
+                <w:b/>
+                <w:bCs/>
+                <w:sz w:val="18"/>
+                <w:szCs w:val="18"/>
+              </w:rPr>
+              <w:t xml:space="preserve">수치</w:t>
+            </w:r>
+          </w:p>
+        </w:tc>
+        <w:tc>
+          <w:tcPr>
+            <w:tcW w:type="dxa" w:w="3855"/>
+            <w:shd w:fill="D9E2F3" w:color="auto" w:val="clear"/>
+            <w:tcMar>
+              <w:top w:type="dxa" w:w="60"/>
+              <w:left w:type="dxa" w:w="100"/>
+              <w:bottom w:type="dxa" w:w="60"/>
+              <w:right w:type="dxa" w:w="100"/>
+            </w:tcMar>
+          </w:tcPr>
+          <w:p>
+            <w:pPr>
+              <w:spacing w:after="0"/>
+            </w:pPr>
+            <w:r>
+              <w:rPr>
+                <w:rFonts w:ascii="맑은 고딕" w:cs="맑은 고딕" w:eastAsia="맑은 고딕" w:hAnsi="맑은 고딕"/>
+                <w:b/>
+                <w:bCs/>
+                <w:sz w:val="18"/>
+                <w:szCs w:val="18"/>
+              </w:rPr>
+              <w:t xml:space="preserve">비고</w:t>
+            </w:r>
+          </w:p>
+        </w:tc>
+      </w:tr>
+      <w:tr>
+        <w:trPr>
+          <w:tblHeader w:val="false"/>
+        </w:trPr>
+        <w:tc>
+          <w:tcPr>
+            <w:tcW w:type="dxa" w:w="1928"/>
+            <w:tcMar>
+              <w:top w:type="dxa" w:w="60"/>
+              <w:left w:type="dxa" w:w="100"/>
+              <w:bottom w:type="dxa" w:w="60"/>
+              <w:right w:type="dxa" w:w="100"/>
+            </w:tcMar>
+          </w:tcPr>
+          <w:p>
+            <w:pPr>
+              <w:spacing w:after="0"/>
+            </w:pPr>
+            <w:r>
+              <w:rPr>
+                <w:rFonts w:ascii="맑은 고딕" w:cs="맑은 고딕" w:eastAsia="맑은 고딕" w:hAnsi="맑은 고딕"/>
+                <w:b w:val="false"/>
+                <w:bCs w:val="false"/>
+                <w:sz w:val="18"/>
+                <w:szCs w:val="18"/>
+              </w:rPr>
+              <w:t xml:space="preserve">전국 출생아 수 (2025년)</w:t>
+            </w:r>
+          </w:p>
+        </w:tc>
+        <w:tc>
+          <w:tcPr>
+            <w:tcW w:type="dxa" w:w="3855"/>
+            <w:tcMar>
+              <w:top w:type="dxa" w:w="60"/>
+              <w:left w:type="dxa" w:w="100"/>
+              <w:bottom w:type="dxa" w:w="60"/>
+              <w:right w:type="dxa" w:w="100"/>
+            </w:tcMar>
+          </w:tcPr>
+          <w:p>
+            <w:pPr>
+              <w:spacing w:after="0"/>
+            </w:pPr>
+            <w:r>
+              <w:rPr>
+                <w:rFonts w:ascii="맑은 고딕" w:cs="맑은 고딕" w:eastAsia="맑은 고딕" w:hAnsi="맑은 고딕"/>
+                <w:b w:val="false"/>
+                <w:bCs w:val="false"/>
+                <w:sz w:val="18"/>
+                <w:szCs w:val="18"/>
+              </w:rPr>
+              <w:t xml:space="preserve">254,500명</w:t>
+            </w:r>
+          </w:p>
+        </w:tc>
+        <w:tc>
+          <w:tcPr>
+            <w:tcW w:type="dxa" w:w="3855"/>
+            <w:tcMar>
+              <w:top w:type="dxa" w:w="60"/>
+              <w:left w:type="dxa" w:w="100"/>
+              <w:bottom w:type="dxa" w:w="60"/>
+              <w:right w:type="dxa" w:w="100"/>
+            </w:tcMar>
+          </w:tcPr>
+          <w:p>
+            <w:pPr>
+              <w:spacing w:after="0"/>
+            </w:pPr>
+            <w:r>
+              <w:rPr>
+                <w:rFonts w:ascii="맑은 고딕" w:cs="맑은 고딕" w:eastAsia="맑은 고딕" w:hAnsi="맑은 고딕"/>
+                <w:b w:val="false"/>
+                <w:bCs w:val="false"/>
+                <w:sz w:val="18"/>
+                <w:szCs w:val="18"/>
+              </w:rPr>
+              <w:t xml:space="preserve">전년 대비 +6.8%, 2010년 이후 최다</w:t>
+            </w:r>
+          </w:p>
+        </w:tc>
+      </w:tr>
+      <w:tr>
+        <w:trPr>
+          <w:tblHeader w:val="false"/>
+        </w:trPr>
+        <w:tc>
+          <w:tcPr>
+            <w:tcW w:type="dxa" w:w="1928"/>
+            <w:tcMar>
+              <w:top w:type="dxa" w:w="60"/>
+              <w:left w:type="dxa" w:w="100"/>
+              <w:bottom w:type="dxa" w:w="60"/>
+              <w:right w:type="dxa" w:w="100"/>
+            </w:tcMar>
+          </w:tcPr>
+          <w:p>
+            <w:pPr>
+              <w:spacing w:after="0"/>
+            </w:pPr>
+            <w:r>
+              <w:rPr>
+                <w:rFonts w:ascii="맑은 고딕" w:cs="맑은 고딕" w:eastAsia="맑은 고딕" w:hAnsi="맑은 고딕"/>
+                <w:b w:val="false"/>
+                <w:bCs w:val="false"/>
+                <w:sz w:val="18"/>
+                <w:szCs w:val="18"/>
+              </w:rPr>
+              <w:t xml:space="preserve">전국 합계출산율 (2025년)</w:t>
+            </w:r>
+          </w:p>
+        </w:tc>
+        <w:tc>
+          <w:tcPr>
+            <w:tcW w:type="dxa" w:w="3855"/>
+            <w:tcMar>
+              <w:top w:type="dxa" w:w="60"/>
+              <w:left w:type="dxa" w:w="100"/>
+              <w:bottom w:type="dxa" w:w="60"/>
+              <w:right w:type="dxa" w:w="100"/>
+            </w:tcMar>
+          </w:tcPr>
+          <w:p>
+            <w:pPr>
+              <w:spacing w:after="0"/>
+            </w:pPr>
+            <w:r>
+              <w:rPr>
+                <w:rFonts w:ascii="맑은 고딕" w:cs="맑은 고딕" w:eastAsia="맑은 고딕" w:hAnsi="맑은 고딕"/>
+                <w:b w:val="false"/>
+                <w:bCs w:val="false"/>
+                <w:sz w:val="18"/>
+                <w:szCs w:val="18"/>
+              </w:rPr>
+              <w:t xml:space="preserve">0.80명</w:t>
+            </w:r>
+          </w:p>
+        </w:tc>
+        <w:tc>
+          <w:tcPr>
+            <w:tcW w:type="dxa" w:w="3855"/>
+            <w:tcMar>
+              <w:top w:type="dxa" w:w="60"/>
+              <w:left w:type="dxa" w:w="100"/>
+              <w:bottom w:type="dxa" w:w="60"/>
+              <w:right w:type="dxa" w:w="100"/>
+            </w:tcMar>
+          </w:tcPr>
+          <w:p>
+            <w:pPr>
+              <w:spacing w:after="0"/>
+            </w:pPr>
+            <w:r>
+              <w:rPr>
+                <w:rFonts w:ascii="맑은 고딕" w:cs="맑은 고딕" w:eastAsia="맑은 고딕" w:hAnsi="맑은 고딕"/>
+                <w:b w:val="false"/>
+                <w:bCs w:val="false"/>
+                <w:sz w:val="18"/>
+                <w:szCs w:val="18"/>
+              </w:rPr>
+              <w:t xml:space="preserve">2024년 0.75명 → 상승</w:t>
+            </w:r>
+          </w:p>
+        </w:tc>
+      </w:tr>
+      <w:tr>
+        <w:trPr>
+          <w:tblHeader w:val="false"/>
+        </w:trPr>
+        <w:tc>
+          <w:tcPr>
+            <w:tcW w:type="dxa" w:w="1928"/>
+            <w:tcMar>
+              <w:top w:type="dxa" w:w="60"/>
+              <w:left w:type="dxa" w:w="100"/>
+              <w:bottom w:type="dxa" w:w="60"/>
+              <w:right w:type="dxa" w:w="100"/>
+            </w:tcMar>
+          </w:tcPr>
+          <w:p>
+            <w:pPr>
+              <w:spacing w:after="0"/>
+            </w:pPr>
+            <w:r>
+              <w:rPr>
+                <w:rFonts w:ascii="맑은 고딕" w:cs="맑은 고딕" w:eastAsia="맑은 고딕" w:hAnsi="맑은 고딕"/>
+                <w:b w:val="false"/>
+                <w:bCs w:val="false"/>
+                <w:sz w:val="18"/>
+                <w:szCs w:val="18"/>
+              </w:rPr>
+              <w:t xml:space="preserve">전국 출생아 수 (2026년 7월)</w:t>
+            </w:r>
+          </w:p>
+        </w:tc>
+        <w:tc>
+          <w:tcPr>
+            <w:tcW w:type="dxa" w:w="3855"/>
+            <w:tcMar>
+              <w:top w:type="dxa" w:w="60"/>
+              <w:left w:type="dxa" w:w="100"/>
+              <w:bottom w:type="dxa" w:w="60"/>
+              <w:right w:type="dxa" w:w="100"/>
+            </w:tcMar>
+          </w:tcPr>
+          <w:p>
+            <w:pPr>
+              <w:spacing w:after="0"/>
+            </w:pPr>
+            <w:r>
+              <w:rPr>
+                <w:rFonts w:ascii="맑은 고딕" w:cs="맑은 고딕" w:eastAsia="맑은 고딕" w:hAnsi="맑은 고딕"/>
+                <w:b w:val="false"/>
+                <w:bCs w:val="false"/>
+                <w:sz w:val="18"/>
+                <w:szCs w:val="18"/>
+              </w:rPr>
+              <w:t xml:space="preserve">21,803명</w:t>
+            </w:r>
+          </w:p>
+        </w:tc>
+        <w:tc>
+          <w:tcPr>
+            <w:tcW w:type="dxa" w:w="3855"/>
+            <w:tcMar>
+              <w:top w:type="dxa" w:w="60"/>
+              <w:left w:type="dxa" w:w="100"/>
+              <w:bottom w:type="dxa" w:w="60"/>
+              <w:right w:type="dxa" w:w="100"/>
+            </w:tcMar>
+          </w:tcPr>
+          <w:p>
+            <w:pPr>
+              <w:spacing w:after="0"/>
+            </w:pPr>
+            <w:r>
+              <w:rPr>
+                <w:rFonts w:ascii="맑은 고딕" w:cs="맑은 고딕" w:eastAsia="맑은 고딕" w:hAnsi="맑은 고딕"/>
+                <w:b w:val="false"/>
+                <w:bCs w:val="false"/>
+                <w:sz w:val="18"/>
+                <w:szCs w:val="18"/>
+              </w:rPr>
+              <w:t xml:space="preserve">전년 동월 대비 +5.9%, 13개월 연속 증가</w:t>
+            </w:r>
+          </w:p>
+        </w:tc>
+      </w:tr>
+      <w:tr>
+        <w:trPr>
+          <w:tblHeader w:val="false"/>
+        </w:trPr>
+        <w:tc>
+          <w:tcPr>
+            <w:tcW w:type="dxa" w:w="1928"/>
+            <w:tcMar>
+              <w:top w:type="dxa" w:w="60"/>
+              <w:left w:type="dxa" w:w="100"/>
+              <w:bottom w:type="dxa" w:w="60"/>
+              <w:right w:type="dxa" w:w="100"/>
+            </w:tcMar>
+          </w:tcPr>
+          <w:p>
+            <w:pPr>
+              <w:spacing w:after="0"/>
+            </w:pPr>
+            <w:r>
+              <w:rPr>
+                <w:rFonts w:ascii="맑은 고딕" w:cs="맑은 고딕" w:eastAsia="맑은 고딕" w:hAnsi="맑은 고딕"/>
+                <w:b w:val="false"/>
+                <w:bCs w:val="false"/>
+                <w:sz w:val="18"/>
+                <w:szCs w:val="18"/>
+              </w:rPr>
+              <w:t xml:space="preserve">경기도 출생아 수 (2025년)</w:t>
+            </w:r>
+          </w:p>
+        </w:tc>
+        <w:tc>
+          <w:tcPr>
+            <w:tcW w:type="dxa" w:w="3855"/>
+            <w:tcMar>
+              <w:top w:type="dxa" w:w="60"/>
+              <w:left w:type="dxa" w:w="100"/>
+              <w:bottom w:type="dxa" w:w="60"/>
+              <w:right w:type="dxa" w:w="100"/>
+            </w:tcMar>
+          </w:tcPr>
+          <w:p>
+            <w:pPr>
+              <w:spacing w:after="0"/>
+            </w:pPr>
+            <w:r>
+              <w:rPr>
+                <w:rFonts w:ascii="맑은 고딕" w:cs="맑은 고딕" w:eastAsia="맑은 고딕" w:hAnsi="맑은 고딕"/>
+                <w:b w:val="false"/>
+                <w:bCs w:val="false"/>
+                <w:sz w:val="18"/>
+                <w:szCs w:val="18"/>
+              </w:rPr>
+              <w:t xml:space="preserve">77,702명</w:t>
+            </w:r>
+          </w:p>
+        </w:tc>
+        <w:tc>
+          <w:tcPr>
+            <w:tcW w:type="dxa" w:w="3855"/>
+            <w:tcMar>
+              <w:top w:type="dxa" w:w="60"/>
+              <w:left w:type="dxa" w:w="100"/>
+              <w:bottom w:type="dxa" w:w="60"/>
+              <w:right w:type="dxa" w:w="100"/>
+            </w:tcMar>
+          </w:tcPr>
+          <w:p>
+            <w:pPr>
+              <w:spacing w:after="0"/>
+            </w:pPr>
+            <w:r>
+              <w:rPr>
+                <w:rFonts w:ascii="맑은 고딕" w:cs="맑은 고딕" w:eastAsia="맑은 고딕" w:hAnsi="맑은 고딕"/>
+                <w:b w:val="false"/>
+                <w:bCs w:val="false"/>
+                <w:sz w:val="18"/>
+                <w:szCs w:val="18"/>
+              </w:rPr>
+              <w:t xml:space="preserve">전국 최다</w:t>
+            </w:r>
+          </w:p>
+        </w:tc>
+      </w:tr>
+      <w:tr>
+        <w:trPr>
+          <w:tblHeader w:val="false"/>
+        </w:trPr>
+        <w:tc>
+          <w:tcPr>
+            <w:tcW w:type="dxa" w:w="1928"/>
+            <w:tcMar>
+              <w:top w:type="dxa" w:w="60"/>
+              <w:left w:type="dxa" w:w="100"/>
+              <w:bottom w:type="dxa" w:w="60"/>
+              <w:right w:type="dxa" w:w="100"/>
+            </w:tcMar>
+          </w:tcPr>
+          <w:p>
+            <w:pPr>
+              <w:spacing w:after="0"/>
+            </w:pPr>
+            <w:r>
+              <w:rPr>
+                <w:rFonts w:ascii="맑은 고딕" w:cs="맑은 고딕" w:eastAsia="맑은 고딕" w:hAnsi="맑은 고딕"/>
+                <w:b w:val="false"/>
+                <w:bCs w:val="false"/>
+                <w:sz w:val="18"/>
+                <w:szCs w:val="18"/>
+              </w:rPr>
+              <w:t xml:space="preserve">경기도 시별 출생아 (2025년)</w:t>
+            </w:r>
+          </w:p>
+        </w:tc>
+        <w:tc>
+          <w:tcPr>
+            <w:tcW w:type="dxa" w:w="3855"/>
+            <w:tcMar>
+              <w:top w:type="dxa" w:w="60"/>
+              <w:left w:type="dxa" w:w="100"/>
+              <w:bottom w:type="dxa" w:w="60"/>
+              <w:right w:type="dxa" w:w="100"/>
+            </w:tcMar>
+          </w:tcPr>
+          <w:p>
+            <w:pPr>
+              <w:spacing w:after="0"/>
+            </w:pPr>
+            <w:r>
+              <w:rPr>
+                <w:rFonts w:ascii="맑은 고딕" w:cs="맑은 고딕" w:eastAsia="맑은 고딕" w:hAnsi="맑은 고딕"/>
+                <w:b w:val="false"/>
+                <w:bCs w:val="false"/>
+                <w:sz w:val="18"/>
+                <w:szCs w:val="18"/>
+              </w:rPr>
+              <w:t xml:space="preserve">화성 8,116 · 수원 7,060 · 용인 5,906 · 고양 5,522명</w:t>
+            </w:r>
+          </w:p>
+        </w:tc>
+        <w:tc>
+          <w:tcPr>
+            <w:tcW w:type="dxa" w:w="3855"/>
+            <w:tcMar>
+              <w:top w:type="dxa" w:w="60"/>
+              <w:left w:type="dxa" w:w="100"/>
+              <w:bottom w:type="dxa" w:w="60"/>
+              <w:right w:type="dxa" w:w="100"/>
+            </w:tcMar>
+          </w:tcPr>
+          <w:p>
+            <w:pPr>
+              <w:spacing w:after="0"/>
+            </w:pPr>
+          </w:p>
+        </w:tc>
+      </w:tr>
+      <w:tr>
+        <w:trPr>
+          <w:tblHeader w:val="false"/>
+        </w:trPr>
+        <w:tc>
+          <w:tcPr>
+            <w:tcW w:type="dxa" w:w="1928"/>
+            <w:tcMar>
+              <w:top w:type="dxa" w:w="60"/>
+              <w:left w:type="dxa" w:w="100"/>
+              <w:bottom w:type="dxa" w:w="60"/>
+              <w:right w:type="dxa" w:w="100"/>
+            </w:tcMar>
+          </w:tcPr>
+          <w:p>
+            <w:pPr>
+              <w:spacing w:after="0"/>
+            </w:pPr>
+            <w:r>
+              <w:rPr>
+                <w:rFonts w:ascii="맑은 고딕" w:cs="맑은 고딕" w:eastAsia="맑은 고딕" w:hAnsi="맑은 고딕"/>
+                <w:b w:val="false"/>
+                <w:bCs w:val="false"/>
+                <w:sz w:val="18"/>
+                <w:szCs w:val="18"/>
+              </w:rPr>
+              <w:t xml:space="preserve">김포시 출생 등록 (2025년)</w:t>
+            </w:r>
+          </w:p>
+        </w:tc>
+        <w:tc>
+          <w:tcPr>
+            <w:tcW w:type="dxa" w:w="3855"/>
+            <w:tcMar>
+              <w:top w:type="dxa" w:w="60"/>
+              <w:left w:type="dxa" w:w="100"/>
+              <w:bottom w:type="dxa" w:w="60"/>
+              <w:right w:type="dxa" w:w="100"/>
+            </w:tcMar>
+          </w:tcPr>
+          <w:p>
+            <w:pPr>
+              <w:spacing w:after="0"/>
+            </w:pPr>
+            <w:r>
+              <w:rPr>
+                <w:rFonts w:ascii="맑은 고딕" w:cs="맑은 고딕" w:eastAsia="맑은 고딕" w:hAnsi="맑은 고딕"/>
+                <w:b w:val="false"/>
+                <w:bCs w:val="false"/>
+                <w:sz w:val="18"/>
+                <w:szCs w:val="18"/>
+              </w:rPr>
+              <w:t xml:space="preserve">2,574명</w:t>
+            </w:r>
+          </w:p>
+        </w:tc>
+        <w:tc>
+          <w:tcPr>
+            <w:tcW w:type="dxa" w:w="3855"/>
+            <w:tcMar>
+              <w:top w:type="dxa" w:w="60"/>
+              <w:left w:type="dxa" w:w="100"/>
+              <w:bottom w:type="dxa" w:w="60"/>
+              <w:right w:type="dxa" w:w="100"/>
+            </w:tcMar>
+          </w:tcPr>
+          <w:p>
+            <w:pPr>
+              <w:spacing w:after="0"/>
+            </w:pPr>
+            <w:r>
+              <w:rPr>
+                <w:rFonts w:ascii="맑은 고딕" w:cs="맑은 고딕" w:eastAsia="맑은 고딕" w:hAnsi="맑은 고딕"/>
+                <w:b w:val="false"/>
+                <w:bCs w:val="false"/>
+                <w:sz w:val="18"/>
+                <w:szCs w:val="18"/>
+              </w:rPr>
+              <w:t xml:space="preserve">주민등록 기준</w:t>
+            </w:r>
+          </w:p>
+        </w:tc>
+      </w:tr>
+      <w:tr>
+        <w:trPr>
+          <w:tblHeader w:val="false"/>
+        </w:trPr>
+        <w:tc>
+          <w:tcPr>
+            <w:tcW w:type="dxa" w:w="1928"/>
+            <w:tcMar>
+              <w:top w:type="dxa" w:w="60"/>
+              <w:left w:type="dxa" w:w="100"/>
+              <w:bottom w:type="dxa" w:w="60"/>
+              <w:right w:type="dxa" w:w="100"/>
+            </w:tcMar>
+          </w:tcPr>
+          <w:p>
+            <w:pPr>
+              <w:spacing w:after="0"/>
+            </w:pPr>
+            <w:r>
+              <w:rPr>
+                <w:rFonts w:ascii="맑은 고딕" w:cs="맑은 고딕" w:eastAsia="맑은 고딕" w:hAnsi="맑은 고딕"/>
+                <w:b w:val="false"/>
+                <w:bCs w:val="false"/>
+                <w:sz w:val="18"/>
+                <w:szCs w:val="18"/>
+              </w:rPr>
+              <w:t xml:space="preserve">김포시 사망 (2025년)</w:t>
+            </w:r>
+          </w:p>
+        </w:tc>
+        <w:tc>
+          <w:tcPr>
+            <w:tcW w:type="dxa" w:w="3855"/>
+            <w:tcMar>
+              <w:top w:type="dxa" w:w="60"/>
+              <w:left w:type="dxa" w:w="100"/>
+              <w:bottom w:type="dxa" w:w="60"/>
+              <w:right w:type="dxa" w:w="100"/>
+            </w:tcMar>
+          </w:tcPr>
+          <w:p>
+            <w:pPr>
+              <w:spacing w:after="0"/>
+            </w:pPr>
+            <w:r>
+              <w:rPr>
+                <w:rFonts w:ascii="맑은 고딕" w:cs="맑은 고딕" w:eastAsia="맑은 고딕" w:hAnsi="맑은 고딕"/>
+                <w:b w:val="false"/>
+                <w:bCs w:val="false"/>
+                <w:sz w:val="18"/>
+                <w:szCs w:val="18"/>
+              </w:rPr>
+              <w:t xml:space="preserve">2,715명</w:t>
+            </w:r>
+          </w:p>
+        </w:tc>
+        <w:tc>
+          <w:tcPr>
+            <w:tcW w:type="dxa" w:w="3855"/>
+            <w:tcMar>
+              <w:top w:type="dxa" w:w="60"/>
+              <w:left w:type="dxa" w:w="100"/>
+              <w:bottom w:type="dxa" w:w="60"/>
+              <w:right w:type="dxa" w:w="100"/>
+            </w:tcMar>
+          </w:tcPr>
+          <w:p>
+            <w:pPr>
+              <w:spacing w:after="0"/>
+            </w:pPr>
+            <w:r>
+              <w:rPr>
+                <w:rFonts w:ascii="맑은 고딕" w:cs="맑은 고딕" w:eastAsia="맑은 고딕" w:hAnsi="맑은 고딕"/>
+                <w:b w:val="false"/>
+                <w:bCs w:val="false"/>
+                <w:sz w:val="18"/>
+                <w:szCs w:val="18"/>
+              </w:rPr>
+              <w:t xml:space="preserve">출생보다 141명 많음(자연감소)</w:t>
+            </w:r>
+          </w:p>
+        </w:tc>
+      </w:tr>
+      <w:tr>
+        <w:trPr>
+          <w:tblHeader w:val="false"/>
+        </w:trPr>
+        <w:tc>
+          <w:tcPr>
+            <w:tcW w:type="dxa" w:w="1928"/>
+            <w:tcMar>
+              <w:top w:type="dxa" w:w="60"/>
+              <w:left w:type="dxa" w:w="100"/>
+              <w:bottom w:type="dxa" w:w="60"/>
+              <w:right w:type="dxa" w:w="100"/>
+            </w:tcMar>
+          </w:tcPr>
+          <w:p>
+            <w:pPr>
+              <w:spacing w:after="0"/>
+            </w:pPr>
+            <w:r>
+              <w:rPr>
+                <w:rFonts w:ascii="맑은 고딕" w:cs="맑은 고딕" w:eastAsia="맑은 고딕" w:hAnsi="맑은 고딕"/>
+                <w:b w:val="false"/>
+                <w:bCs w:val="false"/>
+                <w:sz w:val="18"/>
+                <w:szCs w:val="18"/>
+              </w:rPr>
+              <w:t xml:space="preserve">김포시 주민등록 인구</w:t>
+            </w:r>
+          </w:p>
+        </w:tc>
+        <w:tc>
+          <w:tcPr>
+            <w:tcW w:type="dxa" w:w="3855"/>
+            <w:tcMar>
+              <w:top w:type="dxa" w:w="60"/>
+              <w:left w:type="dxa" w:w="100"/>
+              <w:bottom w:type="dxa" w:w="60"/>
+              <w:right w:type="dxa" w:w="100"/>
+            </w:tcMar>
+          </w:tcPr>
+          <w:p>
+            <w:pPr>
+              <w:spacing w:after="0"/>
+            </w:pPr>
+            <w:r>
+              <w:rPr>
+                <w:rFonts w:ascii="맑은 고딕" w:cs="맑은 고딕" w:eastAsia="맑은 고딕" w:hAnsi="맑은 고딕"/>
+                <w:b w:val="false"/>
+                <w:bCs w:val="false"/>
+                <w:sz w:val="18"/>
+                <w:szCs w:val="18"/>
+              </w:rPr>
+              <w:t xml:space="preserve">약 48만 명대</w:t>
+            </w:r>
+          </w:p>
+        </w:tc>
+        <w:tc>
+          <w:tcPr>
+            <w:tcW w:type="dxa" w:w="3855"/>
+            <w:tcMar>
+              <w:top w:type="dxa" w:w="60"/>
+              <w:left w:type="dxa" w:w="100"/>
+              <w:bottom w:type="dxa" w:w="60"/>
+              <w:right w:type="dxa" w:w="100"/>
+            </w:tcMar>
+          </w:tcPr>
+          <w:p>
+            <w:pPr>
+              <w:spacing w:after="0"/>
+            </w:pPr>
+            <w:r>
+              <w:rPr>
+                <w:rFonts w:ascii="맑은 고딕" w:cs="맑은 고딕" w:eastAsia="맑은 고딕" w:hAnsi="맑은 고딕"/>
+                <w:b w:val="false"/>
+                <w:bCs w:val="false"/>
+                <w:sz w:val="18"/>
+                <w:szCs w:val="18"/>
+              </w:rPr>
+              <w:t xml:space="preserve">내국인 기준</w:t>
+            </w:r>
+          </w:p>
+        </w:tc>
+      </w:tr>
+      <w:tr>
+        <w:trPr>
+          <w:tblHeader w:val="false"/>
+        </w:trPr>
+        <w:tc>
+          <w:tcPr>
+            <w:tcW w:type="dxa" w:w="1928"/>
+            <w:tcMar>
+              <w:top w:type="dxa" w:w="60"/>
+              <w:left w:type="dxa" w:w="100"/>
+              <w:bottom w:type="dxa" w:w="60"/>
+              <w:right w:type="dxa" w:w="100"/>
+            </w:tcMar>
+          </w:tcPr>
+          <w:p>
+            <w:pPr>
+              <w:spacing w:after="0"/>
+            </w:pPr>
+            <w:r>
+              <w:rPr>
+                <w:rFonts w:ascii="맑은 고딕" w:cs="맑은 고딕" w:eastAsia="맑은 고딕" w:hAnsi="맑은 고딕"/>
+                <w:b w:val="false"/>
+                <w:bCs w:val="false"/>
+                <w:sz w:val="18"/>
+                <w:szCs w:val="18"/>
+              </w:rPr>
+              <w:t xml:space="preserve">김포시 총인구 (2025년 말)</w:t>
+            </w:r>
+          </w:p>
+        </w:tc>
+        <w:tc>
+          <w:tcPr>
+            <w:tcW w:type="dxa" w:w="3855"/>
+            <w:tcMar>
+              <w:top w:type="dxa" w:w="60"/>
+              <w:left w:type="dxa" w:w="100"/>
+              <w:bottom w:type="dxa" w:w="60"/>
+              <w:right w:type="dxa" w:w="100"/>
+            </w:tcMar>
+          </w:tcPr>
+          <w:p>
+            <w:pPr>
+              <w:spacing w:after="0"/>
+            </w:pPr>
+            <w:r>
+              <w:rPr>
+                <w:rFonts w:ascii="맑은 고딕" w:cs="맑은 고딕" w:eastAsia="맑은 고딕" w:hAnsi="맑은 고딕"/>
+                <w:b w:val="false"/>
+                <w:bCs w:val="false"/>
+                <w:sz w:val="18"/>
+                <w:szCs w:val="18"/>
+              </w:rPr>
+              <w:t xml:space="preserve">517,351명</w:t>
+            </w:r>
+          </w:p>
+        </w:tc>
+        <w:tc>
+          <w:tcPr>
+            <w:tcW w:type="dxa" w:w="3855"/>
+            <w:tcMar>
+              <w:top w:type="dxa" w:w="60"/>
+              <w:left w:type="dxa" w:w="100"/>
+              <w:bottom w:type="dxa" w:w="60"/>
+              <w:right w:type="dxa" w:w="100"/>
+            </w:tcMar>
+          </w:tcPr>
+          <w:p>
+            <w:pPr>
+              <w:spacing w:after="0"/>
+            </w:pPr>
+            <w:r>
+              <w:rPr>
+                <w:rFonts w:ascii="맑은 고딕" w:cs="맑은 고딕" w:eastAsia="맑은 고딕" w:hAnsi="맑은 고딕"/>
+                <w:b w:val="false"/>
+                <w:bCs w:val="false"/>
+                <w:sz w:val="18"/>
+                <w:szCs w:val="18"/>
+              </w:rPr>
+              <w:t xml:space="preserve">외국인·국내거소자 약 3만 명 포함</w:t>
+            </w:r>
+          </w:p>
+        </w:tc>
+      </w:tr>
+      <w:tr>
+        <w:trPr>
+          <w:tblHeader w:val="false"/>
+        </w:trPr>
+        <w:tc>
+          <w:tcPr>
+            <w:tcW w:type="dxa" w:w="1928"/>
+            <w:tcMar>
+              <w:top w:type="dxa" w:w="60"/>
+              <w:left w:type="dxa" w:w="100"/>
+              <w:bottom w:type="dxa" w:w="60"/>
+              <w:right w:type="dxa" w:w="100"/>
+            </w:tcMar>
+          </w:tcPr>
+          <w:p>
+            <w:pPr>
+              <w:spacing w:after="0"/>
+            </w:pPr>
+            <w:r>
+              <w:rPr>
+                <w:rFonts w:ascii="맑은 고딕" w:cs="맑은 고딕" w:eastAsia="맑은 고딕" w:hAnsi="맑은 고딕"/>
+                <w:b w:val="false"/>
+                <w:bCs w:val="false"/>
+                <w:sz w:val="18"/>
+                <w:szCs w:val="18"/>
+              </w:rPr>
+              <w:t xml:space="preserve">김포시 조출생률 (계산치)</w:t>
+            </w:r>
+          </w:p>
+        </w:tc>
+        <w:tc>
+          <w:tcPr>
+            <w:tcW w:type="dxa" w:w="3855"/>
+            <w:tcMar>
+              <w:top w:type="dxa" w:w="60"/>
+              <w:left w:type="dxa" w:w="100"/>
+              <w:bottom w:type="dxa" w:w="60"/>
+              <w:right w:type="dxa" w:w="100"/>
+            </w:tcMar>
+          </w:tcPr>
+          <w:p>
+            <w:pPr>
+              <w:spacing w:after="0"/>
+            </w:pPr>
+            <w:r>
+              <w:rPr>
+                <w:rFonts w:ascii="맑은 고딕" w:cs="맑은 고딕" w:eastAsia="맑은 고딕" w:hAnsi="맑은 고딕"/>
+                <w:b w:val="false"/>
+                <w:bCs w:val="false"/>
+                <w:sz w:val="18"/>
+                <w:szCs w:val="18"/>
+              </w:rPr>
+              <w:t xml:space="preserve">인구 1,000명당 약 5.0~5.3명</w:t>
+            </w:r>
+          </w:p>
+        </w:tc>
+        <w:tc>
+          <w:tcPr>
+            <w:tcW w:type="dxa" w:w="3855"/>
+            <w:tcMar>
+              <w:top w:type="dxa" w:w="60"/>
+              <w:left w:type="dxa" w:w="100"/>
+              <w:bottom w:type="dxa" w:w="60"/>
+              <w:right w:type="dxa" w:w="100"/>
+            </w:tcMar>
+          </w:tcPr>
+          <w:p>
+            <w:pPr>
+              <w:spacing w:after="0"/>
+            </w:pPr>
+            <w:r>
+              <w:rPr>
+                <w:rFonts w:ascii="맑은 고딕" w:cs="맑은 고딕" w:eastAsia="맑은 고딕" w:hAnsi="맑은 고딕"/>
+                <w:b w:val="false"/>
+                <w:bCs w:val="false"/>
+                <w:sz w:val="18"/>
+                <w:szCs w:val="18"/>
+              </w:rPr>
+              <w:t xml:space="preserve">전국 2024년 4.7명</w:t>
+            </w:r>
+          </w:p>
+        </w:tc>
+      </w:tr>
+      <w:tr>
+        <w:trPr>
+          <w:tblHeader w:val="false"/>
+        </w:trPr>
+        <w:tc>
+          <w:tcPr>
+            <w:tcW w:type="dxa" w:w="1928"/>
+            <w:tcMar>
+              <w:top w:type="dxa" w:w="60"/>
+              <w:left w:type="dxa" w:w="100"/>
+              <w:bottom w:type="dxa" w:w="60"/>
+              <w:right w:type="dxa" w:w="100"/>
+            </w:tcMar>
+          </w:tcPr>
+          <w:p>
+            <w:pPr>
+              <w:spacing w:after="0"/>
+            </w:pPr>
+            <w:r>
+              <w:rPr>
+                <w:rFonts w:ascii="맑은 고딕" w:cs="맑은 고딕" w:eastAsia="맑은 고딕" w:hAnsi="맑은 고딕"/>
+                <w:b w:val="false"/>
+                <w:bCs w:val="false"/>
+                <w:sz w:val="18"/>
+                <w:szCs w:val="18"/>
+              </w:rPr>
+              <w:t xml:space="preserve">김포시 출생 등록 (2026년 1~8월)</w:t>
+            </w:r>
+          </w:p>
+        </w:tc>
+        <w:tc>
+          <w:tcPr>
+            <w:tcW w:type="dxa" w:w="3855"/>
+            <w:tcMar>
+              <w:top w:type="dxa" w:w="60"/>
+              <w:left w:type="dxa" w:w="100"/>
+              <w:bottom w:type="dxa" w:w="60"/>
+              <w:right w:type="dxa" w:w="100"/>
+            </w:tcMar>
+          </w:tcPr>
+          <w:p>
+            <w:pPr>
+              <w:spacing w:after="0"/>
+            </w:pPr>
+            <w:r>
+              <w:rPr>
+                <w:rFonts w:ascii="맑은 고딕" w:cs="맑은 고딕" w:eastAsia="맑은 고딕" w:hAnsi="맑은 고딕"/>
+                <w:b w:val="false"/>
+                <w:bCs w:val="false"/>
+                <w:sz w:val="18"/>
+                <w:szCs w:val="18"/>
+              </w:rPr>
+              <w:t xml:space="preserve">[기입]</w:t>
+            </w:r>
+          </w:p>
+        </w:tc>
+        <w:tc>
+          <w:tcPr>
+            <w:tcW w:type="dxa" w:w="3855"/>
+            <w:tcMar>
+              <w:top w:type="dxa" w:w="60"/>
+              <w:left w:type="dxa" w:w="100"/>
+              <w:bottom w:type="dxa" w:w="60"/>
+              <w:right w:type="dxa" w:w="100"/>
+            </w:tcMar>
+          </w:tcPr>
+          <w:p>
+            <w:pPr>
+              <w:spacing w:after="0"/>
+            </w:pPr>
+            <w:r>
+              <w:rPr>
+                <w:rFonts w:ascii="맑은 고딕" w:cs="맑은 고딕" w:eastAsia="맑은 고딕" w:hAnsi="맑은 고딕"/>
+                <w:b w:val="false"/>
+                <w:bCs w:val="false"/>
+                <w:sz w:val="18"/>
+                <w:szCs w:val="18"/>
+              </w:rPr>
+              <w:t xml:space="preserve">김포시 인구브리핑</w:t>
+            </w:r>
+          </w:p>
+        </w:tc>
+      </w:tr>
+    </w:tbl>
+    <w:p>
+      <w:pPr>
+        <w:spacing w:after="80"/>
+      </w:pPr>
+    </w:p>
+    <w:p>
+      <w:pPr>
+        <w:pStyle w:val="Heading2"/>
+        <w:spacing w:after="100" w:before="200"/>
+      </w:pPr>
+      <w:r>
+        <w:rPr>
+          <w:rFonts w:ascii="맑은 고딕" w:cs="맑은 고딕" w:eastAsia="맑은 고딕" w:hAnsi="맑은 고딕"/>
+          <w:b/>
+          <w:bCs/>
+          <w:color w:val="2E5C8A"/>
+          <w:sz w:val="23"/>
+          <w:szCs w:val="23"/>
+        </w:rPr>
+        <w:t xml:space="preserve">A-2. 경기도 출산 지원 변경 (2026년 10월 1일부터)</w:t>
+      </w:r>
+    </w:p>
+    <w:tbl>
+      <w:tblPr>
+        <w:tblW w:type="dxa" w:w="9638"/>
+        <w:tblBorders>
+          <w:top w:val="single" w:color="auto" w:sz="4"/>
+          <w:left w:val="single" w:color="auto" w:sz="4"/>
+          <w:bottom w:val="single" w:color="auto" w:sz="4"/>
+          <w:right w:val="single" w:color="auto" w:sz="4"/>
+          <w:insideH w:val="single" w:color="auto" w:sz="4"/>
+          <w:insideV w:val="single" w:color="auto" w:sz="4"/>
+        </w:tblBorders>
+        <w:tblLayout w:type="fixed"/>
+      </w:tblPr>
+      <w:tblGrid>
+        <w:gridCol w:w="1928"/>
+        <w:gridCol w:w="2570"/>
+        <w:gridCol w:w="2570"/>
+        <w:gridCol w:w="2570"/>
+      </w:tblGrid>
+      <w:tr>
+        <w:trPr>
+          <w:tblHeader/>
+        </w:trPr>
+        <w:tc>
+          <w:tcPr>
+            <w:tcW w:type="dxa" w:w="1928"/>
+            <w:shd w:fill="D9E2F3" w:color="auto" w:val="clear"/>
+            <w:tcMar>
+              <w:top w:type="dxa" w:w="60"/>
+              <w:left w:type="dxa" w:w="100"/>
+              <w:bottom w:type="dxa" w:w="60"/>
+              <w:right w:type="dxa" w:w="100"/>
+            </w:tcMar>
+          </w:tcPr>
+          <w:p>
+            <w:pPr>
+              <w:spacing w:after="0"/>
+            </w:pPr>
+            <w:r>
+              <w:rPr>
+                <w:rFonts w:ascii="맑은 고딕" w:cs="맑은 고딕" w:eastAsia="맑은 고딕" w:hAnsi="맑은 고딕"/>
+                <w:b/>
+                <w:bCs/>
+                <w:sz w:val="18"/>
+                <w:szCs w:val="18"/>
+              </w:rPr>
+              <w:t xml:space="preserve">항목</w:t>
+            </w:r>
+          </w:p>
+        </w:tc>
+        <w:tc>
+          <w:tcPr>
+            <w:tcW w:type="dxa" w:w="2570"/>
+            <w:shd w:fill="D9E2F3" w:color="auto" w:val="clear"/>
+            <w:tcMar>
+              <w:top w:type="dxa" w:w="60"/>
+              <w:left w:type="dxa" w:w="100"/>
+              <w:bottom w:type="dxa" w:w="60"/>
+              <w:right w:type="dxa" w:w="100"/>
+            </w:tcMar>
+          </w:tcPr>
+          <w:p>
+            <w:pPr>
+              <w:spacing w:after="0"/>
+            </w:pPr>
+            <w:r>
+              <w:rPr>
+                <w:rFonts w:ascii="맑은 고딕" w:cs="맑은 고딕" w:eastAsia="맑은 고딕" w:hAnsi="맑은 고딕"/>
+                <w:b/>
+                <w:bCs/>
+                <w:sz w:val="18"/>
+                <w:szCs w:val="18"/>
+              </w:rPr>
+              <w:t xml:space="preserve">변경 전</w:t>
+            </w:r>
+          </w:p>
+        </w:tc>
+        <w:tc>
+          <w:tcPr>
+            <w:tcW w:type="dxa" w:w="2570"/>
+            <w:shd w:fill="D9E2F3" w:color="auto" w:val="clear"/>
+            <w:tcMar>
+              <w:top w:type="dxa" w:w="60"/>
+              <w:left w:type="dxa" w:w="100"/>
+              <w:bottom w:type="dxa" w:w="60"/>
+              <w:right w:type="dxa" w:w="100"/>
+            </w:tcMar>
+          </w:tcPr>
+          <w:p>
+            <w:pPr>
+              <w:spacing w:after="0"/>
+            </w:pPr>
+            <w:r>
+              <w:rPr>
+                <w:rFonts w:ascii="맑은 고딕" w:cs="맑은 고딕" w:eastAsia="맑은 고딕" w:hAnsi="맑은 고딕"/>
+                <w:b/>
+                <w:bCs/>
+                <w:sz w:val="18"/>
+                <w:szCs w:val="18"/>
+              </w:rPr>
+              <w:t xml:space="preserve">변경 후</w:t>
+            </w:r>
+          </w:p>
+        </w:tc>
+        <w:tc>
+          <w:tcPr>
+            <w:tcW w:type="dxa" w:w="2570"/>
+            <w:shd w:fill="D9E2F3" w:color="auto" w:val="clear"/>
+            <w:tcMar>
+              <w:top w:type="dxa" w:w="60"/>
+              <w:left w:type="dxa" w:w="100"/>
+              <w:bottom w:type="dxa" w:w="60"/>
+              <w:right w:type="dxa" w:w="100"/>
+            </w:tcMar>
+          </w:tcPr>
+          <w:p>
+            <w:pPr>
+              <w:spacing w:after="0"/>
+            </w:pPr>
+            <w:r>
+              <w:rPr>
+                <w:rFonts w:ascii="맑은 고딕" w:cs="맑은 고딕" w:eastAsia="맑은 고딕" w:hAnsi="맑은 고딕"/>
+                <w:b/>
+                <w:bCs/>
+                <w:sz w:val="18"/>
+                <w:szCs w:val="18"/>
+              </w:rPr>
+              <w:t xml:space="preserve">우리 산모 영향</w:t>
+            </w:r>
+          </w:p>
+        </w:tc>
+      </w:tr>
+      <w:tr>
+        <w:trPr>
+          <w:tblHeader w:val="false"/>
+        </w:trPr>
+        <w:tc>
+          <w:tcPr>
+            <w:tcW w:type="dxa" w:w="1928"/>
+            <w:tcMar>
+              <w:top w:type="dxa" w:w="60"/>
+              <w:left w:type="dxa" w:w="100"/>
+              <w:bottom w:type="dxa" w:w="60"/>
+              <w:right w:type="dxa" w:w="100"/>
+            </w:tcMar>
+          </w:tcPr>
+          <w:p>
+            <w:pPr>
+              <w:spacing w:after="0"/>
+            </w:pPr>
+            <w:r>
+              <w:rPr>
+                <w:rFonts w:ascii="맑은 고딕" w:cs="맑은 고딕" w:eastAsia="맑은 고딕" w:hAnsi="맑은 고딕"/>
+                <w:b w:val="false"/>
+                <w:bCs w:val="false"/>
+                <w:sz w:val="18"/>
+                <w:szCs w:val="18"/>
+              </w:rPr>
+              <w:t xml:space="preserve">경기도 산후조리비</w:t>
+            </w:r>
+          </w:p>
+        </w:tc>
+        <w:tc>
+          <w:tcPr>
+            <w:tcW w:type="dxa" w:w="2570"/>
+            <w:tcMar>
+              <w:top w:type="dxa" w:w="60"/>
+              <w:left w:type="dxa" w:w="100"/>
+              <w:bottom w:type="dxa" w:w="60"/>
+              <w:right w:type="dxa" w:w="100"/>
+            </w:tcMar>
+          </w:tcPr>
+          <w:p>
+            <w:pPr>
+              <w:spacing w:after="0"/>
+            </w:pPr>
+            <w:r>
+              <w:rPr>
+                <w:rFonts w:ascii="맑은 고딕" w:cs="맑은 고딕" w:eastAsia="맑은 고딕" w:hAnsi="맑은 고딕"/>
+                <w:b w:val="false"/>
+                <w:bCs w:val="false"/>
+                <w:sz w:val="18"/>
+                <w:szCs w:val="18"/>
+              </w:rPr>
+              <w:t xml:space="preserve">출생아 1인당 50만원</w:t>
+            </w:r>
+          </w:p>
+        </w:tc>
+        <w:tc>
+          <w:tcPr>
+            <w:tcW w:type="dxa" w:w="2570"/>
+            <w:tcMar>
+              <w:top w:type="dxa" w:w="60"/>
+              <w:left w:type="dxa" w:w="100"/>
+              <w:bottom w:type="dxa" w:w="60"/>
+              <w:right w:type="dxa" w:w="100"/>
+            </w:tcMar>
+          </w:tcPr>
+          <w:p>
+            <w:pPr>
+              <w:spacing w:after="0"/>
+            </w:pPr>
+            <w:r>
+              <w:rPr>
+                <w:rFonts w:ascii="맑은 고딕" w:cs="맑은 고딕" w:eastAsia="맑은 고딕" w:hAnsi="맑은 고딕"/>
+                <w:b w:val="false"/>
+                <w:bCs w:val="false"/>
+                <w:sz w:val="18"/>
+                <w:szCs w:val="18"/>
+              </w:rPr>
+              <w:t xml:space="preserve">9월 30일 신청분까지만 지급, 이후 종료</w:t>
+            </w:r>
+          </w:p>
+        </w:tc>
+        <w:tc>
+          <w:tcPr>
+            <w:tcW w:type="dxa" w:w="2570"/>
+            <w:tcMar>
+              <w:top w:type="dxa" w:w="60"/>
+              <w:left w:type="dxa" w:w="100"/>
+              <w:bottom w:type="dxa" w:w="60"/>
+              <w:right w:type="dxa" w:w="100"/>
+            </w:tcMar>
+          </w:tcPr>
+          <w:p>
+            <w:pPr>
+              <w:spacing w:after="0"/>
+            </w:pPr>
+            <w:r>
+              <w:rPr>
+                <w:rFonts w:ascii="맑은 고딕" w:cs="맑은 고딕" w:eastAsia="맑은 고딕" w:hAnsi="맑은 고딕"/>
+                <w:b w:val="false"/>
+                <w:bCs w:val="false"/>
+                <w:sz w:val="18"/>
+                <w:szCs w:val="18"/>
+              </w:rPr>
+              <w:t xml:space="preserve">4분기 출산 가정 50만원 감소</w:t>
+            </w:r>
+          </w:p>
+        </w:tc>
+      </w:tr>
+      <w:tr>
+        <w:trPr>
+          <w:tblHeader w:val="false"/>
+        </w:trPr>
+        <w:tc>
+          <w:tcPr>
+            <w:tcW w:type="dxa" w:w="1928"/>
+            <w:tcMar>
+              <w:top w:type="dxa" w:w="60"/>
+              <w:left w:type="dxa" w:w="100"/>
+              <w:bottom w:type="dxa" w:w="60"/>
+              <w:right w:type="dxa" w:w="100"/>
+            </w:tcMar>
+          </w:tcPr>
+          <w:p>
+            <w:pPr>
+              <w:spacing w:after="0"/>
+            </w:pPr>
+            <w:r>
+              <w:rPr>
+                <w:rFonts w:ascii="맑은 고딕" w:cs="맑은 고딕" w:eastAsia="맑은 고딕" w:hAnsi="맑은 고딕"/>
+                <w:b w:val="false"/>
+                <w:bCs w:val="false"/>
+                <w:sz w:val="18"/>
+                <w:szCs w:val="18"/>
+              </w:rPr>
+              <w:t xml:space="preserve">산모·신생아 건강관리 라형(추가형)</w:t>
+            </w:r>
+          </w:p>
+        </w:tc>
+        <w:tc>
+          <w:tcPr>
+            <w:tcW w:type="dxa" w:w="2570"/>
+            <w:tcMar>
+              <w:top w:type="dxa" w:w="60"/>
+              <w:left w:type="dxa" w:w="100"/>
+              <w:bottom w:type="dxa" w:w="60"/>
+              <w:right w:type="dxa" w:w="100"/>
+            </w:tcMar>
+          </w:tcPr>
+          <w:p>
+            <w:pPr>
+              <w:spacing w:after="0"/>
+            </w:pPr>
+            <w:r>
+              <w:rPr>
+                <w:rFonts w:ascii="맑은 고딕" w:cs="맑은 고딕" w:eastAsia="맑은 고딕" w:hAnsi="맑은 고딕"/>
+                <w:b w:val="false"/>
+                <w:bCs w:val="false"/>
+                <w:sz w:val="18"/>
+                <w:szCs w:val="18"/>
+              </w:rPr>
+              <w:t xml:space="preserve">중위소득 150% 초과 가정에 도비·시군비 추가 지원</w:t>
+            </w:r>
+          </w:p>
+        </w:tc>
+        <w:tc>
+          <w:tcPr>
+            <w:tcW w:type="dxa" w:w="2570"/>
+            <w:tcMar>
+              <w:top w:type="dxa" w:w="60"/>
+              <w:left w:type="dxa" w:w="100"/>
+              <w:bottom w:type="dxa" w:w="60"/>
+              <w:right w:type="dxa" w:w="100"/>
+            </w:tcMar>
+          </w:tcPr>
+          <w:p>
+            <w:pPr>
+              <w:spacing w:after="0"/>
+            </w:pPr>
+            <w:r>
+              <w:rPr>
+                <w:rFonts w:ascii="맑은 고딕" w:cs="맑은 고딕" w:eastAsia="맑은 고딕" w:hAnsi="맑은 고딕"/>
+                <w:b w:val="false"/>
+                <w:bCs w:val="false"/>
+                <w:sz w:val="18"/>
+                <w:szCs w:val="18"/>
+              </w:rPr>
+              <w:t xml:space="preserve">9월 30일 신청분으로 종료, 10월 1일부터 신규 신청 불가</w:t>
+            </w:r>
+          </w:p>
+        </w:tc>
+        <w:tc>
+          <w:tcPr>
+            <w:tcW w:type="dxa" w:w="2570"/>
+            <w:tcMar>
+              <w:top w:type="dxa" w:w="60"/>
+              <w:left w:type="dxa" w:w="100"/>
+              <w:bottom w:type="dxa" w:w="60"/>
+              <w:right w:type="dxa" w:w="100"/>
+            </w:tcMar>
+          </w:tcPr>
+          <w:p>
+            <w:pPr>
+              <w:spacing w:after="0"/>
+            </w:pPr>
+            <w:r>
+              <w:rPr>
+                <w:rFonts w:ascii="맑은 고딕" w:cs="맑은 고딕" w:eastAsia="맑은 고딕" w:hAnsi="맑은 고딕"/>
+                <w:b w:val="false"/>
+                <w:bCs w:val="false"/>
+                <w:sz w:val="18"/>
+                <w:szCs w:val="18"/>
+              </w:rPr>
+              <w:t xml:space="preserve">150% 초과 산모 전액 본인부담</w:t>
+            </w:r>
+          </w:p>
+        </w:tc>
+      </w:tr>
+      <w:tr>
+        <w:trPr>
+          <w:tblHeader w:val="false"/>
+        </w:trPr>
+        <w:tc>
+          <w:tcPr>
+            <w:tcW w:type="dxa" w:w="1928"/>
+            <w:tcMar>
+              <w:top w:type="dxa" w:w="60"/>
+              <w:left w:type="dxa" w:w="100"/>
+              <w:bottom w:type="dxa" w:w="60"/>
+              <w:right w:type="dxa" w:w="100"/>
+            </w:tcMar>
+          </w:tcPr>
+          <w:p>
+            <w:pPr>
+              <w:spacing w:after="0"/>
+            </w:pPr>
+            <w:r>
+              <w:rPr>
+                <w:rFonts w:ascii="맑은 고딕" w:cs="맑은 고딕" w:eastAsia="맑은 고딕" w:hAnsi="맑은 고딕"/>
+                <w:b w:val="false"/>
+                <w:bCs w:val="false"/>
+                <w:sz w:val="18"/>
+                <w:szCs w:val="18"/>
+              </w:rPr>
+              <w:t xml:space="preserve">정부 기준 가·나·다형</w:t>
+            </w:r>
+          </w:p>
+        </w:tc>
+        <w:tc>
+          <w:tcPr>
+            <w:tcW w:type="dxa" w:w="2570"/>
+            <w:tcMar>
+              <w:top w:type="dxa" w:w="60"/>
+              <w:left w:type="dxa" w:w="100"/>
+              <w:bottom w:type="dxa" w:w="60"/>
+              <w:right w:type="dxa" w:w="100"/>
+            </w:tcMar>
+          </w:tcPr>
+          <w:p>
+            <w:pPr>
+              <w:spacing w:after="0"/>
+            </w:pPr>
+            <w:r>
+              <w:rPr>
+                <w:rFonts w:ascii="맑은 고딕" w:cs="맑은 고딕" w:eastAsia="맑은 고딕" w:hAnsi="맑은 고딕"/>
+                <w:b w:val="false"/>
+                <w:bCs w:val="false"/>
+                <w:sz w:val="18"/>
+                <w:szCs w:val="18"/>
+              </w:rPr>
+              <w:t xml:space="preserve">중위소득 150% 이하 정부 지원</w:t>
+            </w:r>
+          </w:p>
+        </w:tc>
+        <w:tc>
+          <w:tcPr>
+            <w:tcW w:type="dxa" w:w="2570"/>
+            <w:tcMar>
+              <w:top w:type="dxa" w:w="60"/>
+              <w:left w:type="dxa" w:w="100"/>
+              <w:bottom w:type="dxa" w:w="60"/>
+              <w:right w:type="dxa" w:w="100"/>
+            </w:tcMar>
+          </w:tcPr>
+          <w:p>
+            <w:pPr>
+              <w:spacing w:after="0"/>
+            </w:pPr>
+            <w:r>
+              <w:rPr>
+                <w:rFonts w:ascii="맑은 고딕" w:cs="맑은 고딕" w:eastAsia="맑은 고딕" w:hAnsi="맑은 고딕"/>
+                <w:b w:val="false"/>
+                <w:bCs w:val="false"/>
+                <w:sz w:val="18"/>
+                <w:szCs w:val="18"/>
+              </w:rPr>
+              <w:t xml:space="preserve">유지</w:t>
+            </w:r>
+          </w:p>
+        </w:tc>
+        <w:tc>
+          <w:tcPr>
+            <w:tcW w:type="dxa" w:w="2570"/>
+            <w:tcMar>
+              <w:top w:type="dxa" w:w="60"/>
+              <w:left w:type="dxa" w:w="100"/>
+              <w:bottom w:type="dxa" w:w="60"/>
+              <w:right w:type="dxa" w:w="100"/>
+            </w:tcMar>
+          </w:tcPr>
+          <w:p>
+            <w:pPr>
+              <w:spacing w:after="0"/>
+            </w:pPr>
+            <w:r>
+              <w:rPr>
+                <w:rFonts w:ascii="맑은 고딕" w:cs="맑은 고딕" w:eastAsia="맑은 고딕" w:hAnsi="맑은 고딕"/>
+                <w:b w:val="false"/>
+                <w:bCs w:val="false"/>
+                <w:sz w:val="18"/>
+                <w:szCs w:val="18"/>
+              </w:rPr>
+              <w:t xml:space="preserve">변동 없음</w:t>
+            </w:r>
+          </w:p>
+        </w:tc>
+      </w:tr>
+      <w:tr>
+        <w:trPr>
+          <w:tblHeader w:val="false"/>
+        </w:trPr>
+        <w:tc>
+          <w:tcPr>
+            <w:tcW w:type="dxa" w:w="1928"/>
+            <w:tcMar>
+              <w:top w:type="dxa" w:w="60"/>
+              <w:left w:type="dxa" w:w="100"/>
+              <w:bottom w:type="dxa" w:w="60"/>
+              <w:right w:type="dxa" w:w="100"/>
+            </w:tcMar>
+          </w:tcPr>
+          <w:p>
+            <w:pPr>
+              <w:spacing w:after="0"/>
+            </w:pPr>
+            <w:r>
+              <w:rPr>
+                <w:rFonts w:ascii="맑은 고딕" w:cs="맑은 고딕" w:eastAsia="맑은 고딕" w:hAnsi="맑은 고딕"/>
+                <w:b w:val="false"/>
+                <w:bCs w:val="false"/>
+                <w:sz w:val="18"/>
+                <w:szCs w:val="18"/>
+              </w:rPr>
+              <w:t xml:space="preserve">김포시 본인부담금 지원</w:t>
+            </w:r>
+          </w:p>
+        </w:tc>
+        <w:tc>
+          <w:tcPr>
+            <w:tcW w:type="dxa" w:w="2570"/>
+            <w:tcMar>
+              <w:top w:type="dxa" w:w="60"/>
+              <w:left w:type="dxa" w:w="100"/>
+              <w:bottom w:type="dxa" w:w="60"/>
+              <w:right w:type="dxa" w:w="100"/>
+            </w:tcMar>
+          </w:tcPr>
+          <w:p>
+            <w:pPr>
+              <w:spacing w:after="0"/>
+            </w:pPr>
+            <w:r>
+              <w:rPr>
+                <w:rFonts w:ascii="맑은 고딕" w:cs="맑은 고딕" w:eastAsia="맑은 고딕" w:hAnsi="맑은 고딕"/>
+                <w:b w:val="false"/>
+                <w:bCs w:val="false"/>
+                <w:sz w:val="18"/>
+                <w:szCs w:val="18"/>
+              </w:rPr>
+              <w:t xml:space="preserve">본인부담금 90% 지원</w:t>
+            </w:r>
+          </w:p>
+        </w:tc>
+        <w:tc>
+          <w:tcPr>
+            <w:tcW w:type="dxa" w:w="2570"/>
+            <w:tcMar>
+              <w:top w:type="dxa" w:w="60"/>
+              <w:left w:type="dxa" w:w="100"/>
+              <w:bottom w:type="dxa" w:w="60"/>
+              <w:right w:type="dxa" w:w="100"/>
+            </w:tcMar>
+          </w:tcPr>
+          <w:p>
+            <w:pPr>
+              <w:spacing w:after="0"/>
+            </w:pPr>
+            <w:r>
+              <w:rPr>
+                <w:rFonts w:ascii="맑은 고딕" w:cs="맑은 고딕" w:eastAsia="맑은 고딕" w:hAnsi="맑은 고딕"/>
+                <w:b w:val="false"/>
+                <w:bCs w:val="false"/>
+                <w:sz w:val="18"/>
+                <w:szCs w:val="18"/>
+              </w:rPr>
+              <w:t xml:space="preserve">유지 여부 확인 필요 → [기입]</w:t>
+            </w:r>
+          </w:p>
+        </w:tc>
+        <w:tc>
+          <w:tcPr>
+            <w:tcW w:type="dxa" w:w="2570"/>
+            <w:tcMar>
+              <w:top w:type="dxa" w:w="60"/>
+              <w:left w:type="dxa" w:w="100"/>
+              <w:bottom w:type="dxa" w:w="60"/>
+              <w:right w:type="dxa" w:w="100"/>
+            </w:tcMar>
+          </w:tcPr>
+          <w:p>
+            <w:pPr>
+              <w:spacing w:after="0"/>
+            </w:pPr>
+            <w:r>
+              <w:rPr>
+                <w:rFonts w:ascii="맑은 고딕" w:cs="맑은 고딕" w:eastAsia="맑은 고딕" w:hAnsi="맑은 고딕"/>
+                <w:b w:val="false"/>
+                <w:bCs w:val="false"/>
+                <w:sz w:val="18"/>
+                <w:szCs w:val="18"/>
+              </w:rPr>
+              <w:t xml:space="preserve">김포시 보건소 031-5186-4152</w:t>
+            </w:r>
+          </w:p>
+        </w:tc>
+      </w:tr>
+      <w:tr>
+        <w:trPr>
+          <w:tblHeader w:val="false"/>
+        </w:trPr>
+        <w:tc>
+          <w:tcPr>
+            <w:tcW w:type="dxa" w:w="1928"/>
+            <w:tcMar>
+              <w:top w:type="dxa" w:w="60"/>
+              <w:left w:type="dxa" w:w="100"/>
+              <w:bottom w:type="dxa" w:w="60"/>
+              <w:right w:type="dxa" w:w="100"/>
+            </w:tcMar>
+          </w:tcPr>
+          <w:p>
+            <w:pPr>
+              <w:spacing w:after="0"/>
+            </w:pPr>
+            <w:r>
+              <w:rPr>
+                <w:rFonts w:ascii="맑은 고딕" w:cs="맑은 고딕" w:eastAsia="맑은 고딕" w:hAnsi="맑은 고딕"/>
+                <w:b w:val="false"/>
+                <w:bCs w:val="false"/>
+                <w:sz w:val="18"/>
+                <w:szCs w:val="18"/>
+              </w:rPr>
+              <w:t xml:space="preserve">도비 보조율</w:t>
+            </w:r>
+          </w:p>
+        </w:tc>
+        <w:tc>
+          <w:tcPr>
+            <w:tcW w:type="dxa" w:w="2570"/>
+            <w:tcMar>
+              <w:top w:type="dxa" w:w="60"/>
+              <w:left w:type="dxa" w:w="100"/>
+              <w:bottom w:type="dxa" w:w="60"/>
+              <w:right w:type="dxa" w:w="100"/>
+            </w:tcMar>
+          </w:tcPr>
+          <w:p>
+            <w:pPr>
+              <w:spacing w:after="0"/>
+            </w:pPr>
+            <w:r>
+              <w:rPr>
+                <w:rFonts w:ascii="맑은 고딕" w:cs="맑은 고딕" w:eastAsia="맑은 고딕" w:hAnsi="맑은 고딕"/>
+                <w:b w:val="false"/>
+                <w:bCs w:val="false"/>
+                <w:sz w:val="18"/>
+                <w:szCs w:val="18"/>
+              </w:rPr>
+              <w:t xml:space="preserve">라형 도비 50% → 2026년 30%</w:t>
+            </w:r>
+          </w:p>
+        </w:tc>
+        <w:tc>
+          <w:tcPr>
+            <w:tcW w:type="dxa" w:w="2570"/>
+            <w:tcMar>
+              <w:top w:type="dxa" w:w="60"/>
+              <w:left w:type="dxa" w:w="100"/>
+              <w:bottom w:type="dxa" w:w="60"/>
+              <w:right w:type="dxa" w:w="100"/>
+            </w:tcMar>
+          </w:tcPr>
+          <w:p>
+            <w:pPr>
+              <w:spacing w:after="0"/>
+            </w:pPr>
+            <w:r>
+              <w:rPr>
+                <w:rFonts w:ascii="맑은 고딕" w:cs="맑은 고딕" w:eastAsia="맑은 고딕" w:hAnsi="맑은 고딕"/>
+                <w:b w:val="false"/>
+                <w:bCs w:val="false"/>
+                <w:sz w:val="18"/>
+                <w:szCs w:val="18"/>
+              </w:rPr>
+              <w:t xml:space="preserve">10월부터 출산·돌봄 사업 도비 보조율 추가 축소 통보</w:t>
+            </w:r>
+          </w:p>
+        </w:tc>
+        <w:tc>
+          <w:tcPr>
+            <w:tcW w:type="dxa" w:w="2570"/>
+            <w:tcMar>
+              <w:top w:type="dxa" w:w="60"/>
+              <w:left w:type="dxa" w:w="100"/>
+              <w:bottom w:type="dxa" w:w="60"/>
+              <w:right w:type="dxa" w:w="100"/>
+            </w:tcMar>
+          </w:tcPr>
+          <w:p>
+            <w:pPr>
+              <w:spacing w:after="0"/>
+            </w:pPr>
+            <w:r>
+              <w:rPr>
+                <w:rFonts w:ascii="맑은 고딕" w:cs="맑은 고딕" w:eastAsia="맑은 고딕" w:hAnsi="맑은 고딕"/>
+                <w:b w:val="false"/>
+                <w:bCs w:val="false"/>
+                <w:sz w:val="18"/>
+                <w:szCs w:val="18"/>
+              </w:rPr>
+              <w:t xml:space="preserve">시군 예산 부담 증가</w:t>
+            </w:r>
+          </w:p>
+        </w:tc>
+      </w:tr>
+      <w:tr>
+        <w:trPr>
+          <w:tblHeader w:val="false"/>
+        </w:trPr>
+        <w:tc>
+          <w:tcPr>
+            <w:tcW w:type="dxa" w:w="1928"/>
+            <w:tcMar>
+              <w:top w:type="dxa" w:w="60"/>
+              <w:left w:type="dxa" w:w="100"/>
+              <w:bottom w:type="dxa" w:w="60"/>
+              <w:right w:type="dxa" w:w="100"/>
+            </w:tcMar>
+          </w:tcPr>
+          <w:p>
+            <w:pPr>
+              <w:spacing w:after="0"/>
+            </w:pPr>
+            <w:r>
+              <w:rPr>
+                <w:rFonts w:ascii="맑은 고딕" w:cs="맑은 고딕" w:eastAsia="맑은 고딕" w:hAnsi="맑은 고딕"/>
+                <w:b w:val="false"/>
+                <w:bCs w:val="false"/>
+                <w:sz w:val="18"/>
+                <w:szCs w:val="18"/>
+              </w:rPr>
+              <w:t xml:space="preserve">난임 지원</w:t>
+            </w:r>
+          </w:p>
+        </w:tc>
+        <w:tc>
+          <w:tcPr>
+            <w:tcW w:type="dxa" w:w="2570"/>
+            <w:tcMar>
+              <w:top w:type="dxa" w:w="60"/>
+              <w:left w:type="dxa" w:w="100"/>
+              <w:bottom w:type="dxa" w:w="60"/>
+              <w:right w:type="dxa" w:w="100"/>
+            </w:tcMar>
+          </w:tcPr>
+          <w:p>
+            <w:pPr>
+              <w:spacing w:after="0"/>
+            </w:pPr>
+            <w:r>
+              <w:rPr>
+                <w:rFonts w:ascii="맑은 고딕" w:cs="맑은 고딕" w:eastAsia="맑은 고딕" w:hAnsi="맑은 고딕"/>
+                <w:b w:val="false"/>
+                <w:bCs w:val="false"/>
+                <w:sz w:val="18"/>
+                <w:szCs w:val="18"/>
+              </w:rPr>
+              <w:t xml:space="preserve">660억원</w:t>
+            </w:r>
+          </w:p>
+        </w:tc>
+        <w:tc>
+          <w:tcPr>
+            <w:tcW w:type="dxa" w:w="2570"/>
+            <w:tcMar>
+              <w:top w:type="dxa" w:w="60"/>
+              <w:left w:type="dxa" w:w="100"/>
+              <w:bottom w:type="dxa" w:w="60"/>
+              <w:right w:type="dxa" w:w="100"/>
+            </w:tcMar>
+          </w:tcPr>
+          <w:p>
+            <w:pPr>
+              <w:spacing w:after="0"/>
+            </w:pPr>
+            <w:r>
+              <w:rPr>
+                <w:rFonts w:ascii="맑은 고딕" w:cs="맑은 고딕" w:eastAsia="맑은 고딕" w:hAnsi="맑은 고딕"/>
+                <w:b w:val="false"/>
+                <w:bCs w:val="false"/>
+                <w:sz w:val="18"/>
+                <w:szCs w:val="18"/>
+              </w:rPr>
+              <w:t xml:space="preserve">956억원(+296억원)</w:t>
+            </w:r>
+          </w:p>
+        </w:tc>
+        <w:tc>
+          <w:tcPr>
+            <w:tcW w:type="dxa" w:w="2570"/>
+            <w:tcMar>
+              <w:top w:type="dxa" w:w="60"/>
+              <w:left w:type="dxa" w:w="100"/>
+              <w:bottom w:type="dxa" w:w="60"/>
+              <w:right w:type="dxa" w:w="100"/>
+            </w:tcMar>
+          </w:tcPr>
+          <w:p>
+            <w:pPr>
+              <w:spacing w:after="0"/>
+            </w:pPr>
+            <w:r>
+              <w:rPr>
+                <w:rFonts w:ascii="맑은 고딕" w:cs="맑은 고딕" w:eastAsia="맑은 고딕" w:hAnsi="맑은 고딕"/>
+                <w:b w:val="false"/>
+                <w:bCs w:val="false"/>
+                <w:sz w:val="18"/>
+                <w:szCs w:val="18"/>
+              </w:rPr>
+              <w:t xml:space="preserve">해당 없음</w:t>
+            </w:r>
+          </w:p>
+        </w:tc>
+      </w:tr>
+    </w:tbl>
+    <w:p>
+      <w:pPr>
+        <w:spacing w:after="80"/>
+      </w:pPr>
+    </w:p>
+    <w:p>
+      <w:pPr>
+        <w:pStyle w:val="Heading2"/>
+        <w:spacing w:after="100" w:before="200"/>
+      </w:pPr>
+      <w:r>
+        <w:rPr>
+          <w:rFonts w:ascii="맑은 고딕" w:cs="맑은 고딕" w:eastAsia="맑은 고딕" w:hAnsi="맑은 고딕"/>
+          <w:b/>
+          <w:bCs/>
+          <w:color w:val="2E5C8A"/>
+          <w:sz w:val="23"/>
+          <w:szCs w:val="23"/>
+        </w:rPr>
+        <w:t xml:space="preserve">A-3. 바우처 이용 현황 (내부 자료, 회의 전 기입)</w:t>
+      </w:r>
+    </w:p>
+    <w:tbl>
+      <w:tblPr>
+        <w:tblW w:type="dxa" w:w="9638"/>
+        <w:tblBorders>
+          <w:top w:val="single" w:color="auto" w:sz="4"/>
+          <w:left w:val="single" w:color="auto" w:sz="4"/>
+          <w:bottom w:val="single" w:color="auto" w:sz="4"/>
+          <w:right w:val="single" w:color="auto" w:sz="4"/>
+          <w:insideH w:val="single" w:color="auto" w:sz="4"/>
+          <w:insideV w:val="single" w:color="auto" w:sz="4"/>
+        </w:tblBorders>
+        <w:tblLayout w:type="fixed"/>
+      </w:tblPr>
+      <w:tblGrid>
+        <w:gridCol w:w="1928"/>
+        <w:gridCol w:w="3855"/>
+        <w:gridCol w:w="3855"/>
+      </w:tblGrid>
+      <w:tr>
+        <w:trPr>
+          <w:tblHeader/>
+        </w:trPr>
+        <w:tc>
+          <w:tcPr>
+            <w:tcW w:type="dxa" w:w="1928"/>
+            <w:shd w:fill="D9E2F3" w:color="auto" w:val="clear"/>
+            <w:tcMar>
+              <w:top w:type="dxa" w:w="60"/>
+              <w:left w:type="dxa" w:w="100"/>
+              <w:bottom w:type="dxa" w:w="60"/>
+              <w:right w:type="dxa" w:w="100"/>
+            </w:tcMar>
+          </w:tcPr>
+          <w:p>
+            <w:pPr>
+              <w:spacing w:after="0"/>
+            </w:pPr>
+            <w:r>
+              <w:rPr>
+                <w:rFonts w:ascii="맑은 고딕" w:cs="맑은 고딕" w:eastAsia="맑은 고딕" w:hAnsi="맑은 고딕"/>
+                <w:b/>
+                <w:bCs/>
+                <w:sz w:val="18"/>
+                <w:szCs w:val="18"/>
+              </w:rPr>
+              <w:t xml:space="preserve">구분</w:t>
+            </w:r>
+          </w:p>
+        </w:tc>
+        <w:tc>
+          <w:tcPr>
+            <w:tcW w:type="dxa" w:w="3855"/>
+            <w:shd w:fill="D9E2F3" w:color="auto" w:val="clear"/>
+            <w:tcMar>
+              <w:top w:type="dxa" w:w="60"/>
+              <w:left w:type="dxa" w:w="100"/>
+              <w:bottom w:type="dxa" w:w="60"/>
+              <w:right w:type="dxa" w:w="100"/>
+            </w:tcMar>
+          </w:tcPr>
+          <w:p>
+            <w:pPr>
+              <w:spacing w:after="0"/>
+            </w:pPr>
+            <w:r>
+              <w:rPr>
+                <w:rFonts w:ascii="맑은 고딕" w:cs="맑은 고딕" w:eastAsia="맑은 고딕" w:hAnsi="맑은 고딕"/>
+                <w:b/>
+                <w:bCs/>
+                <w:sz w:val="18"/>
+                <w:szCs w:val="18"/>
+              </w:rPr>
+              <w:t xml:space="preserve">2025년</w:t>
+            </w:r>
+          </w:p>
+        </w:tc>
+        <w:tc>
+          <w:tcPr>
+            <w:tcW w:type="dxa" w:w="3855"/>
+            <w:shd w:fill="D9E2F3" w:color="auto" w:val="clear"/>
+            <w:tcMar>
+              <w:top w:type="dxa" w:w="60"/>
+              <w:left w:type="dxa" w:w="100"/>
+              <w:bottom w:type="dxa" w:w="60"/>
+              <w:right w:type="dxa" w:w="100"/>
+            </w:tcMar>
+          </w:tcPr>
+          <w:p>
+            <w:pPr>
+              <w:spacing w:after="0"/>
+            </w:pPr>
+            <w:r>
+              <w:rPr>
+                <w:rFonts w:ascii="맑은 고딕" w:cs="맑은 고딕" w:eastAsia="맑은 고딕" w:hAnsi="맑은 고딕"/>
+                <w:b/>
+                <w:bCs/>
+                <w:sz w:val="18"/>
+                <w:szCs w:val="18"/>
+              </w:rPr>
+              <w:t xml:space="preserve">2026년 1~8월</w:t>
+            </w:r>
+          </w:p>
+        </w:tc>
+      </w:tr>
+      <w:tr>
+        <w:trPr>
+          <w:tblHeader w:val="false"/>
+        </w:trPr>
+        <w:tc>
+          <w:tcPr>
+            <w:tcW w:type="dxa" w:w="1928"/>
+            <w:tcMar>
+              <w:top w:type="dxa" w:w="60"/>
+              <w:left w:type="dxa" w:w="100"/>
+              <w:bottom w:type="dxa" w:w="60"/>
+              <w:right w:type="dxa" w:w="100"/>
+            </w:tcMar>
+          </w:tcPr>
+          <w:p>
+            <w:pPr>
+              <w:spacing w:after="0"/>
+            </w:pPr>
+            <w:r>
+              <w:rPr>
+                <w:rFonts w:ascii="맑은 고딕" w:cs="맑은 고딕" w:eastAsia="맑은 고딕" w:hAnsi="맑은 고딕"/>
+                <w:b w:val="false"/>
+                <w:bCs w:val="false"/>
+                <w:sz w:val="18"/>
+                <w:szCs w:val="18"/>
+              </w:rPr>
+              <w:t xml:space="preserve">바우처 이용 건수</w:t>
+            </w:r>
+          </w:p>
+        </w:tc>
+        <w:tc>
+          <w:tcPr>
+            <w:tcW w:type="dxa" w:w="3855"/>
+            <w:tcMar>
+              <w:top w:type="dxa" w:w="60"/>
+              <w:left w:type="dxa" w:w="100"/>
+              <w:bottom w:type="dxa" w:w="60"/>
+              <w:right w:type="dxa" w:w="100"/>
+            </w:tcMar>
+          </w:tcPr>
+          <w:p>
+            <w:pPr>
+              <w:spacing w:after="0"/>
+            </w:pPr>
+            <w:r>
+              <w:rPr>
+                <w:rFonts w:ascii="맑은 고딕" w:cs="맑은 고딕" w:eastAsia="맑은 고딕" w:hAnsi="맑은 고딕"/>
+                <w:b w:val="false"/>
+                <w:bCs w:val="false"/>
+                <w:sz w:val="18"/>
+                <w:szCs w:val="18"/>
+              </w:rPr>
+              <w:t xml:space="preserve">[기입]</w:t>
+            </w:r>
+          </w:p>
+        </w:tc>
+        <w:tc>
+          <w:tcPr>
+            <w:tcW w:type="dxa" w:w="3855"/>
+            <w:tcMar>
+              <w:top w:type="dxa" w:w="60"/>
+              <w:left w:type="dxa" w:w="100"/>
+              <w:bottom w:type="dxa" w:w="60"/>
+              <w:right w:type="dxa" w:w="100"/>
+            </w:tcMar>
+          </w:tcPr>
+          <w:p>
+            <w:pPr>
+              <w:spacing w:after="0"/>
+            </w:pPr>
+            <w:r>
+              <w:rPr>
+                <w:rFonts w:ascii="맑은 고딕" w:cs="맑은 고딕" w:eastAsia="맑은 고딕" w:hAnsi="맑은 고딕"/>
+                <w:b w:val="false"/>
+                <w:bCs w:val="false"/>
+                <w:sz w:val="18"/>
+                <w:szCs w:val="18"/>
+              </w:rPr>
+              <w:t xml:space="preserve">[기입]</w:t>
+            </w:r>
+          </w:p>
+        </w:tc>
+      </w:tr>
+      <w:tr>
+        <w:trPr>
+          <w:tblHeader w:val="false"/>
+        </w:trPr>
+        <w:tc>
+          <w:tcPr>
+            <w:tcW w:type="dxa" w:w="1928"/>
+            <w:tcMar>
+              <w:top w:type="dxa" w:w="60"/>
+              <w:left w:type="dxa" w:w="100"/>
+              <w:bottom w:type="dxa" w:w="60"/>
+              <w:right w:type="dxa" w:w="100"/>
+            </w:tcMar>
+          </w:tcPr>
+          <w:p>
+            <w:pPr>
+              <w:spacing w:after="0"/>
+            </w:pPr>
+            <w:r>
+              <w:rPr>
+                <w:rFonts w:ascii="맑은 고딕" w:cs="맑은 고딕" w:eastAsia="맑은 고딕" w:hAnsi="맑은 고딕"/>
+                <w:b w:val="false"/>
+                <w:bCs w:val="false"/>
+                <w:sz w:val="18"/>
+                <w:szCs w:val="18"/>
+              </w:rPr>
+              <w:t xml:space="preserve">라형 비중</w:t>
+            </w:r>
+          </w:p>
+        </w:tc>
+        <w:tc>
+          <w:tcPr>
+            <w:tcW w:type="dxa" w:w="3855"/>
+            <w:tcMar>
+              <w:top w:type="dxa" w:w="60"/>
+              <w:left w:type="dxa" w:w="100"/>
+              <w:bottom w:type="dxa" w:w="60"/>
+              <w:right w:type="dxa" w:w="100"/>
+            </w:tcMar>
+          </w:tcPr>
+          <w:p>
+            <w:pPr>
+              <w:spacing w:after="0"/>
+            </w:pPr>
+            <w:r>
+              <w:rPr>
+                <w:rFonts w:ascii="맑은 고딕" w:cs="맑은 고딕" w:eastAsia="맑은 고딕" w:hAnsi="맑은 고딕"/>
+                <w:b w:val="false"/>
+                <w:bCs w:val="false"/>
+                <w:sz w:val="18"/>
+                <w:szCs w:val="18"/>
+              </w:rPr>
+              <w:t xml:space="preserve">[기입]</w:t>
+            </w:r>
+          </w:p>
+        </w:tc>
+        <w:tc>
+          <w:tcPr>
+            <w:tcW w:type="dxa" w:w="3855"/>
+            <w:tcMar>
+              <w:top w:type="dxa" w:w="60"/>
+              <w:left w:type="dxa" w:w="100"/>
+              <w:bottom w:type="dxa" w:w="60"/>
+              <w:right w:type="dxa" w:w="100"/>
+            </w:tcMar>
+          </w:tcPr>
+          <w:p>
+            <w:pPr>
+              <w:spacing w:after="0"/>
+            </w:pPr>
+            <w:r>
+              <w:rPr>
+                <w:rFonts w:ascii="맑은 고딕" w:cs="맑은 고딕" w:eastAsia="맑은 고딕" w:hAnsi="맑은 고딕"/>
+                <w:b w:val="false"/>
+                <w:bCs w:val="false"/>
+                <w:sz w:val="18"/>
+                <w:szCs w:val="18"/>
+              </w:rPr>
+              <w:t xml:space="preserve">[기입]</w:t>
+            </w:r>
+          </w:p>
+        </w:tc>
+      </w:tr>
+      <w:tr>
+        <w:trPr>
+          <w:tblHeader w:val="false"/>
+        </w:trPr>
+        <w:tc>
+          <w:tcPr>
+            <w:tcW w:type="dxa" w:w="1928"/>
+            <w:tcMar>
+              <w:top w:type="dxa" w:w="60"/>
+              <w:left w:type="dxa" w:w="100"/>
+              <w:bottom w:type="dxa" w:w="60"/>
+              <w:right w:type="dxa" w:w="100"/>
+            </w:tcMar>
+          </w:tcPr>
+          <w:p>
+            <w:pPr>
+              <w:spacing w:after="0"/>
+            </w:pPr>
+            <w:r>
+              <w:rPr>
+                <w:rFonts w:ascii="맑은 고딕" w:cs="맑은 고딕" w:eastAsia="맑은 고딕" w:hAnsi="맑은 고딕"/>
+                <w:b w:val="false"/>
+                <w:bCs w:val="false"/>
+                <w:sz w:val="18"/>
+                <w:szCs w:val="18"/>
+              </w:rPr>
+              <w:t xml:space="preserve">평균 이용 기간(일)</w:t>
+            </w:r>
+          </w:p>
+        </w:tc>
+        <w:tc>
+          <w:tcPr>
+            <w:tcW w:type="dxa" w:w="3855"/>
+            <w:tcMar>
+              <w:top w:type="dxa" w:w="60"/>
+              <w:left w:type="dxa" w:w="100"/>
+              <w:bottom w:type="dxa" w:w="60"/>
+              <w:right w:type="dxa" w:w="100"/>
+            </w:tcMar>
+          </w:tcPr>
+          <w:p>
+            <w:pPr>
+              <w:spacing w:after="0"/>
+            </w:pPr>
+            <w:r>
+              <w:rPr>
+                <w:rFonts w:ascii="맑은 고딕" w:cs="맑은 고딕" w:eastAsia="맑은 고딕" w:hAnsi="맑은 고딕"/>
+                <w:b w:val="false"/>
+                <w:bCs w:val="false"/>
+                <w:sz w:val="18"/>
+                <w:szCs w:val="18"/>
+              </w:rPr>
+              <w:t xml:space="preserve">[기입]</w:t>
+            </w:r>
+          </w:p>
+        </w:tc>
+        <w:tc>
+          <w:tcPr>
+            <w:tcW w:type="dxa" w:w="3855"/>
+            <w:tcMar>
+              <w:top w:type="dxa" w:w="60"/>
+              <w:left w:type="dxa" w:w="100"/>
+              <w:bottom w:type="dxa" w:w="60"/>
+              <w:right w:type="dxa" w:w="100"/>
+            </w:tcMar>
+          </w:tcPr>
+          <w:p>
+            <w:pPr>
+              <w:spacing w:after="0"/>
+            </w:pPr>
+            <w:r>
+              <w:rPr>
+                <w:rFonts w:ascii="맑은 고딕" w:cs="맑은 고딕" w:eastAsia="맑은 고딕" w:hAnsi="맑은 고딕"/>
+                <w:b w:val="false"/>
+                <w:bCs w:val="false"/>
+                <w:sz w:val="18"/>
+                <w:szCs w:val="18"/>
+              </w:rPr>
+              <w:t xml:space="preserve">[기입]</w:t>
+            </w:r>
+          </w:p>
+        </w:tc>
+      </w:tr>
+      <w:tr>
+        <w:trPr>
+          <w:tblHeader w:val="false"/>
+        </w:trPr>
+        <w:tc>
+          <w:tcPr>
+            <w:tcW w:type="dxa" w:w="1928"/>
+            <w:tcMar>
+              <w:top w:type="dxa" w:w="60"/>
+              <w:left w:type="dxa" w:w="100"/>
+              <w:bottom w:type="dxa" w:w="60"/>
+              <w:right w:type="dxa" w:w="100"/>
+            </w:tcMar>
+          </w:tcPr>
+          <w:p>
+            <w:pPr>
+              <w:spacing w:after="0"/>
+            </w:pPr>
+            <w:r>
+              <w:rPr>
+                <w:rFonts w:ascii="맑은 고딕" w:cs="맑은 고딕" w:eastAsia="맑은 고딕" w:hAnsi="맑은 고딕"/>
+                <w:b w:val="false"/>
+                <w:bCs w:val="false"/>
+                <w:sz w:val="18"/>
+                <w:szCs w:val="18"/>
+              </w:rPr>
+              <w:t xml:space="preserve">연장 이용 비율</w:t>
+            </w:r>
+          </w:p>
+        </w:tc>
+        <w:tc>
+          <w:tcPr>
+            <w:tcW w:type="dxa" w:w="3855"/>
+            <w:tcMar>
+              <w:top w:type="dxa" w:w="60"/>
+              <w:left w:type="dxa" w:w="100"/>
+              <w:bottom w:type="dxa" w:w="60"/>
+              <w:right w:type="dxa" w:w="100"/>
+            </w:tcMar>
+          </w:tcPr>
+          <w:p>
+            <w:pPr>
+              <w:spacing w:after="0"/>
+            </w:pPr>
+            <w:r>
+              <w:rPr>
+                <w:rFonts w:ascii="맑은 고딕" w:cs="맑은 고딕" w:eastAsia="맑은 고딕" w:hAnsi="맑은 고딕"/>
+                <w:b w:val="false"/>
+                <w:bCs w:val="false"/>
+                <w:sz w:val="18"/>
+                <w:szCs w:val="18"/>
+              </w:rPr>
+              <w:t xml:space="preserve">[기입]</w:t>
+            </w:r>
+          </w:p>
+        </w:tc>
+        <w:tc>
+          <w:tcPr>
+            <w:tcW w:type="dxa" w:w="3855"/>
+            <w:tcMar>
+              <w:top w:type="dxa" w:w="60"/>
+              <w:left w:type="dxa" w:w="100"/>
+              <w:bottom w:type="dxa" w:w="60"/>
+              <w:right w:type="dxa" w:w="100"/>
+            </w:tcMar>
+          </w:tcPr>
+          <w:p>
+            <w:pPr>
+              <w:spacing w:after="0"/>
+            </w:pPr>
+            <w:r>
+              <w:rPr>
+                <w:rFonts w:ascii="맑은 고딕" w:cs="맑은 고딕" w:eastAsia="맑은 고딕" w:hAnsi="맑은 고딕"/>
+                <w:b w:val="false"/>
+                <w:bCs w:val="false"/>
+                <w:sz w:val="18"/>
+                <w:szCs w:val="18"/>
+              </w:rPr>
+              <w:t xml:space="preserve">[기입]</w:t>
+            </w:r>
+          </w:p>
+        </w:tc>
+      </w:tr>
+    </w:tbl>
+    <w:p>
+      <w:pPr>
+        <w:spacing w:after="80"/>
+      </w:pPr>
+    </w:p>
+    <w:p>
+      <w:pPr>
+        <w:pBdr>
+          <w:bottom w:val="single" w:color="BBBBBB" w:sz="6" w:space="1"/>
+        </w:pBdr>
+        <w:spacing w:after="120" w:before="120"/>
+      </w:pPr>
+    </w:p>
+    <w:p>
+      <w:r>
+        <w:br w:type="page"/>
+      </w:r>
+    </w:p>
+    <w:p>
+      <w:pPr>
+        <w:pStyle w:val="Heading1"/>
+        <w:shd w:fill="E8EEF7" w:color="auto" w:val="clear"/>
+        <w:spacing w:after="160" w:before="240"/>
+      </w:pPr>
+      <w:r>
+        <w:rPr>
+          <w:rFonts w:ascii="맑은 고딕" w:cs="맑은 고딕" w:eastAsia="맑은 고딕" w:hAnsi="맑은 고딕"/>
+          <w:b/>
+          <w:bCs/>
+          <w:color w:val="1F3864"/>
+          <w:sz w:val="28"/>
+          <w:szCs w:val="28"/>
+        </w:rPr>
+        <w:t xml:space="preserve">부록 B. 참고 자료(출처)</w:t>
       </w:r>
     </w:p>
     <w:p>

</xml_diff>

<commit_message>
Add voucher utilization estimates from Gyeonggi and national statistics
Co-Authored-By: Claude Fable 5.1 <noreply@anthropic.com>
Claude-Session: https://claude.ai/code/session_01YQpD7bdbUWBdDGpeeL147H
</commit_message>
<xml_diff>
--- a/meetings/2026-09-19-관리사-정기회의-자료.docx
+++ b/meetings/2026-09-19-관리사-정기회의-자료.docx
@@ -2082,7 +2082,1067 @@
           <w:sz w:val="23"/>
           <w:szCs w:val="23"/>
         </w:rPr>
-        <w:t xml:space="preserve">2-2. 바우처 서비스 이용률 (내부 자료)</w:t>
+        <w:t xml:space="preserve">2-2. 바우처 서비스 이용률</w:t>
+      </w:r>
+    </w:p>
+    <w:p>
+      <w:pPr>
+        <w:spacing w:after="100"/>
+      </w:pPr>
+      <w:r>
+        <w:rPr>
+          <w:rFonts w:ascii="맑은 고딕" w:cs="맑은 고딕" w:eastAsia="맑은 고딕" w:hAnsi="맑은 고딕"/>
+          <w:b/>
+          <w:bCs/>
+          <w:sz w:val="20"/>
+          <w:szCs w:val="20"/>
+        </w:rPr>
+        <w:t xml:space="preserve">공공 통계로 본 이용률 (출생아 수 대비 지원 인원, 계산치)</w:t>
+      </w:r>
+    </w:p>
+    <w:tbl>
+      <w:tblPr>
+        <w:tblW w:type="dxa" w:w="9638"/>
+        <w:tblBorders>
+          <w:top w:val="single" w:color="auto" w:sz="4"/>
+          <w:left w:val="single" w:color="auto" w:sz="4"/>
+          <w:bottom w:val="single" w:color="auto" w:sz="4"/>
+          <w:right w:val="single" w:color="auto" w:sz="4"/>
+          <w:insideH w:val="single" w:color="auto" w:sz="4"/>
+          <w:insideV w:val="single" w:color="auto" w:sz="4"/>
+        </w:tblBorders>
+        <w:tblLayout w:type="fixed"/>
+      </w:tblPr>
+      <w:tblGrid>
+        <w:gridCol w:w="1928"/>
+        <w:gridCol w:w="1927"/>
+        <w:gridCol w:w="1927"/>
+        <w:gridCol w:w="1927"/>
+        <w:gridCol w:w="1929"/>
+      </w:tblGrid>
+      <w:tr>
+        <w:trPr>
+          <w:tblHeader/>
+        </w:trPr>
+        <w:tc>
+          <w:tcPr>
+            <w:tcW w:type="dxa" w:w="1928"/>
+            <w:shd w:fill="D9E2F3" w:color="auto" w:val="clear"/>
+            <w:tcMar>
+              <w:top w:type="dxa" w:w="60"/>
+              <w:left w:type="dxa" w:w="100"/>
+              <w:bottom w:type="dxa" w:w="60"/>
+              <w:right w:type="dxa" w:w="100"/>
+            </w:tcMar>
+          </w:tcPr>
+          <w:p>
+            <w:pPr>
+              <w:spacing w:after="0"/>
+            </w:pPr>
+            <w:r>
+              <w:rPr>
+                <w:rFonts w:ascii="맑은 고딕" w:cs="맑은 고딕" w:eastAsia="맑은 고딕" w:hAnsi="맑은 고딕"/>
+                <w:b/>
+                <w:bCs/>
+                <w:sz w:val="18"/>
+                <w:szCs w:val="18"/>
+              </w:rPr>
+              <w:t xml:space="preserve">구분</w:t>
+            </w:r>
+          </w:p>
+        </w:tc>
+        <w:tc>
+          <w:tcPr>
+            <w:tcW w:type="dxa" w:w="1927"/>
+            <w:shd w:fill="D9E2F3" w:color="auto" w:val="clear"/>
+            <w:tcMar>
+              <w:top w:type="dxa" w:w="60"/>
+              <w:left w:type="dxa" w:w="100"/>
+              <w:bottom w:type="dxa" w:w="60"/>
+              <w:right w:type="dxa" w:w="100"/>
+            </w:tcMar>
+          </w:tcPr>
+          <w:p>
+            <w:pPr>
+              <w:spacing w:after="0"/>
+            </w:pPr>
+            <w:r>
+              <w:rPr>
+                <w:rFonts w:ascii="맑은 고딕" w:cs="맑은 고딕" w:eastAsia="맑은 고딕" w:hAnsi="맑은 고딕"/>
+                <w:b/>
+                <w:bCs/>
+                <w:sz w:val="18"/>
+                <w:szCs w:val="18"/>
+              </w:rPr>
+              <w:t xml:space="preserve">지원 인원</w:t>
+            </w:r>
+          </w:p>
+        </w:tc>
+        <w:tc>
+          <w:tcPr>
+            <w:tcW w:type="dxa" w:w="1927"/>
+            <w:shd w:fill="D9E2F3" w:color="auto" w:val="clear"/>
+            <w:tcMar>
+              <w:top w:type="dxa" w:w="60"/>
+              <w:left w:type="dxa" w:w="100"/>
+              <w:bottom w:type="dxa" w:w="60"/>
+              <w:right w:type="dxa" w:w="100"/>
+            </w:tcMar>
+          </w:tcPr>
+          <w:p>
+            <w:pPr>
+              <w:spacing w:after="0"/>
+            </w:pPr>
+            <w:r>
+              <w:rPr>
+                <w:rFonts w:ascii="맑은 고딕" w:cs="맑은 고딕" w:eastAsia="맑은 고딕" w:hAnsi="맑은 고딕"/>
+                <w:b/>
+                <w:bCs/>
+                <w:sz w:val="18"/>
+                <w:szCs w:val="18"/>
+              </w:rPr>
+              <w:t xml:space="preserve">출생아 수</w:t>
+            </w:r>
+          </w:p>
+        </w:tc>
+        <w:tc>
+          <w:tcPr>
+            <w:tcW w:type="dxa" w:w="1927"/>
+            <w:shd w:fill="D9E2F3" w:color="auto" w:val="clear"/>
+            <w:tcMar>
+              <w:top w:type="dxa" w:w="60"/>
+              <w:left w:type="dxa" w:w="100"/>
+              <w:bottom w:type="dxa" w:w="60"/>
+              <w:right w:type="dxa" w:w="100"/>
+            </w:tcMar>
+          </w:tcPr>
+          <w:p>
+            <w:pPr>
+              <w:spacing w:after="0"/>
+            </w:pPr>
+            <w:r>
+              <w:rPr>
+                <w:rFonts w:ascii="맑은 고딕" w:cs="맑은 고딕" w:eastAsia="맑은 고딕" w:hAnsi="맑은 고딕"/>
+                <w:b/>
+                <w:bCs/>
+                <w:sz w:val="18"/>
+                <w:szCs w:val="18"/>
+              </w:rPr>
+              <w:t xml:space="preserve">이용률(계산)</w:t>
+            </w:r>
+          </w:p>
+        </w:tc>
+        <w:tc>
+          <w:tcPr>
+            <w:tcW w:type="dxa" w:w="1929"/>
+            <w:shd w:fill="D9E2F3" w:color="auto" w:val="clear"/>
+            <w:tcMar>
+              <w:top w:type="dxa" w:w="60"/>
+              <w:left w:type="dxa" w:w="100"/>
+              <w:bottom w:type="dxa" w:w="60"/>
+              <w:right w:type="dxa" w:w="100"/>
+            </w:tcMar>
+          </w:tcPr>
+          <w:p>
+            <w:pPr>
+              <w:spacing w:after="0"/>
+            </w:pPr>
+            <w:r>
+              <w:rPr>
+                <w:rFonts w:ascii="맑은 고딕" w:cs="맑은 고딕" w:eastAsia="맑은 고딕" w:hAnsi="맑은 고딕"/>
+                <w:b/>
+                <w:bCs/>
+                <w:sz w:val="18"/>
+                <w:szCs w:val="18"/>
+              </w:rPr>
+              <w:t xml:space="preserve">비고</w:t>
+            </w:r>
+          </w:p>
+        </w:tc>
+      </w:tr>
+      <w:tr>
+        <w:trPr>
+          <w:tblHeader w:val="false"/>
+        </w:trPr>
+        <w:tc>
+          <w:tcPr>
+            <w:tcW w:type="dxa" w:w="1928"/>
+            <w:tcMar>
+              <w:top w:type="dxa" w:w="60"/>
+              <w:left w:type="dxa" w:w="100"/>
+              <w:bottom w:type="dxa" w:w="60"/>
+              <w:right w:type="dxa" w:w="100"/>
+            </w:tcMar>
+          </w:tcPr>
+          <w:p>
+            <w:pPr>
+              <w:spacing w:after="0"/>
+            </w:pPr>
+            <w:r>
+              <w:rPr>
+                <w:rFonts w:ascii="맑은 고딕" w:cs="맑은 고딕" w:eastAsia="맑은 고딕" w:hAnsi="맑은 고딕"/>
+                <w:b w:val="false"/>
+                <w:bCs w:val="false"/>
+                <w:sz w:val="18"/>
+                <w:szCs w:val="18"/>
+              </w:rPr>
+              <w:t xml:space="preserve">경기도 2024년</w:t>
+            </w:r>
+          </w:p>
+        </w:tc>
+        <w:tc>
+          <w:tcPr>
+            <w:tcW w:type="dxa" w:w="1927"/>
+            <w:tcMar>
+              <w:top w:type="dxa" w:w="60"/>
+              <w:left w:type="dxa" w:w="100"/>
+              <w:bottom w:type="dxa" w:w="60"/>
+              <w:right w:type="dxa" w:w="100"/>
+            </w:tcMar>
+          </w:tcPr>
+          <w:p>
+            <w:pPr>
+              <w:spacing w:after="0"/>
+            </w:pPr>
+            <w:r>
+              <w:rPr>
+                <w:rFonts w:ascii="맑은 고딕" w:cs="맑은 고딕" w:eastAsia="맑은 고딕" w:hAnsi="맑은 고딕"/>
+                <w:b w:val="false"/>
+                <w:bCs w:val="false"/>
+                <w:sz w:val="18"/>
+                <w:szCs w:val="18"/>
+              </w:rPr>
+              <w:t xml:space="preserve">51,113명</w:t>
+            </w:r>
+          </w:p>
+        </w:tc>
+        <w:tc>
+          <w:tcPr>
+            <w:tcW w:type="dxa" w:w="1927"/>
+            <w:tcMar>
+              <w:top w:type="dxa" w:w="60"/>
+              <w:left w:type="dxa" w:w="100"/>
+              <w:bottom w:type="dxa" w:w="60"/>
+              <w:right w:type="dxa" w:w="100"/>
+            </w:tcMar>
+          </w:tcPr>
+          <w:p>
+            <w:pPr>
+              <w:spacing w:after="0"/>
+            </w:pPr>
+            <w:r>
+              <w:rPr>
+                <w:rFonts w:ascii="맑은 고딕" w:cs="맑은 고딕" w:eastAsia="맑은 고딕" w:hAnsi="맑은 고딕"/>
+                <w:b w:val="false"/>
+                <w:bCs w:val="false"/>
+                <w:sz w:val="18"/>
+                <w:szCs w:val="18"/>
+              </w:rPr>
+              <w:t xml:space="preserve">71,300명</w:t>
+            </w:r>
+          </w:p>
+        </w:tc>
+        <w:tc>
+          <w:tcPr>
+            <w:tcW w:type="dxa" w:w="1927"/>
+            <w:tcMar>
+              <w:top w:type="dxa" w:w="60"/>
+              <w:left w:type="dxa" w:w="100"/>
+              <w:bottom w:type="dxa" w:w="60"/>
+              <w:right w:type="dxa" w:w="100"/>
+            </w:tcMar>
+          </w:tcPr>
+          <w:p>
+            <w:pPr>
+              <w:spacing w:after="0"/>
+            </w:pPr>
+            <w:r>
+              <w:rPr>
+                <w:rFonts w:ascii="맑은 고딕" w:cs="맑은 고딕" w:eastAsia="맑은 고딕" w:hAnsi="맑은 고딕"/>
+                <w:b w:val="false"/>
+                <w:bCs w:val="false"/>
+                <w:sz w:val="18"/>
+                <w:szCs w:val="18"/>
+              </w:rPr>
+              <w:t xml:space="preserve">약 72%</w:t>
+            </w:r>
+          </w:p>
+        </w:tc>
+        <w:tc>
+          <w:tcPr>
+            <w:tcW w:type="dxa" w:w="1929"/>
+            <w:tcMar>
+              <w:top w:type="dxa" w:w="60"/>
+              <w:left w:type="dxa" w:w="100"/>
+              <w:bottom w:type="dxa" w:w="60"/>
+              <w:right w:type="dxa" w:w="100"/>
+            </w:tcMar>
+          </w:tcPr>
+          <w:p>
+            <w:pPr>
+              <w:spacing w:after="0"/>
+            </w:pPr>
+            <w:r>
+              <w:rPr>
+                <w:rFonts w:ascii="맑은 고딕" w:cs="맑은 고딕" w:eastAsia="맑은 고딕" w:hAnsi="맑은 고딕"/>
+                <w:b w:val="false"/>
+                <w:bCs w:val="false"/>
+                <w:sz w:val="18"/>
+                <w:szCs w:val="18"/>
+              </w:rPr>
+              <w:t xml:space="preserve">도 예산 619억원</w:t>
+            </w:r>
+          </w:p>
+        </w:tc>
+      </w:tr>
+      <w:tr>
+        <w:trPr>
+          <w:tblHeader w:val="false"/>
+        </w:trPr>
+        <w:tc>
+          <w:tcPr>
+            <w:tcW w:type="dxa" w:w="1928"/>
+            <w:tcMar>
+              <w:top w:type="dxa" w:w="60"/>
+              <w:left w:type="dxa" w:w="100"/>
+              <w:bottom w:type="dxa" w:w="60"/>
+              <w:right w:type="dxa" w:w="100"/>
+            </w:tcMar>
+          </w:tcPr>
+          <w:p>
+            <w:pPr>
+              <w:spacing w:after="0"/>
+            </w:pPr>
+            <w:r>
+              <w:rPr>
+                <w:rFonts w:ascii="맑은 고딕" w:cs="맑은 고딕" w:eastAsia="맑은 고딕" w:hAnsi="맑은 고딕"/>
+                <w:b w:val="false"/>
+                <w:bCs w:val="false"/>
+                <w:sz w:val="18"/>
+                <w:szCs w:val="18"/>
+              </w:rPr>
+              <w:t xml:space="preserve">경기도 2025년 상반기</w:t>
+            </w:r>
+          </w:p>
+        </w:tc>
+        <w:tc>
+          <w:tcPr>
+            <w:tcW w:type="dxa" w:w="1927"/>
+            <w:tcMar>
+              <w:top w:type="dxa" w:w="60"/>
+              <w:left w:type="dxa" w:w="100"/>
+              <w:bottom w:type="dxa" w:w="60"/>
+              <w:right w:type="dxa" w:w="100"/>
+            </w:tcMar>
+          </w:tcPr>
+          <w:p>
+            <w:pPr>
+              <w:spacing w:after="0"/>
+            </w:pPr>
+            <w:r>
+              <w:rPr>
+                <w:rFonts w:ascii="맑은 고딕" w:cs="맑은 고딕" w:eastAsia="맑은 고딕" w:hAnsi="맑은 고딕"/>
+                <w:b w:val="false"/>
+                <w:bCs w:val="false"/>
+                <w:sz w:val="18"/>
+                <w:szCs w:val="18"/>
+              </w:rPr>
+              <w:t xml:space="preserve">31,786명</w:t>
+            </w:r>
+          </w:p>
+        </w:tc>
+        <w:tc>
+          <w:tcPr>
+            <w:tcW w:type="dxa" w:w="1927"/>
+            <w:tcMar>
+              <w:top w:type="dxa" w:w="60"/>
+              <w:left w:type="dxa" w:w="100"/>
+              <w:bottom w:type="dxa" w:w="60"/>
+              <w:right w:type="dxa" w:w="100"/>
+            </w:tcMar>
+          </w:tcPr>
+          <w:p>
+            <w:pPr>
+              <w:spacing w:after="0"/>
+            </w:pPr>
+            <w:r>
+              <w:rPr>
+                <w:rFonts w:ascii="맑은 고딕" w:cs="맑은 고딕" w:eastAsia="맑은 고딕" w:hAnsi="맑은 고딕"/>
+                <w:b w:val="false"/>
+                <w:bCs w:val="false"/>
+                <w:sz w:val="18"/>
+                <w:szCs w:val="18"/>
+              </w:rPr>
+              <w:t xml:space="preserve">44,368명</w:t>
+            </w:r>
+          </w:p>
+        </w:tc>
+        <w:tc>
+          <w:tcPr>
+            <w:tcW w:type="dxa" w:w="1927"/>
+            <w:tcMar>
+              <w:top w:type="dxa" w:w="60"/>
+              <w:left w:type="dxa" w:w="100"/>
+              <w:bottom w:type="dxa" w:w="60"/>
+              <w:right w:type="dxa" w:w="100"/>
+            </w:tcMar>
+          </w:tcPr>
+          <w:p>
+            <w:pPr>
+              <w:spacing w:after="0"/>
+            </w:pPr>
+            <w:r>
+              <w:rPr>
+                <w:rFonts w:ascii="맑은 고딕" w:cs="맑은 고딕" w:eastAsia="맑은 고딕" w:hAnsi="맑은 고딕"/>
+                <w:b w:val="false"/>
+                <w:bCs w:val="false"/>
+                <w:sz w:val="18"/>
+                <w:szCs w:val="18"/>
+              </w:rPr>
+              <w:t xml:space="preserve">약 72%</w:t>
+            </w:r>
+          </w:p>
+        </w:tc>
+        <w:tc>
+          <w:tcPr>
+            <w:tcW w:type="dxa" w:w="1929"/>
+            <w:tcMar>
+              <w:top w:type="dxa" w:w="60"/>
+              <w:left w:type="dxa" w:w="100"/>
+              <w:bottom w:type="dxa" w:w="60"/>
+              <w:right w:type="dxa" w:w="100"/>
+            </w:tcMar>
+          </w:tcPr>
+          <w:p>
+            <w:pPr>
+              <w:spacing w:after="0"/>
+            </w:pPr>
+            <w:r>
+              <w:rPr>
+                <w:rFonts w:ascii="맑은 고딕" w:cs="맑은 고딕" w:eastAsia="맑은 고딕" w:hAnsi="맑은 고딕"/>
+                <w:b w:val="false"/>
+                <w:bCs w:val="false"/>
+                <w:sz w:val="18"/>
+                <w:szCs w:val="18"/>
+              </w:rPr>
+              <w:t xml:space="preserve">2025년 도 예산 970억원. 상반기 출생아는 전년 동기 대비 +16.3%</w:t>
+            </w:r>
+          </w:p>
+        </w:tc>
+      </w:tr>
+      <w:tr>
+        <w:trPr>
+          <w:tblHeader w:val="false"/>
+        </w:trPr>
+        <w:tc>
+          <w:tcPr>
+            <w:tcW w:type="dxa" w:w="1928"/>
+            <w:tcMar>
+              <w:top w:type="dxa" w:w="60"/>
+              <w:left w:type="dxa" w:w="100"/>
+              <w:bottom w:type="dxa" w:w="60"/>
+              <w:right w:type="dxa" w:w="100"/>
+            </w:tcMar>
+          </w:tcPr>
+          <w:p>
+            <w:pPr>
+              <w:spacing w:after="0"/>
+            </w:pPr>
+            <w:r>
+              <w:rPr>
+                <w:rFonts w:ascii="맑은 고딕" w:cs="맑은 고딕" w:eastAsia="맑은 고딕" w:hAnsi="맑은 고딕"/>
+                <w:b w:val="false"/>
+                <w:bCs w:val="false"/>
+                <w:sz w:val="18"/>
+                <w:szCs w:val="18"/>
+              </w:rPr>
+              <w:t xml:space="preserve">전국 2019년</w:t>
+            </w:r>
+          </w:p>
+        </w:tc>
+        <w:tc>
+          <w:tcPr>
+            <w:tcW w:type="dxa" w:w="1927"/>
+            <w:tcMar>
+              <w:top w:type="dxa" w:w="60"/>
+              <w:left w:type="dxa" w:w="100"/>
+              <w:bottom w:type="dxa" w:w="60"/>
+              <w:right w:type="dxa" w:w="100"/>
+            </w:tcMar>
+          </w:tcPr>
+          <w:p>
+            <w:pPr>
+              <w:spacing w:after="0"/>
+            </w:pPr>
+            <w:r>
+              <w:rPr>
+                <w:rFonts w:ascii="맑은 고딕" w:cs="맑은 고딕" w:eastAsia="맑은 고딕" w:hAnsi="맑은 고딕"/>
+                <w:b w:val="false"/>
+                <w:bCs w:val="false"/>
+                <w:sz w:val="18"/>
+                <w:szCs w:val="18"/>
+              </w:rPr>
+              <w:t xml:space="preserve">136,364가구</w:t>
+            </w:r>
+          </w:p>
+        </w:tc>
+        <w:tc>
+          <w:tcPr>
+            <w:tcW w:type="dxa" w:w="1927"/>
+            <w:tcMar>
+              <w:top w:type="dxa" w:w="60"/>
+              <w:left w:type="dxa" w:w="100"/>
+              <w:bottom w:type="dxa" w:w="60"/>
+              <w:right w:type="dxa" w:w="100"/>
+            </w:tcMar>
+          </w:tcPr>
+          <w:p>
+            <w:pPr>
+              <w:spacing w:after="0"/>
+            </w:pPr>
+            <w:r>
+              <w:rPr>
+                <w:rFonts w:ascii="맑은 고딕" w:cs="맑은 고딕" w:eastAsia="맑은 고딕" w:hAnsi="맑은 고딕"/>
+                <w:b w:val="false"/>
+                <w:bCs w:val="false"/>
+                <w:sz w:val="18"/>
+                <w:szCs w:val="18"/>
+              </w:rPr>
+              <w:t xml:space="preserve">302,676명</w:t>
+            </w:r>
+          </w:p>
+        </w:tc>
+        <w:tc>
+          <w:tcPr>
+            <w:tcW w:type="dxa" w:w="1927"/>
+            <w:tcMar>
+              <w:top w:type="dxa" w:w="60"/>
+              <w:left w:type="dxa" w:w="100"/>
+              <w:bottom w:type="dxa" w:w="60"/>
+              <w:right w:type="dxa" w:w="100"/>
+            </w:tcMar>
+          </w:tcPr>
+          <w:p>
+            <w:pPr>
+              <w:spacing w:after="0"/>
+            </w:pPr>
+            <w:r>
+              <w:rPr>
+                <w:rFonts w:ascii="맑은 고딕" w:cs="맑은 고딕" w:eastAsia="맑은 고딕" w:hAnsi="맑은 고딕"/>
+                <w:b w:val="false"/>
+                <w:bCs w:val="false"/>
+                <w:sz w:val="18"/>
+                <w:szCs w:val="18"/>
+              </w:rPr>
+              <w:t xml:space="preserve">약 45%</w:t>
+            </w:r>
+          </w:p>
+        </w:tc>
+        <w:tc>
+          <w:tcPr>
+            <w:tcW w:type="dxa" w:w="1929"/>
+            <w:tcMar>
+              <w:top w:type="dxa" w:w="60"/>
+              <w:left w:type="dxa" w:w="100"/>
+              <w:bottom w:type="dxa" w:w="60"/>
+              <w:right w:type="dxa" w:w="100"/>
+            </w:tcMar>
+          </w:tcPr>
+          <w:p>
+            <w:pPr>
+              <w:spacing w:after="0"/>
+            </w:pPr>
+            <w:r>
+              <w:rPr>
+                <w:rFonts w:ascii="맑은 고딕" w:cs="맑은 고딕" w:eastAsia="맑은 고딕" w:hAnsi="맑은 고딕"/>
+                <w:b w:val="false"/>
+                <w:bCs w:val="false"/>
+                <w:sz w:val="18"/>
+                <w:szCs w:val="18"/>
+              </w:rPr>
+              <w:t xml:space="preserve">육아정책연구소 보고서(2022)</w:t>
+            </w:r>
+          </w:p>
+        </w:tc>
+      </w:tr>
+      <w:tr>
+        <w:trPr>
+          <w:tblHeader w:val="false"/>
+        </w:trPr>
+        <w:tc>
+          <w:tcPr>
+            <w:tcW w:type="dxa" w:w="1928"/>
+            <w:tcMar>
+              <w:top w:type="dxa" w:w="60"/>
+              <w:left w:type="dxa" w:w="100"/>
+              <w:bottom w:type="dxa" w:w="60"/>
+              <w:right w:type="dxa" w:w="100"/>
+            </w:tcMar>
+          </w:tcPr>
+          <w:p>
+            <w:pPr>
+              <w:spacing w:after="0"/>
+            </w:pPr>
+            <w:r>
+              <w:rPr>
+                <w:rFonts w:ascii="맑은 고딕" w:cs="맑은 고딕" w:eastAsia="맑은 고딕" w:hAnsi="맑은 고딕"/>
+                <w:b w:val="false"/>
+                <w:bCs w:val="false"/>
+                <w:sz w:val="18"/>
+                <w:szCs w:val="18"/>
+              </w:rPr>
+              <w:t xml:space="preserve">전국 2020년</w:t>
+            </w:r>
+          </w:p>
+        </w:tc>
+        <w:tc>
+          <w:tcPr>
+            <w:tcW w:type="dxa" w:w="1927"/>
+            <w:tcMar>
+              <w:top w:type="dxa" w:w="60"/>
+              <w:left w:type="dxa" w:w="100"/>
+              <w:bottom w:type="dxa" w:w="60"/>
+              <w:right w:type="dxa" w:w="100"/>
+            </w:tcMar>
+          </w:tcPr>
+          <w:p>
+            <w:pPr>
+              <w:spacing w:after="0"/>
+            </w:pPr>
+            <w:r>
+              <w:rPr>
+                <w:rFonts w:ascii="맑은 고딕" w:cs="맑은 고딕" w:eastAsia="맑은 고딕" w:hAnsi="맑은 고딕"/>
+                <w:b w:val="false"/>
+                <w:bCs w:val="false"/>
+                <w:sz w:val="18"/>
+                <w:szCs w:val="18"/>
+              </w:rPr>
+              <w:t xml:space="preserve">114,192가구</w:t>
+            </w:r>
+          </w:p>
+        </w:tc>
+        <w:tc>
+          <w:tcPr>
+            <w:tcW w:type="dxa" w:w="1927"/>
+            <w:tcMar>
+              <w:top w:type="dxa" w:w="60"/>
+              <w:left w:type="dxa" w:w="100"/>
+              <w:bottom w:type="dxa" w:w="60"/>
+              <w:right w:type="dxa" w:w="100"/>
+            </w:tcMar>
+          </w:tcPr>
+          <w:p>
+            <w:pPr>
+              <w:spacing w:after="0"/>
+            </w:pPr>
+            <w:r>
+              <w:rPr>
+                <w:rFonts w:ascii="맑은 고딕" w:cs="맑은 고딕" w:eastAsia="맑은 고딕" w:hAnsi="맑은 고딕"/>
+                <w:b w:val="false"/>
+                <w:bCs w:val="false"/>
+                <w:sz w:val="18"/>
+                <w:szCs w:val="18"/>
+              </w:rPr>
+              <w:t xml:space="preserve">272,337명</w:t>
+            </w:r>
+          </w:p>
+        </w:tc>
+        <w:tc>
+          <w:tcPr>
+            <w:tcW w:type="dxa" w:w="1927"/>
+            <w:tcMar>
+              <w:top w:type="dxa" w:w="60"/>
+              <w:left w:type="dxa" w:w="100"/>
+              <w:bottom w:type="dxa" w:w="60"/>
+              <w:right w:type="dxa" w:w="100"/>
+            </w:tcMar>
+          </w:tcPr>
+          <w:p>
+            <w:pPr>
+              <w:spacing w:after="0"/>
+            </w:pPr>
+            <w:r>
+              <w:rPr>
+                <w:rFonts w:ascii="맑은 고딕" w:cs="맑은 고딕" w:eastAsia="맑은 고딕" w:hAnsi="맑은 고딕"/>
+                <w:b w:val="false"/>
+                <w:bCs w:val="false"/>
+                <w:sz w:val="18"/>
+                <w:szCs w:val="18"/>
+              </w:rPr>
+              <w:t xml:space="preserve">약 42%</w:t>
+            </w:r>
+          </w:p>
+        </w:tc>
+        <w:tc>
+          <w:tcPr>
+            <w:tcW w:type="dxa" w:w="1929"/>
+            <w:tcMar>
+              <w:top w:type="dxa" w:w="60"/>
+              <w:left w:type="dxa" w:w="100"/>
+              <w:bottom w:type="dxa" w:w="60"/>
+              <w:right w:type="dxa" w:w="100"/>
+            </w:tcMar>
+          </w:tcPr>
+          <w:p>
+            <w:pPr>
+              <w:spacing w:after="0"/>
+            </w:pPr>
+            <w:r>
+              <w:rPr>
+                <w:rFonts w:ascii="맑은 고딕" w:cs="맑은 고딕" w:eastAsia="맑은 고딕" w:hAnsi="맑은 고딕"/>
+                <w:b w:val="false"/>
+                <w:bCs w:val="false"/>
+                <w:sz w:val="18"/>
+                <w:szCs w:val="18"/>
+              </w:rPr>
+              <w:t xml:space="preserve">같은 자료</w:t>
+            </w:r>
+          </w:p>
+        </w:tc>
+      </w:tr>
+      <w:tr>
+        <w:trPr>
+          <w:tblHeader w:val="false"/>
+        </w:trPr>
+        <w:tc>
+          <w:tcPr>
+            <w:tcW w:type="dxa" w:w="1928"/>
+            <w:tcMar>
+              <w:top w:type="dxa" w:w="60"/>
+              <w:left w:type="dxa" w:w="100"/>
+              <w:bottom w:type="dxa" w:w="60"/>
+              <w:right w:type="dxa" w:w="100"/>
+            </w:tcMar>
+          </w:tcPr>
+          <w:p>
+            <w:pPr>
+              <w:spacing w:after="0"/>
+            </w:pPr>
+            <w:r>
+              <w:rPr>
+                <w:rFonts w:ascii="맑은 고딕" w:cs="맑은 고딕" w:eastAsia="맑은 고딕" w:hAnsi="맑은 고딕"/>
+                <w:b w:val="false"/>
+                <w:bCs w:val="false"/>
+                <w:sz w:val="18"/>
+                <w:szCs w:val="18"/>
+              </w:rPr>
+              <w:t xml:space="preserve">전국 2021년</w:t>
+            </w:r>
+          </w:p>
+        </w:tc>
+        <w:tc>
+          <w:tcPr>
+            <w:tcW w:type="dxa" w:w="1927"/>
+            <w:tcMar>
+              <w:top w:type="dxa" w:w="60"/>
+              <w:left w:type="dxa" w:w="100"/>
+              <w:bottom w:type="dxa" w:w="60"/>
+              <w:right w:type="dxa" w:w="100"/>
+            </w:tcMar>
+          </w:tcPr>
+          <w:p>
+            <w:pPr>
+              <w:spacing w:after="0"/>
+            </w:pPr>
+            <w:r>
+              <w:rPr>
+                <w:rFonts w:ascii="맑은 고딕" w:cs="맑은 고딕" w:eastAsia="맑은 고딕" w:hAnsi="맑은 고딕"/>
+                <w:b w:val="false"/>
+                <w:bCs w:val="false"/>
+                <w:sz w:val="18"/>
+                <w:szCs w:val="18"/>
+              </w:rPr>
+              <w:t xml:space="preserve">125,675가구</w:t>
+            </w:r>
+          </w:p>
+        </w:tc>
+        <w:tc>
+          <w:tcPr>
+            <w:tcW w:type="dxa" w:w="1927"/>
+            <w:tcMar>
+              <w:top w:type="dxa" w:w="60"/>
+              <w:left w:type="dxa" w:w="100"/>
+              <w:bottom w:type="dxa" w:w="60"/>
+              <w:right w:type="dxa" w:w="100"/>
+            </w:tcMar>
+          </w:tcPr>
+          <w:p>
+            <w:pPr>
+              <w:spacing w:after="0"/>
+            </w:pPr>
+            <w:r>
+              <w:rPr>
+                <w:rFonts w:ascii="맑은 고딕" w:cs="맑은 고딕" w:eastAsia="맑은 고딕" w:hAnsi="맑은 고딕"/>
+                <w:b w:val="false"/>
+                <w:bCs w:val="false"/>
+                <w:sz w:val="18"/>
+                <w:szCs w:val="18"/>
+              </w:rPr>
+              <w:t xml:space="preserve">260,562명</w:t>
+            </w:r>
+          </w:p>
+        </w:tc>
+        <w:tc>
+          <w:tcPr>
+            <w:tcW w:type="dxa" w:w="1927"/>
+            <w:tcMar>
+              <w:top w:type="dxa" w:w="60"/>
+              <w:left w:type="dxa" w:w="100"/>
+              <w:bottom w:type="dxa" w:w="60"/>
+              <w:right w:type="dxa" w:w="100"/>
+            </w:tcMar>
+          </w:tcPr>
+          <w:p>
+            <w:pPr>
+              <w:spacing w:after="0"/>
+            </w:pPr>
+            <w:r>
+              <w:rPr>
+                <w:rFonts w:ascii="맑은 고딕" w:cs="맑은 고딕" w:eastAsia="맑은 고딕" w:hAnsi="맑은 고딕"/>
+                <w:b w:val="false"/>
+                <w:bCs w:val="false"/>
+                <w:sz w:val="18"/>
+                <w:szCs w:val="18"/>
+              </w:rPr>
+              <w:t xml:space="preserve">약 48%</w:t>
+            </w:r>
+          </w:p>
+        </w:tc>
+        <w:tc>
+          <w:tcPr>
+            <w:tcW w:type="dxa" w:w="1929"/>
+            <w:tcMar>
+              <w:top w:type="dxa" w:w="60"/>
+              <w:left w:type="dxa" w:w="100"/>
+              <w:bottom w:type="dxa" w:w="60"/>
+              <w:right w:type="dxa" w:w="100"/>
+            </w:tcMar>
+          </w:tcPr>
+          <w:p>
+            <w:pPr>
+              <w:spacing w:after="0"/>
+            </w:pPr>
+            <w:r>
+              <w:rPr>
+                <w:rFonts w:ascii="맑은 고딕" w:cs="맑은 고딕" w:eastAsia="맑은 고딕" w:hAnsi="맑은 고딕"/>
+                <w:b w:val="false"/>
+                <w:bCs w:val="false"/>
+                <w:sz w:val="18"/>
+                <w:szCs w:val="18"/>
+              </w:rPr>
+              <w:t xml:space="preserve">같은 자료</w:t>
+            </w:r>
+          </w:p>
+        </w:tc>
+      </w:tr>
+      <w:tr>
+        <w:trPr>
+          <w:tblHeader w:val="false"/>
+        </w:trPr>
+        <w:tc>
+          <w:tcPr>
+            <w:tcW w:type="dxa" w:w="1928"/>
+            <w:tcMar>
+              <w:top w:type="dxa" w:w="60"/>
+              <w:left w:type="dxa" w:w="100"/>
+              <w:bottom w:type="dxa" w:w="60"/>
+              <w:right w:type="dxa" w:w="100"/>
+            </w:tcMar>
+          </w:tcPr>
+          <w:p>
+            <w:pPr>
+              <w:spacing w:after="0"/>
+            </w:pPr>
+            <w:r>
+              <w:rPr>
+                <w:rFonts w:ascii="맑은 고딕" w:cs="맑은 고딕" w:eastAsia="맑은 고딕" w:hAnsi="맑은 고딕"/>
+                <w:b w:val="false"/>
+                <w:bCs w:val="false"/>
+                <w:sz w:val="18"/>
+                <w:szCs w:val="18"/>
+              </w:rPr>
+              <w:t xml:space="preserve">김포시 2025년</w:t>
+            </w:r>
+          </w:p>
+        </w:tc>
+        <w:tc>
+          <w:tcPr>
+            <w:tcW w:type="dxa" w:w="1927"/>
+            <w:tcMar>
+              <w:top w:type="dxa" w:w="60"/>
+              <w:left w:type="dxa" w:w="100"/>
+              <w:bottom w:type="dxa" w:w="60"/>
+              <w:right w:type="dxa" w:w="100"/>
+            </w:tcMar>
+          </w:tcPr>
+          <w:p>
+            <w:pPr>
+              <w:spacing w:after="0"/>
+            </w:pPr>
+            <w:r>
+              <w:rPr>
+                <w:rFonts w:ascii="맑은 고딕" w:cs="맑은 고딕" w:eastAsia="맑은 고딕" w:hAnsi="맑은 고딕"/>
+                <w:b w:val="false"/>
+                <w:bCs w:val="false"/>
+                <w:sz w:val="18"/>
+                <w:szCs w:val="18"/>
+              </w:rPr>
+              <w:t xml:space="preserve">[기입]</w:t>
+            </w:r>
+          </w:p>
+        </w:tc>
+        <w:tc>
+          <w:tcPr>
+            <w:tcW w:type="dxa" w:w="1927"/>
+            <w:tcMar>
+              <w:top w:type="dxa" w:w="60"/>
+              <w:left w:type="dxa" w:w="100"/>
+              <w:bottom w:type="dxa" w:w="60"/>
+              <w:right w:type="dxa" w:w="100"/>
+            </w:tcMar>
+          </w:tcPr>
+          <w:p>
+            <w:pPr>
+              <w:spacing w:after="0"/>
+            </w:pPr>
+            <w:r>
+              <w:rPr>
+                <w:rFonts w:ascii="맑은 고딕" w:cs="맑은 고딕" w:eastAsia="맑은 고딕" w:hAnsi="맑은 고딕"/>
+                <w:b w:val="false"/>
+                <w:bCs w:val="false"/>
+                <w:sz w:val="18"/>
+                <w:szCs w:val="18"/>
+              </w:rPr>
+              <w:t xml:space="preserve">2,574명</w:t>
+            </w:r>
+          </w:p>
+        </w:tc>
+        <w:tc>
+          <w:tcPr>
+            <w:tcW w:type="dxa" w:w="1927"/>
+            <w:tcMar>
+              <w:top w:type="dxa" w:w="60"/>
+              <w:left w:type="dxa" w:w="100"/>
+              <w:bottom w:type="dxa" w:w="60"/>
+              <w:right w:type="dxa" w:w="100"/>
+            </w:tcMar>
+          </w:tcPr>
+          <w:p>
+            <w:pPr>
+              <w:spacing w:after="0"/>
+            </w:pPr>
+            <w:r>
+              <w:rPr>
+                <w:rFonts w:ascii="맑은 고딕" w:cs="맑은 고딕" w:eastAsia="맑은 고딕" w:hAnsi="맑은 고딕"/>
+                <w:b w:val="false"/>
+                <w:bCs w:val="false"/>
+                <w:sz w:val="18"/>
+                <w:szCs w:val="18"/>
+              </w:rPr>
+              <w:t xml:space="preserve">[기입]</w:t>
+            </w:r>
+          </w:p>
+        </w:tc>
+        <w:tc>
+          <w:tcPr>
+            <w:tcW w:type="dxa" w:w="1929"/>
+            <w:tcMar>
+              <w:top w:type="dxa" w:w="60"/>
+              <w:left w:type="dxa" w:w="100"/>
+              <w:bottom w:type="dxa" w:w="60"/>
+              <w:right w:type="dxa" w:w="100"/>
+            </w:tcMar>
+          </w:tcPr>
+          <w:p>
+            <w:pPr>
+              <w:spacing w:after="0"/>
+            </w:pPr>
+            <w:r>
+              <w:rPr>
+                <w:rFonts w:ascii="맑은 고딕" w:cs="맑은 고딕" w:eastAsia="맑은 고딕" w:hAnsi="맑은 고딕"/>
+                <w:b w:val="false"/>
+                <w:bCs w:val="false"/>
+                <w:sz w:val="18"/>
+                <w:szCs w:val="18"/>
+              </w:rPr>
+              <w:t xml:space="preserve">김포시 본인부담금 90% 지원 신규 시행, 시 예산 약 6.2억원</w:t>
+            </w:r>
+          </w:p>
+        </w:tc>
+      </w:tr>
+    </w:tbl>
+    <w:p>
+      <w:pPr>
+        <w:spacing w:after="80"/>
+      </w:pPr>
+    </w:p>
+    <w:p>
+      <w:pPr>
+        <w:pStyle w:val="ListParagraph"/>
+        <w:numPr>
+          <w:ilvl w:val="0"/>
+          <w:numId w:val="3"/>
+        </w:numPr>
+        <w:spacing w:after="60"/>
+      </w:pPr>
+      <w:r>
+        <w:rPr>
+          <w:rFonts w:ascii="맑은 고딕" w:cs="맑은 고딕" w:eastAsia="맑은 고딕" w:hAnsi="맑은 고딕"/>
+          <w:sz w:val="20"/>
+          <w:szCs w:val="20"/>
+        </w:rPr>
+        <w:t xml:space="preserve">경기도는 출산 가정 10곳 중 7곳 이상이 바우처를 이용하는 수준으로, 전국 평균(2019~2021년 40%대)보다 훨씬 높습니다. 도 자체 라형 지원과 시군 본인부담금 지원이 이용률을 끌어올린 것으로 보입니다. 이 지원이 줄어드는 10월 이후 이용률 하락이 우려됩니다.</w:t>
+      </w:r>
+    </w:p>
+    <w:p>
+      <w:pPr>
+        <w:pStyle w:val="ListParagraph"/>
+        <w:numPr>
+          <w:ilvl w:val="0"/>
+          <w:numId w:val="3"/>
+        </w:numPr>
+        <w:spacing w:after="60"/>
+      </w:pPr>
+      <w:r>
+        <w:rPr>
+          <w:rFonts w:ascii="맑은 고딕" w:cs="맑은 고딕" w:eastAsia="맑은 고딕" w:hAnsi="맑은 고딕"/>
+          <w:sz w:val="20"/>
+          <w:szCs w:val="20"/>
+        </w:rPr>
+        <w:t xml:space="preserve">이용률은 '지원 인원 ÷ 같은 기간 출생아 수'로 계산한 근사치입니다. 쌍둥이·신청 시점 차이로 실제와 다소 다를 수 있습니다.</w:t>
+      </w:r>
+    </w:p>
+    <w:p>
+      <w:pPr>
+        <w:pStyle w:val="ListParagraph"/>
+        <w:numPr>
+          <w:ilvl w:val="0"/>
+          <w:numId w:val="3"/>
+        </w:numPr>
+        <w:spacing w:after="60"/>
+      </w:pPr>
+      <w:r>
+        <w:rPr>
+          <w:rFonts w:ascii="맑은 고딕" w:cs="맑은 고딕" w:eastAsia="맑은 고딕" w:hAnsi="맑은 고딕"/>
+          <w:sz w:val="20"/>
+          <w:szCs w:val="20"/>
+        </w:rPr>
+        <w:t xml:space="preserve">김포시의 2025년 지원 인원은 김포시 보건소 모자보건팀에 확인해 기입해 주십시오.</w:t>
+      </w:r>
+    </w:p>
+    <w:p>
+      <w:pPr>
+        <w:spacing w:after="100"/>
+      </w:pPr>
+      <w:r>
+        <w:rPr>
+          <w:rFonts w:ascii="맑은 고딕" w:cs="맑은 고딕" w:eastAsia="맑은 고딕" w:hAnsi="맑은 고딕"/>
+          <w:b/>
+          <w:bCs/>
+          <w:sz w:val="20"/>
+          <w:szCs w:val="20"/>
+        </w:rPr>
+        <w:t xml:space="preserve">내부 자료</w:t>
       </w:r>
     </w:p>
     <w:tbl>
@@ -10047,7 +11107,596 @@
           <w:sz w:val="23"/>
           <w:szCs w:val="23"/>
         </w:rPr>
-        <w:t xml:space="preserve">A-3. 바우처 이용 현황 (내부 자료, 회의 전 기입)</w:t>
+        <w:t xml:space="preserve">A-3. 바우처 이용 현황</w:t>
+      </w:r>
+    </w:p>
+    <w:tbl>
+      <w:tblPr>
+        <w:tblW w:type="dxa" w:w="9638"/>
+        <w:tblBorders>
+          <w:top w:val="single" w:color="auto" w:sz="4"/>
+          <w:left w:val="single" w:color="auto" w:sz="4"/>
+          <w:bottom w:val="single" w:color="auto" w:sz="4"/>
+          <w:right w:val="single" w:color="auto" w:sz="4"/>
+          <w:insideH w:val="single" w:color="auto" w:sz="4"/>
+          <w:insideV w:val="single" w:color="auto" w:sz="4"/>
+        </w:tblBorders>
+        <w:tblLayout w:type="fixed"/>
+      </w:tblPr>
+      <w:tblGrid>
+        <w:gridCol w:w="1928"/>
+        <w:gridCol w:w="2570"/>
+        <w:gridCol w:w="2570"/>
+        <w:gridCol w:w="2570"/>
+      </w:tblGrid>
+      <w:tr>
+        <w:trPr>
+          <w:tblHeader/>
+        </w:trPr>
+        <w:tc>
+          <w:tcPr>
+            <w:tcW w:type="dxa" w:w="1928"/>
+            <w:shd w:fill="D9E2F3" w:color="auto" w:val="clear"/>
+            <w:tcMar>
+              <w:top w:type="dxa" w:w="60"/>
+              <w:left w:type="dxa" w:w="100"/>
+              <w:bottom w:type="dxa" w:w="60"/>
+              <w:right w:type="dxa" w:w="100"/>
+            </w:tcMar>
+          </w:tcPr>
+          <w:p>
+            <w:pPr>
+              <w:spacing w:after="0"/>
+            </w:pPr>
+            <w:r>
+              <w:rPr>
+                <w:rFonts w:ascii="맑은 고딕" w:cs="맑은 고딕" w:eastAsia="맑은 고딕" w:hAnsi="맑은 고딕"/>
+                <w:b/>
+                <w:bCs/>
+                <w:sz w:val="18"/>
+                <w:szCs w:val="18"/>
+              </w:rPr>
+              <w:t xml:space="preserve">구분</w:t>
+            </w:r>
+          </w:p>
+        </w:tc>
+        <w:tc>
+          <w:tcPr>
+            <w:tcW w:type="dxa" w:w="2570"/>
+            <w:shd w:fill="D9E2F3" w:color="auto" w:val="clear"/>
+            <w:tcMar>
+              <w:top w:type="dxa" w:w="60"/>
+              <w:left w:type="dxa" w:w="100"/>
+              <w:bottom w:type="dxa" w:w="60"/>
+              <w:right w:type="dxa" w:w="100"/>
+            </w:tcMar>
+          </w:tcPr>
+          <w:p>
+            <w:pPr>
+              <w:spacing w:after="0"/>
+            </w:pPr>
+            <w:r>
+              <w:rPr>
+                <w:rFonts w:ascii="맑은 고딕" w:cs="맑은 고딕" w:eastAsia="맑은 고딕" w:hAnsi="맑은 고딕"/>
+                <w:b/>
+                <w:bCs/>
+                <w:sz w:val="18"/>
+                <w:szCs w:val="18"/>
+              </w:rPr>
+              <w:t xml:space="preserve">지원 인원</w:t>
+            </w:r>
+          </w:p>
+        </w:tc>
+        <w:tc>
+          <w:tcPr>
+            <w:tcW w:type="dxa" w:w="2570"/>
+            <w:shd w:fill="D9E2F3" w:color="auto" w:val="clear"/>
+            <w:tcMar>
+              <w:top w:type="dxa" w:w="60"/>
+              <w:left w:type="dxa" w:w="100"/>
+              <w:bottom w:type="dxa" w:w="60"/>
+              <w:right w:type="dxa" w:w="100"/>
+            </w:tcMar>
+          </w:tcPr>
+          <w:p>
+            <w:pPr>
+              <w:spacing w:after="0"/>
+            </w:pPr>
+            <w:r>
+              <w:rPr>
+                <w:rFonts w:ascii="맑은 고딕" w:cs="맑은 고딕" w:eastAsia="맑은 고딕" w:hAnsi="맑은 고딕"/>
+                <w:b/>
+                <w:bCs/>
+                <w:sz w:val="18"/>
+                <w:szCs w:val="18"/>
+              </w:rPr>
+              <w:t xml:space="preserve">출생아 수</w:t>
+            </w:r>
+          </w:p>
+        </w:tc>
+        <w:tc>
+          <w:tcPr>
+            <w:tcW w:type="dxa" w:w="2570"/>
+            <w:shd w:fill="D9E2F3" w:color="auto" w:val="clear"/>
+            <w:tcMar>
+              <w:top w:type="dxa" w:w="60"/>
+              <w:left w:type="dxa" w:w="100"/>
+              <w:bottom w:type="dxa" w:w="60"/>
+              <w:right w:type="dxa" w:w="100"/>
+            </w:tcMar>
+          </w:tcPr>
+          <w:p>
+            <w:pPr>
+              <w:spacing w:after="0"/>
+            </w:pPr>
+            <w:r>
+              <w:rPr>
+                <w:rFonts w:ascii="맑은 고딕" w:cs="맑은 고딕" w:eastAsia="맑은 고딕" w:hAnsi="맑은 고딕"/>
+                <w:b/>
+                <w:bCs/>
+                <w:sz w:val="18"/>
+                <w:szCs w:val="18"/>
+              </w:rPr>
+              <w:t xml:space="preserve">이용률(계산)</w:t>
+            </w:r>
+          </w:p>
+        </w:tc>
+      </w:tr>
+      <w:tr>
+        <w:trPr>
+          <w:tblHeader w:val="false"/>
+        </w:trPr>
+        <w:tc>
+          <w:tcPr>
+            <w:tcW w:type="dxa" w:w="1928"/>
+            <w:tcMar>
+              <w:top w:type="dxa" w:w="60"/>
+              <w:left w:type="dxa" w:w="100"/>
+              <w:bottom w:type="dxa" w:w="60"/>
+              <w:right w:type="dxa" w:w="100"/>
+            </w:tcMar>
+          </w:tcPr>
+          <w:p>
+            <w:pPr>
+              <w:spacing w:after="0"/>
+            </w:pPr>
+            <w:r>
+              <w:rPr>
+                <w:rFonts w:ascii="맑은 고딕" w:cs="맑은 고딕" w:eastAsia="맑은 고딕" w:hAnsi="맑은 고딕"/>
+                <w:b w:val="false"/>
+                <w:bCs w:val="false"/>
+                <w:sz w:val="18"/>
+                <w:szCs w:val="18"/>
+              </w:rPr>
+              <w:t xml:space="preserve">경기도 2024년</w:t>
+            </w:r>
+          </w:p>
+        </w:tc>
+        <w:tc>
+          <w:tcPr>
+            <w:tcW w:type="dxa" w:w="2570"/>
+            <w:tcMar>
+              <w:top w:type="dxa" w:w="60"/>
+              <w:left w:type="dxa" w:w="100"/>
+              <w:bottom w:type="dxa" w:w="60"/>
+              <w:right w:type="dxa" w:w="100"/>
+            </w:tcMar>
+          </w:tcPr>
+          <w:p>
+            <w:pPr>
+              <w:spacing w:after="0"/>
+            </w:pPr>
+            <w:r>
+              <w:rPr>
+                <w:rFonts w:ascii="맑은 고딕" w:cs="맑은 고딕" w:eastAsia="맑은 고딕" w:hAnsi="맑은 고딕"/>
+                <w:b w:val="false"/>
+                <w:bCs w:val="false"/>
+                <w:sz w:val="18"/>
+                <w:szCs w:val="18"/>
+              </w:rPr>
+              <w:t xml:space="preserve">51,113명</w:t>
+            </w:r>
+          </w:p>
+        </w:tc>
+        <w:tc>
+          <w:tcPr>
+            <w:tcW w:type="dxa" w:w="2570"/>
+            <w:tcMar>
+              <w:top w:type="dxa" w:w="60"/>
+              <w:left w:type="dxa" w:w="100"/>
+              <w:bottom w:type="dxa" w:w="60"/>
+              <w:right w:type="dxa" w:w="100"/>
+            </w:tcMar>
+          </w:tcPr>
+          <w:p>
+            <w:pPr>
+              <w:spacing w:after="0"/>
+            </w:pPr>
+            <w:r>
+              <w:rPr>
+                <w:rFonts w:ascii="맑은 고딕" w:cs="맑은 고딕" w:eastAsia="맑은 고딕" w:hAnsi="맑은 고딕"/>
+                <w:b w:val="false"/>
+                <w:bCs w:val="false"/>
+                <w:sz w:val="18"/>
+                <w:szCs w:val="18"/>
+              </w:rPr>
+              <w:t xml:space="preserve">71,300명</w:t>
+            </w:r>
+          </w:p>
+        </w:tc>
+        <w:tc>
+          <w:tcPr>
+            <w:tcW w:type="dxa" w:w="2570"/>
+            <w:tcMar>
+              <w:top w:type="dxa" w:w="60"/>
+              <w:left w:type="dxa" w:w="100"/>
+              <w:bottom w:type="dxa" w:w="60"/>
+              <w:right w:type="dxa" w:w="100"/>
+            </w:tcMar>
+          </w:tcPr>
+          <w:p>
+            <w:pPr>
+              <w:spacing w:after="0"/>
+            </w:pPr>
+            <w:r>
+              <w:rPr>
+                <w:rFonts w:ascii="맑은 고딕" w:cs="맑은 고딕" w:eastAsia="맑은 고딕" w:hAnsi="맑은 고딕"/>
+                <w:b w:val="false"/>
+                <w:bCs w:val="false"/>
+                <w:sz w:val="18"/>
+                <w:szCs w:val="18"/>
+              </w:rPr>
+              <w:t xml:space="preserve">약 72%</w:t>
+            </w:r>
+          </w:p>
+        </w:tc>
+      </w:tr>
+      <w:tr>
+        <w:trPr>
+          <w:tblHeader w:val="false"/>
+        </w:trPr>
+        <w:tc>
+          <w:tcPr>
+            <w:tcW w:type="dxa" w:w="1928"/>
+            <w:tcMar>
+              <w:top w:type="dxa" w:w="60"/>
+              <w:left w:type="dxa" w:w="100"/>
+              <w:bottom w:type="dxa" w:w="60"/>
+              <w:right w:type="dxa" w:w="100"/>
+            </w:tcMar>
+          </w:tcPr>
+          <w:p>
+            <w:pPr>
+              <w:spacing w:after="0"/>
+            </w:pPr>
+            <w:r>
+              <w:rPr>
+                <w:rFonts w:ascii="맑은 고딕" w:cs="맑은 고딕" w:eastAsia="맑은 고딕" w:hAnsi="맑은 고딕"/>
+                <w:b w:val="false"/>
+                <w:bCs w:val="false"/>
+                <w:sz w:val="18"/>
+                <w:szCs w:val="18"/>
+              </w:rPr>
+              <w:t xml:space="preserve">경기도 2025년 상반기</w:t>
+            </w:r>
+          </w:p>
+        </w:tc>
+        <w:tc>
+          <w:tcPr>
+            <w:tcW w:type="dxa" w:w="2570"/>
+            <w:tcMar>
+              <w:top w:type="dxa" w:w="60"/>
+              <w:left w:type="dxa" w:w="100"/>
+              <w:bottom w:type="dxa" w:w="60"/>
+              <w:right w:type="dxa" w:w="100"/>
+            </w:tcMar>
+          </w:tcPr>
+          <w:p>
+            <w:pPr>
+              <w:spacing w:after="0"/>
+            </w:pPr>
+            <w:r>
+              <w:rPr>
+                <w:rFonts w:ascii="맑은 고딕" w:cs="맑은 고딕" w:eastAsia="맑은 고딕" w:hAnsi="맑은 고딕"/>
+                <w:b w:val="false"/>
+                <w:bCs w:val="false"/>
+                <w:sz w:val="18"/>
+                <w:szCs w:val="18"/>
+              </w:rPr>
+              <w:t xml:space="preserve">31,786명</w:t>
+            </w:r>
+          </w:p>
+        </w:tc>
+        <w:tc>
+          <w:tcPr>
+            <w:tcW w:type="dxa" w:w="2570"/>
+            <w:tcMar>
+              <w:top w:type="dxa" w:w="60"/>
+              <w:left w:type="dxa" w:w="100"/>
+              <w:bottom w:type="dxa" w:w="60"/>
+              <w:right w:type="dxa" w:w="100"/>
+            </w:tcMar>
+          </w:tcPr>
+          <w:p>
+            <w:pPr>
+              <w:spacing w:after="0"/>
+            </w:pPr>
+            <w:r>
+              <w:rPr>
+                <w:rFonts w:ascii="맑은 고딕" w:cs="맑은 고딕" w:eastAsia="맑은 고딕" w:hAnsi="맑은 고딕"/>
+                <w:b w:val="false"/>
+                <w:bCs w:val="false"/>
+                <w:sz w:val="18"/>
+                <w:szCs w:val="18"/>
+              </w:rPr>
+              <w:t xml:space="preserve">44,368명</w:t>
+            </w:r>
+          </w:p>
+        </w:tc>
+        <w:tc>
+          <w:tcPr>
+            <w:tcW w:type="dxa" w:w="2570"/>
+            <w:tcMar>
+              <w:top w:type="dxa" w:w="60"/>
+              <w:left w:type="dxa" w:w="100"/>
+              <w:bottom w:type="dxa" w:w="60"/>
+              <w:right w:type="dxa" w:w="100"/>
+            </w:tcMar>
+          </w:tcPr>
+          <w:p>
+            <w:pPr>
+              <w:spacing w:after="0"/>
+            </w:pPr>
+            <w:r>
+              <w:rPr>
+                <w:rFonts w:ascii="맑은 고딕" w:cs="맑은 고딕" w:eastAsia="맑은 고딕" w:hAnsi="맑은 고딕"/>
+                <w:b w:val="false"/>
+                <w:bCs w:val="false"/>
+                <w:sz w:val="18"/>
+                <w:szCs w:val="18"/>
+              </w:rPr>
+              <w:t xml:space="preserve">약 72%</w:t>
+            </w:r>
+          </w:p>
+        </w:tc>
+      </w:tr>
+      <w:tr>
+        <w:trPr>
+          <w:tblHeader w:val="false"/>
+        </w:trPr>
+        <w:tc>
+          <w:tcPr>
+            <w:tcW w:type="dxa" w:w="1928"/>
+            <w:tcMar>
+              <w:top w:type="dxa" w:w="60"/>
+              <w:left w:type="dxa" w:w="100"/>
+              <w:bottom w:type="dxa" w:w="60"/>
+              <w:right w:type="dxa" w:w="100"/>
+            </w:tcMar>
+          </w:tcPr>
+          <w:p>
+            <w:pPr>
+              <w:spacing w:after="0"/>
+            </w:pPr>
+            <w:r>
+              <w:rPr>
+                <w:rFonts w:ascii="맑은 고딕" w:cs="맑은 고딕" w:eastAsia="맑은 고딕" w:hAnsi="맑은 고딕"/>
+                <w:b w:val="false"/>
+                <w:bCs w:val="false"/>
+                <w:sz w:val="18"/>
+                <w:szCs w:val="18"/>
+              </w:rPr>
+              <w:t xml:space="preserve">전국 2021년</w:t>
+            </w:r>
+          </w:p>
+        </w:tc>
+        <w:tc>
+          <w:tcPr>
+            <w:tcW w:type="dxa" w:w="2570"/>
+            <w:tcMar>
+              <w:top w:type="dxa" w:w="60"/>
+              <w:left w:type="dxa" w:w="100"/>
+              <w:bottom w:type="dxa" w:w="60"/>
+              <w:right w:type="dxa" w:w="100"/>
+            </w:tcMar>
+          </w:tcPr>
+          <w:p>
+            <w:pPr>
+              <w:spacing w:after="0"/>
+            </w:pPr>
+            <w:r>
+              <w:rPr>
+                <w:rFonts w:ascii="맑은 고딕" w:cs="맑은 고딕" w:eastAsia="맑은 고딕" w:hAnsi="맑은 고딕"/>
+                <w:b w:val="false"/>
+                <w:bCs w:val="false"/>
+                <w:sz w:val="18"/>
+                <w:szCs w:val="18"/>
+              </w:rPr>
+              <w:t xml:space="preserve">125,675가구</w:t>
+            </w:r>
+          </w:p>
+        </w:tc>
+        <w:tc>
+          <w:tcPr>
+            <w:tcW w:type="dxa" w:w="2570"/>
+            <w:tcMar>
+              <w:top w:type="dxa" w:w="60"/>
+              <w:left w:type="dxa" w:w="100"/>
+              <w:bottom w:type="dxa" w:w="60"/>
+              <w:right w:type="dxa" w:w="100"/>
+            </w:tcMar>
+          </w:tcPr>
+          <w:p>
+            <w:pPr>
+              <w:spacing w:after="0"/>
+            </w:pPr>
+            <w:r>
+              <w:rPr>
+                <w:rFonts w:ascii="맑은 고딕" w:cs="맑은 고딕" w:eastAsia="맑은 고딕" w:hAnsi="맑은 고딕"/>
+                <w:b w:val="false"/>
+                <w:bCs w:val="false"/>
+                <w:sz w:val="18"/>
+                <w:szCs w:val="18"/>
+              </w:rPr>
+              <w:t xml:space="preserve">260,562명</w:t>
+            </w:r>
+          </w:p>
+        </w:tc>
+        <w:tc>
+          <w:tcPr>
+            <w:tcW w:type="dxa" w:w="2570"/>
+            <w:tcMar>
+              <w:top w:type="dxa" w:w="60"/>
+              <w:left w:type="dxa" w:w="100"/>
+              <w:bottom w:type="dxa" w:w="60"/>
+              <w:right w:type="dxa" w:w="100"/>
+            </w:tcMar>
+          </w:tcPr>
+          <w:p>
+            <w:pPr>
+              <w:spacing w:after="0"/>
+            </w:pPr>
+            <w:r>
+              <w:rPr>
+                <w:rFonts w:ascii="맑은 고딕" w:cs="맑은 고딕" w:eastAsia="맑은 고딕" w:hAnsi="맑은 고딕"/>
+                <w:b w:val="false"/>
+                <w:bCs w:val="false"/>
+                <w:sz w:val="18"/>
+                <w:szCs w:val="18"/>
+              </w:rPr>
+              <w:t xml:space="preserve">약 48%</w:t>
+            </w:r>
+          </w:p>
+        </w:tc>
+      </w:tr>
+      <w:tr>
+        <w:trPr>
+          <w:tblHeader w:val="false"/>
+        </w:trPr>
+        <w:tc>
+          <w:tcPr>
+            <w:tcW w:type="dxa" w:w="1928"/>
+            <w:tcMar>
+              <w:top w:type="dxa" w:w="60"/>
+              <w:left w:type="dxa" w:w="100"/>
+              <w:bottom w:type="dxa" w:w="60"/>
+              <w:right w:type="dxa" w:w="100"/>
+            </w:tcMar>
+          </w:tcPr>
+          <w:p>
+            <w:pPr>
+              <w:spacing w:after="0"/>
+            </w:pPr>
+            <w:r>
+              <w:rPr>
+                <w:rFonts w:ascii="맑은 고딕" w:cs="맑은 고딕" w:eastAsia="맑은 고딕" w:hAnsi="맑은 고딕"/>
+                <w:b w:val="false"/>
+                <w:bCs w:val="false"/>
+                <w:sz w:val="18"/>
+                <w:szCs w:val="18"/>
+              </w:rPr>
+              <w:t xml:space="preserve">김포시 2025년</w:t>
+            </w:r>
+          </w:p>
+        </w:tc>
+        <w:tc>
+          <w:tcPr>
+            <w:tcW w:type="dxa" w:w="2570"/>
+            <w:tcMar>
+              <w:top w:type="dxa" w:w="60"/>
+              <w:left w:type="dxa" w:w="100"/>
+              <w:bottom w:type="dxa" w:w="60"/>
+              <w:right w:type="dxa" w:w="100"/>
+            </w:tcMar>
+          </w:tcPr>
+          <w:p>
+            <w:pPr>
+              <w:spacing w:after="0"/>
+            </w:pPr>
+            <w:r>
+              <w:rPr>
+                <w:rFonts w:ascii="맑은 고딕" w:cs="맑은 고딕" w:eastAsia="맑은 고딕" w:hAnsi="맑은 고딕"/>
+                <w:b w:val="false"/>
+                <w:bCs w:val="false"/>
+                <w:sz w:val="18"/>
+                <w:szCs w:val="18"/>
+              </w:rPr>
+              <w:t xml:space="preserve">[기입]</w:t>
+            </w:r>
+          </w:p>
+        </w:tc>
+        <w:tc>
+          <w:tcPr>
+            <w:tcW w:type="dxa" w:w="2570"/>
+            <w:tcMar>
+              <w:top w:type="dxa" w:w="60"/>
+              <w:left w:type="dxa" w:w="100"/>
+              <w:bottom w:type="dxa" w:w="60"/>
+              <w:right w:type="dxa" w:w="100"/>
+            </w:tcMar>
+          </w:tcPr>
+          <w:p>
+            <w:pPr>
+              <w:spacing w:after="0"/>
+            </w:pPr>
+            <w:r>
+              <w:rPr>
+                <w:rFonts w:ascii="맑은 고딕" w:cs="맑은 고딕" w:eastAsia="맑은 고딕" w:hAnsi="맑은 고딕"/>
+                <w:b w:val="false"/>
+                <w:bCs w:val="false"/>
+                <w:sz w:val="18"/>
+                <w:szCs w:val="18"/>
+              </w:rPr>
+              <w:t xml:space="preserve">2,574명</w:t>
+            </w:r>
+          </w:p>
+        </w:tc>
+        <w:tc>
+          <w:tcPr>
+            <w:tcW w:type="dxa" w:w="2570"/>
+            <w:tcMar>
+              <w:top w:type="dxa" w:w="60"/>
+              <w:left w:type="dxa" w:w="100"/>
+              <w:bottom w:type="dxa" w:w="60"/>
+              <w:right w:type="dxa" w:w="100"/>
+            </w:tcMar>
+          </w:tcPr>
+          <w:p>
+            <w:pPr>
+              <w:spacing w:after="0"/>
+            </w:pPr>
+            <w:r>
+              <w:rPr>
+                <w:rFonts w:ascii="맑은 고딕" w:cs="맑은 고딕" w:eastAsia="맑은 고딕" w:hAnsi="맑은 고딕"/>
+                <w:b w:val="false"/>
+                <w:bCs w:val="false"/>
+                <w:sz w:val="18"/>
+                <w:szCs w:val="18"/>
+              </w:rPr>
+              <w:t xml:space="preserve">[기입]</w:t>
+            </w:r>
+          </w:p>
+        </w:tc>
+      </w:tr>
+    </w:tbl>
+    <w:p>
+      <w:pPr>
+        <w:spacing w:after="80"/>
+      </w:pPr>
+    </w:p>
+    <w:p>
+      <w:pPr>
+        <w:spacing w:after="100"/>
+      </w:pPr>
+      <w:r>
+        <w:rPr>
+          <w:rFonts w:ascii="맑은 고딕" w:cs="맑은 고딕" w:eastAsia="맑은 고딕" w:hAnsi="맑은 고딕"/>
+          <w:b/>
+          <w:bCs/>
+          <w:sz w:val="20"/>
+          <w:szCs w:val="20"/>
+        </w:rPr>
+        <w:t xml:space="preserve">내부 자료 (회의 전 기입)</w:t>
       </w:r>
     </w:p>
     <w:tbl>
@@ -10858,6 +12507,60 @@
           <w:szCs w:val="20"/>
         </w:rPr>
         <w:t xml:space="preserve">이데일리, 「[포토]출생아 수 13개월 연속 증가」(2026년 7월 인구동향) https://edaily.co.kr/News/Read?mediaCodeNo=257&amp;newsId=03949126642303400</w:t>
+      </w:r>
+    </w:p>
+    <w:p>
+      <w:pPr>
+        <w:pStyle w:val="ListParagraph"/>
+        <w:numPr>
+          <w:ilvl w:val="0"/>
+          <w:numId w:val="3"/>
+        </w:numPr>
+        <w:spacing w:after="60"/>
+      </w:pPr>
+      <w:r>
+        <w:rPr>
+          <w:rFonts w:ascii="맑은 고딕" w:cs="맑은 고딕" w:eastAsia="맑은 고딕" w:hAnsi="맑은 고딕"/>
+          <w:sz w:val="20"/>
+          <w:szCs w:val="20"/>
+        </w:rPr>
+        <w:t xml:space="preserve">시사오늘 외, 「경기도, 모자보건사업 재편…난임지원 확대」(경기도 산모신생아 건강관리 2024년 619억원·51,113명, 2025년 상반기 31,786명, 상반기 출생아 44,368명) https://www.sisaon.co.kr/news/articleView.html?idxno=204250</w:t>
+      </w:r>
+    </w:p>
+    <w:p>
+      <w:pPr>
+        <w:pStyle w:val="ListParagraph"/>
+        <w:numPr>
+          <w:ilvl w:val="0"/>
+          <w:numId w:val="3"/>
+        </w:numPr>
+        <w:spacing w:after="60"/>
+      </w:pPr>
+      <w:r>
+        <w:rPr>
+          <w:rFonts w:ascii="맑은 고딕" w:cs="맑은 고딕" w:eastAsia="맑은 고딕" w:hAnsi="맑은 고딕"/>
+          <w:sz w:val="20"/>
+          <w:szCs w:val="20"/>
+        </w:rPr>
+        <w:t xml:space="preserve">육아정책연구소, 「산모·신생아 건강관리 지원사업 개선 및 활성화 방안」(2022, 연도별 이용 가구 수) https://repo.kicce.re.kr/bitstream/2019.oak/5382/2/OR2207.pdf</w:t>
+      </w:r>
+    </w:p>
+    <w:p>
+      <w:pPr>
+        <w:pStyle w:val="ListParagraph"/>
+        <w:numPr>
+          <w:ilvl w:val="0"/>
+          <w:numId w:val="3"/>
+        </w:numPr>
+        <w:spacing w:after="60"/>
+      </w:pPr>
+      <w:r>
+        <w:rPr>
+          <w:rFonts w:ascii="맑은 고딕" w:cs="맑은 고딕" w:eastAsia="맑은 고딕" w:hAnsi="맑은 고딕"/>
+          <w:sz w:val="20"/>
+          <w:szCs w:val="20"/>
+        </w:rPr>
+        <w:t xml:space="preserve">일간경기, 「김포시, 아이낳고 키우기 좋은 도시 지향..산후조리비 지원」(김포시 본인부담금 90% 지원, 예산 약 6.2억원) https://www.1gan.co.kr/news/articleView.html?idxno=256923</w:t>
       </w:r>
     </w:p>
     <w:p>

</xml_diff>

<commit_message>
Add voucher usage rate chart and Gimpo five-year fill-in table
Co-Authored-By: Claude Fable 5.1 <noreply@anthropic.com>
Claude-Session: https://claude.ai/code/session_01YQpD7bdbUWBdDGpeeL147H
</commit_message>
<xml_diff>
--- a/meetings/2026-09-19-관리사-정기회의-자료.docx
+++ b/meetings/2026-09-19-관리사-정기회의-자료.docx
@@ -11107,7 +11107,1319 @@
           <w:sz w:val="23"/>
           <w:szCs w:val="23"/>
         </w:rPr>
-        <w:t xml:space="preserve">A-3. 바우처 이용 현황</w:t>
+        <w:t xml:space="preserve">A-3. 바우처 이용률 도표</w:t>
+      </w:r>
+    </w:p>
+    <w:p>
+      <w:pPr>
+        <w:spacing w:after="120"/>
+        <w:jc w:val="center"/>
+      </w:pPr>
+      <w:r>
+        <w:drawing>
+          <wp:inline distT="0" distB="0" distL="0" distR="0">
+            <wp:extent cx="5715000" cy="3000375"/>
+            <wp:effectExtent t="0" r="0" b="0" l="0"/>
+            <wp:docPr id="1" name="" descr="" title=""/>
+            <wp:cNvGraphicFramePr>
+              <a:graphicFrameLocks xmlns:a="http://schemas.openxmlformats.org/drawingml/2006/main" noChangeAspect="1"/>
+            </wp:cNvGraphicFramePr>
+            <a:graphic xmlns:a="http://schemas.openxmlformats.org/drawingml/2006/main">
+              <a:graphicData uri="http://schemas.openxmlformats.org/drawingml/2006/picture">
+                <pic:pic xmlns:pic="http://schemas.openxmlformats.org/drawingml/2006/picture">
+                  <pic:nvPicPr>
+                    <pic:cNvPr id="0" name="" descr=""/>
+                    <pic:cNvPicPr>
+                      <a:picLocks noChangeAspect="1" noChangeArrowheads="1"/>
+                    </pic:cNvPicPr>
+                  </pic:nvPicPr>
+                  <pic:blipFill>
+                    <a:blip r:embed="rId8" cstate="none"/>
+                    <a:srcRect/>
+                    <a:stretch>
+                      <a:fillRect/>
+                    </a:stretch>
+                  </pic:blipFill>
+                  <pic:spPr bwMode="auto">
+                    <a:xfrm>
+                      <a:off x="0" y="0"/>
+                      <a:ext cx="5715000" cy="3000375"/>
+                    </a:xfrm>
+                    <a:prstGeom prst="rect">
+                      <a:avLst/>
+                    </a:prstGeom>
+                  </pic:spPr>
+                </pic:pic>
+              </a:graphicData>
+            </a:graphic>
+          </wp:inline>
+        </w:drawing>
+      </w:r>
+    </w:p>
+    <w:p>
+      <w:pPr>
+        <w:pStyle w:val="ListParagraph"/>
+        <w:numPr>
+          <w:ilvl w:val="0"/>
+          <w:numId w:val="3"/>
+        </w:numPr>
+        <w:spacing w:after="60"/>
+      </w:pPr>
+      <w:r>
+        <w:rPr>
+          <w:rFonts w:ascii="맑은 고딕" w:cs="맑은 고딕" w:eastAsia="맑은 고딕" w:hAnsi="맑은 고딕"/>
+          <w:sz w:val="20"/>
+          <w:szCs w:val="20"/>
+        </w:rPr>
+        <w:t xml:space="preserve">전국은 출산 가정의 40%대가 바우처를 이용했고(2019~2021년), 경기도는 2024년과 2025년 상반기 모두 약 72%로 훨씬 높습니다. 경기도의 라형 지원과 시군 본인부담금 지원이 이용률을 끌어올린 것으로 보입니다.</w:t>
+      </w:r>
+    </w:p>
+    <w:p>
+      <w:pPr>
+        <w:pStyle w:val="ListParagraph"/>
+        <w:numPr>
+          <w:ilvl w:val="0"/>
+          <w:numId w:val="3"/>
+        </w:numPr>
+        <w:spacing w:after="60"/>
+      </w:pPr>
+      <w:r>
+        <w:rPr>
+          <w:rFonts w:ascii="맑은 고딕" w:cs="맑은 고딕" w:eastAsia="맑은 고딕" w:hAnsi="맑은 고딕"/>
+          <w:sz w:val="20"/>
+          <w:szCs w:val="20"/>
+        </w:rPr>
+        <w:t xml:space="preserve">김포시의 연도별 지원 인원은 공개 자료에 없습니다. 김포시 보건소 모자보건팀(031-5186-4152)에 "연도별 산모·신생아 건강관리 지원 인원"을 요청하거나, 사회서비스 전자바우처 포털(socialservice.or.kr)에서 김포시 제공기관별 이용자 수를 합산하면 아래 표를 채울 수 있습니다.</w:t>
+      </w:r>
+    </w:p>
+    <w:p>
+      <w:pPr>
+        <w:pStyle w:val="Heading2"/>
+        <w:spacing w:after="100" w:before="200"/>
+      </w:pPr>
+      <w:r>
+        <w:rPr>
+          <w:rFonts w:ascii="맑은 고딕" w:cs="맑은 고딕" w:eastAsia="맑은 고딕" w:hAnsi="맑은 고딕"/>
+          <w:b/>
+          <w:bCs/>
+          <w:color w:val="2E5C8A"/>
+          <w:sz w:val="23"/>
+          <w:szCs w:val="23"/>
+        </w:rPr>
+        <w:t xml:space="preserve">A-4. 김포시 바우처 이용률 5개년 (회의 전 기입)</w:t>
+      </w:r>
+    </w:p>
+    <w:tbl>
+      <w:tblPr>
+        <w:tblW w:type="dxa" w:w="9638"/>
+        <w:tblBorders>
+          <w:top w:val="single" w:color="auto" w:sz="4"/>
+          <w:left w:val="single" w:color="auto" w:sz="4"/>
+          <w:bottom w:val="single" w:color="auto" w:sz="4"/>
+          <w:right w:val="single" w:color="auto" w:sz="4"/>
+          <w:insideH w:val="single" w:color="auto" w:sz="4"/>
+          <w:insideV w:val="single" w:color="auto" w:sz="4"/>
+        </w:tblBorders>
+        <w:tblLayout w:type="fixed"/>
+      </w:tblPr>
+      <w:tblGrid>
+        <w:gridCol w:w="1928"/>
+        <w:gridCol w:w="1542"/>
+        <w:gridCol w:w="1542"/>
+        <w:gridCol w:w="1542"/>
+        <w:gridCol w:w="1542"/>
+        <w:gridCol w:w="1542"/>
+      </w:tblGrid>
+      <w:tr>
+        <w:trPr>
+          <w:tblHeader/>
+        </w:trPr>
+        <w:tc>
+          <w:tcPr>
+            <w:tcW w:type="dxa" w:w="1928"/>
+            <w:shd w:fill="D9E2F3" w:color="auto" w:val="clear"/>
+            <w:tcMar>
+              <w:top w:type="dxa" w:w="60"/>
+              <w:left w:type="dxa" w:w="100"/>
+              <w:bottom w:type="dxa" w:w="60"/>
+              <w:right w:type="dxa" w:w="100"/>
+            </w:tcMar>
+          </w:tcPr>
+          <w:p>
+            <w:pPr>
+              <w:spacing w:after="0"/>
+            </w:pPr>
+            <w:r>
+              <w:rPr>
+                <w:rFonts w:ascii="맑은 고딕" w:cs="맑은 고딕" w:eastAsia="맑은 고딕" w:hAnsi="맑은 고딕"/>
+                <w:b/>
+                <w:bCs/>
+                <w:sz w:val="18"/>
+                <w:szCs w:val="18"/>
+              </w:rPr>
+              <w:t xml:space="preserve">연도</w:t>
+            </w:r>
+          </w:p>
+        </w:tc>
+        <w:tc>
+          <w:tcPr>
+            <w:tcW w:type="dxa" w:w="1542"/>
+            <w:shd w:fill="D9E2F3" w:color="auto" w:val="clear"/>
+            <w:tcMar>
+              <w:top w:type="dxa" w:w="60"/>
+              <w:left w:type="dxa" w:w="100"/>
+              <w:bottom w:type="dxa" w:w="60"/>
+              <w:right w:type="dxa" w:w="100"/>
+            </w:tcMar>
+          </w:tcPr>
+          <w:p>
+            <w:pPr>
+              <w:spacing w:after="0"/>
+            </w:pPr>
+            <w:r>
+              <w:rPr>
+                <w:rFonts w:ascii="맑은 고딕" w:cs="맑은 고딕" w:eastAsia="맑은 고딕" w:hAnsi="맑은 고딕"/>
+                <w:b/>
+                <w:bCs/>
+                <w:sz w:val="18"/>
+                <w:szCs w:val="18"/>
+              </w:rPr>
+              <w:t xml:space="preserve">김포시 출생아 수</w:t>
+            </w:r>
+          </w:p>
+        </w:tc>
+        <w:tc>
+          <w:tcPr>
+            <w:tcW w:type="dxa" w:w="1542"/>
+            <w:shd w:fill="D9E2F3" w:color="auto" w:val="clear"/>
+            <w:tcMar>
+              <w:top w:type="dxa" w:w="60"/>
+              <w:left w:type="dxa" w:w="100"/>
+              <w:bottom w:type="dxa" w:w="60"/>
+              <w:right w:type="dxa" w:w="100"/>
+            </w:tcMar>
+          </w:tcPr>
+          <w:p>
+            <w:pPr>
+              <w:spacing w:after="0"/>
+            </w:pPr>
+            <w:r>
+              <w:rPr>
+                <w:rFonts w:ascii="맑은 고딕" w:cs="맑은 고딕" w:eastAsia="맑은 고딕" w:hAnsi="맑은 고딕"/>
+                <w:b/>
+                <w:bCs/>
+                <w:sz w:val="18"/>
+                <w:szCs w:val="18"/>
+              </w:rPr>
+              <w:t xml:space="preserve">바우처 지원 인원</w:t>
+            </w:r>
+          </w:p>
+        </w:tc>
+        <w:tc>
+          <w:tcPr>
+            <w:tcW w:type="dxa" w:w="1542"/>
+            <w:shd w:fill="D9E2F3" w:color="auto" w:val="clear"/>
+            <w:tcMar>
+              <w:top w:type="dxa" w:w="60"/>
+              <w:left w:type="dxa" w:w="100"/>
+              <w:bottom w:type="dxa" w:w="60"/>
+              <w:right w:type="dxa" w:w="100"/>
+            </w:tcMar>
+          </w:tcPr>
+          <w:p>
+            <w:pPr>
+              <w:spacing w:after="0"/>
+            </w:pPr>
+            <w:r>
+              <w:rPr>
+                <w:rFonts w:ascii="맑은 고딕" w:cs="맑은 고딕" w:eastAsia="맑은 고딕" w:hAnsi="맑은 고딕"/>
+                <w:b/>
+                <w:bCs/>
+                <w:sz w:val="18"/>
+                <w:szCs w:val="18"/>
+              </w:rPr>
+              <w:t xml:space="preserve">이용률(지원 인원 ÷ 출생아)</w:t>
+            </w:r>
+          </w:p>
+        </w:tc>
+        <w:tc>
+          <w:tcPr>
+            <w:tcW w:type="dxa" w:w="1542"/>
+            <w:shd w:fill="D9E2F3" w:color="auto" w:val="clear"/>
+            <w:tcMar>
+              <w:top w:type="dxa" w:w="60"/>
+              <w:left w:type="dxa" w:w="100"/>
+              <w:bottom w:type="dxa" w:w="60"/>
+              <w:right w:type="dxa" w:w="100"/>
+            </w:tcMar>
+          </w:tcPr>
+          <w:p>
+            <w:pPr>
+              <w:spacing w:after="0"/>
+            </w:pPr>
+            <w:r>
+              <w:rPr>
+                <w:rFonts w:ascii="맑은 고딕" w:cs="맑은 고딕" w:eastAsia="맑은 고딕" w:hAnsi="맑은 고딕"/>
+                <w:b/>
+                <w:bCs/>
+                <w:sz w:val="18"/>
+                <w:szCs w:val="18"/>
+              </w:rPr>
+              <w:t xml:space="preserve">우리 회사 담당 건수</w:t>
+            </w:r>
+          </w:p>
+        </w:tc>
+        <w:tc>
+          <w:tcPr>
+            <w:tcW w:type="dxa" w:w="1542"/>
+            <w:shd w:fill="D9E2F3" w:color="auto" w:val="clear"/>
+            <w:tcMar>
+              <w:top w:type="dxa" w:w="60"/>
+              <w:left w:type="dxa" w:w="100"/>
+              <w:bottom w:type="dxa" w:w="60"/>
+              <w:right w:type="dxa" w:w="100"/>
+            </w:tcMar>
+          </w:tcPr>
+          <w:p>
+            <w:pPr>
+              <w:spacing w:after="0"/>
+            </w:pPr>
+            <w:r>
+              <w:rPr>
+                <w:rFonts w:ascii="맑은 고딕" w:cs="맑은 고딕" w:eastAsia="맑은 고딕" w:hAnsi="맑은 고딕"/>
+                <w:b/>
+                <w:bCs/>
+                <w:sz w:val="18"/>
+                <w:szCs w:val="18"/>
+              </w:rPr>
+              <w:t xml:space="preserve">우리 회사 점유율</w:t>
+            </w:r>
+          </w:p>
+        </w:tc>
+      </w:tr>
+      <w:tr>
+        <w:trPr>
+          <w:tblHeader w:val="false"/>
+        </w:trPr>
+        <w:tc>
+          <w:tcPr>
+            <w:tcW w:type="dxa" w:w="1928"/>
+            <w:tcMar>
+              <w:top w:type="dxa" w:w="60"/>
+              <w:left w:type="dxa" w:w="100"/>
+              <w:bottom w:type="dxa" w:w="60"/>
+              <w:right w:type="dxa" w:w="100"/>
+            </w:tcMar>
+          </w:tcPr>
+          <w:p>
+            <w:pPr>
+              <w:spacing w:after="0"/>
+            </w:pPr>
+            <w:r>
+              <w:rPr>
+                <w:rFonts w:ascii="맑은 고딕" w:cs="맑은 고딕" w:eastAsia="맑은 고딕" w:hAnsi="맑은 고딕"/>
+                <w:b w:val="false"/>
+                <w:bCs w:val="false"/>
+                <w:sz w:val="18"/>
+                <w:szCs w:val="18"/>
+              </w:rPr>
+              <w:t xml:space="preserve">2021년</w:t>
+            </w:r>
+          </w:p>
+        </w:tc>
+        <w:tc>
+          <w:tcPr>
+            <w:tcW w:type="dxa" w:w="1542"/>
+            <w:tcMar>
+              <w:top w:type="dxa" w:w="60"/>
+              <w:left w:type="dxa" w:w="100"/>
+              <w:bottom w:type="dxa" w:w="60"/>
+              <w:right w:type="dxa" w:w="100"/>
+            </w:tcMar>
+          </w:tcPr>
+          <w:p>
+            <w:pPr>
+              <w:spacing w:after="0"/>
+            </w:pPr>
+            <w:r>
+              <w:rPr>
+                <w:rFonts w:ascii="맑은 고딕" w:cs="맑은 고딕" w:eastAsia="맑은 고딕" w:hAnsi="맑은 고딕"/>
+                <w:b w:val="false"/>
+                <w:bCs w:val="false"/>
+                <w:sz w:val="18"/>
+                <w:szCs w:val="18"/>
+              </w:rPr>
+              <w:t xml:space="preserve">[기입]</w:t>
+            </w:r>
+          </w:p>
+        </w:tc>
+        <w:tc>
+          <w:tcPr>
+            <w:tcW w:type="dxa" w:w="1542"/>
+            <w:tcMar>
+              <w:top w:type="dxa" w:w="60"/>
+              <w:left w:type="dxa" w:w="100"/>
+              <w:bottom w:type="dxa" w:w="60"/>
+              <w:right w:type="dxa" w:w="100"/>
+            </w:tcMar>
+          </w:tcPr>
+          <w:p>
+            <w:pPr>
+              <w:spacing w:after="0"/>
+            </w:pPr>
+            <w:r>
+              <w:rPr>
+                <w:rFonts w:ascii="맑은 고딕" w:cs="맑은 고딕" w:eastAsia="맑은 고딕" w:hAnsi="맑은 고딕"/>
+                <w:b w:val="false"/>
+                <w:bCs w:val="false"/>
+                <w:sz w:val="18"/>
+                <w:szCs w:val="18"/>
+              </w:rPr>
+              <w:t xml:space="preserve">[기입]</w:t>
+            </w:r>
+          </w:p>
+        </w:tc>
+        <w:tc>
+          <w:tcPr>
+            <w:tcW w:type="dxa" w:w="1542"/>
+            <w:tcMar>
+              <w:top w:type="dxa" w:w="60"/>
+              <w:left w:type="dxa" w:w="100"/>
+              <w:bottom w:type="dxa" w:w="60"/>
+              <w:right w:type="dxa" w:w="100"/>
+            </w:tcMar>
+          </w:tcPr>
+          <w:p>
+            <w:pPr>
+              <w:spacing w:after="0"/>
+            </w:pPr>
+            <w:r>
+              <w:rPr>
+                <w:rFonts w:ascii="맑은 고딕" w:cs="맑은 고딕" w:eastAsia="맑은 고딕" w:hAnsi="맑은 고딕"/>
+                <w:b w:val="false"/>
+                <w:bCs w:val="false"/>
+                <w:sz w:val="18"/>
+                <w:szCs w:val="18"/>
+              </w:rPr>
+              <w:t xml:space="preserve">[계산]</w:t>
+            </w:r>
+          </w:p>
+        </w:tc>
+        <w:tc>
+          <w:tcPr>
+            <w:tcW w:type="dxa" w:w="1542"/>
+            <w:tcMar>
+              <w:top w:type="dxa" w:w="60"/>
+              <w:left w:type="dxa" w:w="100"/>
+              <w:bottom w:type="dxa" w:w="60"/>
+              <w:right w:type="dxa" w:w="100"/>
+            </w:tcMar>
+          </w:tcPr>
+          <w:p>
+            <w:pPr>
+              <w:spacing w:after="0"/>
+            </w:pPr>
+            <w:r>
+              <w:rPr>
+                <w:rFonts w:ascii="맑은 고딕" w:cs="맑은 고딕" w:eastAsia="맑은 고딕" w:hAnsi="맑은 고딕"/>
+                <w:b w:val="false"/>
+                <w:bCs w:val="false"/>
+                <w:sz w:val="18"/>
+                <w:szCs w:val="18"/>
+              </w:rPr>
+              <w:t xml:space="preserve">[기입]</w:t>
+            </w:r>
+          </w:p>
+        </w:tc>
+        <w:tc>
+          <w:tcPr>
+            <w:tcW w:type="dxa" w:w="1542"/>
+            <w:tcMar>
+              <w:top w:type="dxa" w:w="60"/>
+              <w:left w:type="dxa" w:w="100"/>
+              <w:bottom w:type="dxa" w:w="60"/>
+              <w:right w:type="dxa" w:w="100"/>
+            </w:tcMar>
+          </w:tcPr>
+          <w:p>
+            <w:pPr>
+              <w:spacing w:after="0"/>
+            </w:pPr>
+            <w:r>
+              <w:rPr>
+                <w:rFonts w:ascii="맑은 고딕" w:cs="맑은 고딕" w:eastAsia="맑은 고딕" w:hAnsi="맑은 고딕"/>
+                <w:b w:val="false"/>
+                <w:bCs w:val="false"/>
+                <w:sz w:val="18"/>
+                <w:szCs w:val="18"/>
+              </w:rPr>
+              <w:t xml:space="preserve">[계산]</w:t>
+            </w:r>
+          </w:p>
+        </w:tc>
+      </w:tr>
+      <w:tr>
+        <w:trPr>
+          <w:tblHeader w:val="false"/>
+        </w:trPr>
+        <w:tc>
+          <w:tcPr>
+            <w:tcW w:type="dxa" w:w="1928"/>
+            <w:tcMar>
+              <w:top w:type="dxa" w:w="60"/>
+              <w:left w:type="dxa" w:w="100"/>
+              <w:bottom w:type="dxa" w:w="60"/>
+              <w:right w:type="dxa" w:w="100"/>
+            </w:tcMar>
+          </w:tcPr>
+          <w:p>
+            <w:pPr>
+              <w:spacing w:after="0"/>
+            </w:pPr>
+            <w:r>
+              <w:rPr>
+                <w:rFonts w:ascii="맑은 고딕" w:cs="맑은 고딕" w:eastAsia="맑은 고딕" w:hAnsi="맑은 고딕"/>
+                <w:b w:val="false"/>
+                <w:bCs w:val="false"/>
+                <w:sz w:val="18"/>
+                <w:szCs w:val="18"/>
+              </w:rPr>
+              <w:t xml:space="preserve">2022년</w:t>
+            </w:r>
+          </w:p>
+        </w:tc>
+        <w:tc>
+          <w:tcPr>
+            <w:tcW w:type="dxa" w:w="1542"/>
+            <w:tcMar>
+              <w:top w:type="dxa" w:w="60"/>
+              <w:left w:type="dxa" w:w="100"/>
+              <w:bottom w:type="dxa" w:w="60"/>
+              <w:right w:type="dxa" w:w="100"/>
+            </w:tcMar>
+          </w:tcPr>
+          <w:p>
+            <w:pPr>
+              <w:spacing w:after="0"/>
+            </w:pPr>
+            <w:r>
+              <w:rPr>
+                <w:rFonts w:ascii="맑은 고딕" w:cs="맑은 고딕" w:eastAsia="맑은 고딕" w:hAnsi="맑은 고딕"/>
+                <w:b w:val="false"/>
+                <w:bCs w:val="false"/>
+                <w:sz w:val="18"/>
+                <w:szCs w:val="18"/>
+              </w:rPr>
+              <w:t xml:space="preserve">[기입]</w:t>
+            </w:r>
+          </w:p>
+        </w:tc>
+        <w:tc>
+          <w:tcPr>
+            <w:tcW w:type="dxa" w:w="1542"/>
+            <w:tcMar>
+              <w:top w:type="dxa" w:w="60"/>
+              <w:left w:type="dxa" w:w="100"/>
+              <w:bottom w:type="dxa" w:w="60"/>
+              <w:right w:type="dxa" w:w="100"/>
+            </w:tcMar>
+          </w:tcPr>
+          <w:p>
+            <w:pPr>
+              <w:spacing w:after="0"/>
+            </w:pPr>
+            <w:r>
+              <w:rPr>
+                <w:rFonts w:ascii="맑은 고딕" w:cs="맑은 고딕" w:eastAsia="맑은 고딕" w:hAnsi="맑은 고딕"/>
+                <w:b w:val="false"/>
+                <w:bCs w:val="false"/>
+                <w:sz w:val="18"/>
+                <w:szCs w:val="18"/>
+              </w:rPr>
+              <w:t xml:space="preserve">[기입]</w:t>
+            </w:r>
+          </w:p>
+        </w:tc>
+        <w:tc>
+          <w:tcPr>
+            <w:tcW w:type="dxa" w:w="1542"/>
+            <w:tcMar>
+              <w:top w:type="dxa" w:w="60"/>
+              <w:left w:type="dxa" w:w="100"/>
+              <w:bottom w:type="dxa" w:w="60"/>
+              <w:right w:type="dxa" w:w="100"/>
+            </w:tcMar>
+          </w:tcPr>
+          <w:p>
+            <w:pPr>
+              <w:spacing w:after="0"/>
+            </w:pPr>
+            <w:r>
+              <w:rPr>
+                <w:rFonts w:ascii="맑은 고딕" w:cs="맑은 고딕" w:eastAsia="맑은 고딕" w:hAnsi="맑은 고딕"/>
+                <w:b w:val="false"/>
+                <w:bCs w:val="false"/>
+                <w:sz w:val="18"/>
+                <w:szCs w:val="18"/>
+              </w:rPr>
+              <w:t xml:space="preserve">[계산]</w:t>
+            </w:r>
+          </w:p>
+        </w:tc>
+        <w:tc>
+          <w:tcPr>
+            <w:tcW w:type="dxa" w:w="1542"/>
+            <w:tcMar>
+              <w:top w:type="dxa" w:w="60"/>
+              <w:left w:type="dxa" w:w="100"/>
+              <w:bottom w:type="dxa" w:w="60"/>
+              <w:right w:type="dxa" w:w="100"/>
+            </w:tcMar>
+          </w:tcPr>
+          <w:p>
+            <w:pPr>
+              <w:spacing w:after="0"/>
+            </w:pPr>
+            <w:r>
+              <w:rPr>
+                <w:rFonts w:ascii="맑은 고딕" w:cs="맑은 고딕" w:eastAsia="맑은 고딕" w:hAnsi="맑은 고딕"/>
+                <w:b w:val="false"/>
+                <w:bCs w:val="false"/>
+                <w:sz w:val="18"/>
+                <w:szCs w:val="18"/>
+              </w:rPr>
+              <w:t xml:space="preserve">[기입]</w:t>
+            </w:r>
+          </w:p>
+        </w:tc>
+        <w:tc>
+          <w:tcPr>
+            <w:tcW w:type="dxa" w:w="1542"/>
+            <w:tcMar>
+              <w:top w:type="dxa" w:w="60"/>
+              <w:left w:type="dxa" w:w="100"/>
+              <w:bottom w:type="dxa" w:w="60"/>
+              <w:right w:type="dxa" w:w="100"/>
+            </w:tcMar>
+          </w:tcPr>
+          <w:p>
+            <w:pPr>
+              <w:spacing w:after="0"/>
+            </w:pPr>
+            <w:r>
+              <w:rPr>
+                <w:rFonts w:ascii="맑은 고딕" w:cs="맑은 고딕" w:eastAsia="맑은 고딕" w:hAnsi="맑은 고딕"/>
+                <w:b w:val="false"/>
+                <w:bCs w:val="false"/>
+                <w:sz w:val="18"/>
+                <w:szCs w:val="18"/>
+              </w:rPr>
+              <w:t xml:space="preserve">[계산]</w:t>
+            </w:r>
+          </w:p>
+        </w:tc>
+      </w:tr>
+      <w:tr>
+        <w:trPr>
+          <w:tblHeader w:val="false"/>
+        </w:trPr>
+        <w:tc>
+          <w:tcPr>
+            <w:tcW w:type="dxa" w:w="1928"/>
+            <w:tcMar>
+              <w:top w:type="dxa" w:w="60"/>
+              <w:left w:type="dxa" w:w="100"/>
+              <w:bottom w:type="dxa" w:w="60"/>
+              <w:right w:type="dxa" w:w="100"/>
+            </w:tcMar>
+          </w:tcPr>
+          <w:p>
+            <w:pPr>
+              <w:spacing w:after="0"/>
+            </w:pPr>
+            <w:r>
+              <w:rPr>
+                <w:rFonts w:ascii="맑은 고딕" w:cs="맑은 고딕" w:eastAsia="맑은 고딕" w:hAnsi="맑은 고딕"/>
+                <w:b w:val="false"/>
+                <w:bCs w:val="false"/>
+                <w:sz w:val="18"/>
+                <w:szCs w:val="18"/>
+              </w:rPr>
+              <w:t xml:space="preserve">2023년</w:t>
+            </w:r>
+          </w:p>
+        </w:tc>
+        <w:tc>
+          <w:tcPr>
+            <w:tcW w:type="dxa" w:w="1542"/>
+            <w:tcMar>
+              <w:top w:type="dxa" w:w="60"/>
+              <w:left w:type="dxa" w:w="100"/>
+              <w:bottom w:type="dxa" w:w="60"/>
+              <w:right w:type="dxa" w:w="100"/>
+            </w:tcMar>
+          </w:tcPr>
+          <w:p>
+            <w:pPr>
+              <w:spacing w:after="0"/>
+            </w:pPr>
+            <w:r>
+              <w:rPr>
+                <w:rFonts w:ascii="맑은 고딕" w:cs="맑은 고딕" w:eastAsia="맑은 고딕" w:hAnsi="맑은 고딕"/>
+                <w:b w:val="false"/>
+                <w:bCs w:val="false"/>
+                <w:sz w:val="18"/>
+                <w:szCs w:val="18"/>
+              </w:rPr>
+              <w:t xml:space="preserve">[기입]</w:t>
+            </w:r>
+          </w:p>
+        </w:tc>
+        <w:tc>
+          <w:tcPr>
+            <w:tcW w:type="dxa" w:w="1542"/>
+            <w:tcMar>
+              <w:top w:type="dxa" w:w="60"/>
+              <w:left w:type="dxa" w:w="100"/>
+              <w:bottom w:type="dxa" w:w="60"/>
+              <w:right w:type="dxa" w:w="100"/>
+            </w:tcMar>
+          </w:tcPr>
+          <w:p>
+            <w:pPr>
+              <w:spacing w:after="0"/>
+            </w:pPr>
+            <w:r>
+              <w:rPr>
+                <w:rFonts w:ascii="맑은 고딕" w:cs="맑은 고딕" w:eastAsia="맑은 고딕" w:hAnsi="맑은 고딕"/>
+                <w:b w:val="false"/>
+                <w:bCs w:val="false"/>
+                <w:sz w:val="18"/>
+                <w:szCs w:val="18"/>
+              </w:rPr>
+              <w:t xml:space="preserve">[기입]</w:t>
+            </w:r>
+          </w:p>
+        </w:tc>
+        <w:tc>
+          <w:tcPr>
+            <w:tcW w:type="dxa" w:w="1542"/>
+            <w:tcMar>
+              <w:top w:type="dxa" w:w="60"/>
+              <w:left w:type="dxa" w:w="100"/>
+              <w:bottom w:type="dxa" w:w="60"/>
+              <w:right w:type="dxa" w:w="100"/>
+            </w:tcMar>
+          </w:tcPr>
+          <w:p>
+            <w:pPr>
+              <w:spacing w:after="0"/>
+            </w:pPr>
+            <w:r>
+              <w:rPr>
+                <w:rFonts w:ascii="맑은 고딕" w:cs="맑은 고딕" w:eastAsia="맑은 고딕" w:hAnsi="맑은 고딕"/>
+                <w:b w:val="false"/>
+                <w:bCs w:val="false"/>
+                <w:sz w:val="18"/>
+                <w:szCs w:val="18"/>
+              </w:rPr>
+              <w:t xml:space="preserve">[계산]</w:t>
+            </w:r>
+          </w:p>
+        </w:tc>
+        <w:tc>
+          <w:tcPr>
+            <w:tcW w:type="dxa" w:w="1542"/>
+            <w:tcMar>
+              <w:top w:type="dxa" w:w="60"/>
+              <w:left w:type="dxa" w:w="100"/>
+              <w:bottom w:type="dxa" w:w="60"/>
+              <w:right w:type="dxa" w:w="100"/>
+            </w:tcMar>
+          </w:tcPr>
+          <w:p>
+            <w:pPr>
+              <w:spacing w:after="0"/>
+            </w:pPr>
+            <w:r>
+              <w:rPr>
+                <w:rFonts w:ascii="맑은 고딕" w:cs="맑은 고딕" w:eastAsia="맑은 고딕" w:hAnsi="맑은 고딕"/>
+                <w:b w:val="false"/>
+                <w:bCs w:val="false"/>
+                <w:sz w:val="18"/>
+                <w:szCs w:val="18"/>
+              </w:rPr>
+              <w:t xml:space="preserve">[기입]</w:t>
+            </w:r>
+          </w:p>
+        </w:tc>
+        <w:tc>
+          <w:tcPr>
+            <w:tcW w:type="dxa" w:w="1542"/>
+            <w:tcMar>
+              <w:top w:type="dxa" w:w="60"/>
+              <w:left w:type="dxa" w:w="100"/>
+              <w:bottom w:type="dxa" w:w="60"/>
+              <w:right w:type="dxa" w:w="100"/>
+            </w:tcMar>
+          </w:tcPr>
+          <w:p>
+            <w:pPr>
+              <w:spacing w:after="0"/>
+            </w:pPr>
+            <w:r>
+              <w:rPr>
+                <w:rFonts w:ascii="맑은 고딕" w:cs="맑은 고딕" w:eastAsia="맑은 고딕" w:hAnsi="맑은 고딕"/>
+                <w:b w:val="false"/>
+                <w:bCs w:val="false"/>
+                <w:sz w:val="18"/>
+                <w:szCs w:val="18"/>
+              </w:rPr>
+              <w:t xml:space="preserve">[계산]</w:t>
+            </w:r>
+          </w:p>
+        </w:tc>
+      </w:tr>
+      <w:tr>
+        <w:trPr>
+          <w:tblHeader w:val="false"/>
+        </w:trPr>
+        <w:tc>
+          <w:tcPr>
+            <w:tcW w:type="dxa" w:w="1928"/>
+            <w:tcMar>
+              <w:top w:type="dxa" w:w="60"/>
+              <w:left w:type="dxa" w:w="100"/>
+              <w:bottom w:type="dxa" w:w="60"/>
+              <w:right w:type="dxa" w:w="100"/>
+            </w:tcMar>
+          </w:tcPr>
+          <w:p>
+            <w:pPr>
+              <w:spacing w:after="0"/>
+            </w:pPr>
+            <w:r>
+              <w:rPr>
+                <w:rFonts w:ascii="맑은 고딕" w:cs="맑은 고딕" w:eastAsia="맑은 고딕" w:hAnsi="맑은 고딕"/>
+                <w:b w:val="false"/>
+                <w:bCs w:val="false"/>
+                <w:sz w:val="18"/>
+                <w:szCs w:val="18"/>
+              </w:rPr>
+              <w:t xml:space="preserve">2024년</w:t>
+            </w:r>
+          </w:p>
+        </w:tc>
+        <w:tc>
+          <w:tcPr>
+            <w:tcW w:type="dxa" w:w="1542"/>
+            <w:tcMar>
+              <w:top w:type="dxa" w:w="60"/>
+              <w:left w:type="dxa" w:w="100"/>
+              <w:bottom w:type="dxa" w:w="60"/>
+              <w:right w:type="dxa" w:w="100"/>
+            </w:tcMar>
+          </w:tcPr>
+          <w:p>
+            <w:pPr>
+              <w:spacing w:after="0"/>
+            </w:pPr>
+            <w:r>
+              <w:rPr>
+                <w:rFonts w:ascii="맑은 고딕" w:cs="맑은 고딕" w:eastAsia="맑은 고딕" w:hAnsi="맑은 고딕"/>
+                <w:b w:val="false"/>
+                <w:bCs w:val="false"/>
+                <w:sz w:val="18"/>
+                <w:szCs w:val="18"/>
+              </w:rPr>
+              <w:t xml:space="preserve">[기입]</w:t>
+            </w:r>
+          </w:p>
+        </w:tc>
+        <w:tc>
+          <w:tcPr>
+            <w:tcW w:type="dxa" w:w="1542"/>
+            <w:tcMar>
+              <w:top w:type="dxa" w:w="60"/>
+              <w:left w:type="dxa" w:w="100"/>
+              <w:bottom w:type="dxa" w:w="60"/>
+              <w:right w:type="dxa" w:w="100"/>
+            </w:tcMar>
+          </w:tcPr>
+          <w:p>
+            <w:pPr>
+              <w:spacing w:after="0"/>
+            </w:pPr>
+            <w:r>
+              <w:rPr>
+                <w:rFonts w:ascii="맑은 고딕" w:cs="맑은 고딕" w:eastAsia="맑은 고딕" w:hAnsi="맑은 고딕"/>
+                <w:b w:val="false"/>
+                <w:bCs w:val="false"/>
+                <w:sz w:val="18"/>
+                <w:szCs w:val="18"/>
+              </w:rPr>
+              <w:t xml:space="preserve">[기입]</w:t>
+            </w:r>
+          </w:p>
+        </w:tc>
+        <w:tc>
+          <w:tcPr>
+            <w:tcW w:type="dxa" w:w="1542"/>
+            <w:tcMar>
+              <w:top w:type="dxa" w:w="60"/>
+              <w:left w:type="dxa" w:w="100"/>
+              <w:bottom w:type="dxa" w:w="60"/>
+              <w:right w:type="dxa" w:w="100"/>
+            </w:tcMar>
+          </w:tcPr>
+          <w:p>
+            <w:pPr>
+              <w:spacing w:after="0"/>
+            </w:pPr>
+            <w:r>
+              <w:rPr>
+                <w:rFonts w:ascii="맑은 고딕" w:cs="맑은 고딕" w:eastAsia="맑은 고딕" w:hAnsi="맑은 고딕"/>
+                <w:b w:val="false"/>
+                <w:bCs w:val="false"/>
+                <w:sz w:val="18"/>
+                <w:szCs w:val="18"/>
+              </w:rPr>
+              <w:t xml:space="preserve">[계산]</w:t>
+            </w:r>
+          </w:p>
+        </w:tc>
+        <w:tc>
+          <w:tcPr>
+            <w:tcW w:type="dxa" w:w="1542"/>
+            <w:tcMar>
+              <w:top w:type="dxa" w:w="60"/>
+              <w:left w:type="dxa" w:w="100"/>
+              <w:bottom w:type="dxa" w:w="60"/>
+              <w:right w:type="dxa" w:w="100"/>
+            </w:tcMar>
+          </w:tcPr>
+          <w:p>
+            <w:pPr>
+              <w:spacing w:after="0"/>
+            </w:pPr>
+            <w:r>
+              <w:rPr>
+                <w:rFonts w:ascii="맑은 고딕" w:cs="맑은 고딕" w:eastAsia="맑은 고딕" w:hAnsi="맑은 고딕"/>
+                <w:b w:val="false"/>
+                <w:bCs w:val="false"/>
+                <w:sz w:val="18"/>
+                <w:szCs w:val="18"/>
+              </w:rPr>
+              <w:t xml:space="preserve">[기입]</w:t>
+            </w:r>
+          </w:p>
+        </w:tc>
+        <w:tc>
+          <w:tcPr>
+            <w:tcW w:type="dxa" w:w="1542"/>
+            <w:tcMar>
+              <w:top w:type="dxa" w:w="60"/>
+              <w:left w:type="dxa" w:w="100"/>
+              <w:bottom w:type="dxa" w:w="60"/>
+              <w:right w:type="dxa" w:w="100"/>
+            </w:tcMar>
+          </w:tcPr>
+          <w:p>
+            <w:pPr>
+              <w:spacing w:after="0"/>
+            </w:pPr>
+            <w:r>
+              <w:rPr>
+                <w:rFonts w:ascii="맑은 고딕" w:cs="맑은 고딕" w:eastAsia="맑은 고딕" w:hAnsi="맑은 고딕"/>
+                <w:b w:val="false"/>
+                <w:bCs w:val="false"/>
+                <w:sz w:val="18"/>
+                <w:szCs w:val="18"/>
+              </w:rPr>
+              <w:t xml:space="preserve">[계산]</w:t>
+            </w:r>
+          </w:p>
+        </w:tc>
+      </w:tr>
+      <w:tr>
+        <w:trPr>
+          <w:tblHeader w:val="false"/>
+        </w:trPr>
+        <w:tc>
+          <w:tcPr>
+            <w:tcW w:type="dxa" w:w="1928"/>
+            <w:tcMar>
+              <w:top w:type="dxa" w:w="60"/>
+              <w:left w:type="dxa" w:w="100"/>
+              <w:bottom w:type="dxa" w:w="60"/>
+              <w:right w:type="dxa" w:w="100"/>
+            </w:tcMar>
+          </w:tcPr>
+          <w:p>
+            <w:pPr>
+              <w:spacing w:after="0"/>
+            </w:pPr>
+            <w:r>
+              <w:rPr>
+                <w:rFonts w:ascii="맑은 고딕" w:cs="맑은 고딕" w:eastAsia="맑은 고딕" w:hAnsi="맑은 고딕"/>
+                <w:b w:val="false"/>
+                <w:bCs w:val="false"/>
+                <w:sz w:val="18"/>
+                <w:szCs w:val="18"/>
+              </w:rPr>
+              <w:t xml:space="preserve">2025년</w:t>
+            </w:r>
+          </w:p>
+        </w:tc>
+        <w:tc>
+          <w:tcPr>
+            <w:tcW w:type="dxa" w:w="1542"/>
+            <w:tcMar>
+              <w:top w:type="dxa" w:w="60"/>
+              <w:left w:type="dxa" w:w="100"/>
+              <w:bottom w:type="dxa" w:w="60"/>
+              <w:right w:type="dxa" w:w="100"/>
+            </w:tcMar>
+          </w:tcPr>
+          <w:p>
+            <w:pPr>
+              <w:spacing w:after="0"/>
+            </w:pPr>
+            <w:r>
+              <w:rPr>
+                <w:rFonts w:ascii="맑은 고딕" w:cs="맑은 고딕" w:eastAsia="맑은 고딕" w:hAnsi="맑은 고딕"/>
+                <w:b w:val="false"/>
+                <w:bCs w:val="false"/>
+                <w:sz w:val="18"/>
+                <w:szCs w:val="18"/>
+              </w:rPr>
+              <w:t xml:space="preserve">2,574명</w:t>
+            </w:r>
+          </w:p>
+        </w:tc>
+        <w:tc>
+          <w:tcPr>
+            <w:tcW w:type="dxa" w:w="1542"/>
+            <w:tcMar>
+              <w:top w:type="dxa" w:w="60"/>
+              <w:left w:type="dxa" w:w="100"/>
+              <w:bottom w:type="dxa" w:w="60"/>
+              <w:right w:type="dxa" w:w="100"/>
+            </w:tcMar>
+          </w:tcPr>
+          <w:p>
+            <w:pPr>
+              <w:spacing w:after="0"/>
+            </w:pPr>
+            <w:r>
+              <w:rPr>
+                <w:rFonts w:ascii="맑은 고딕" w:cs="맑은 고딕" w:eastAsia="맑은 고딕" w:hAnsi="맑은 고딕"/>
+                <w:b w:val="false"/>
+                <w:bCs w:val="false"/>
+                <w:sz w:val="18"/>
+                <w:szCs w:val="18"/>
+              </w:rPr>
+              <w:t xml:space="preserve">[기입]</w:t>
+            </w:r>
+          </w:p>
+        </w:tc>
+        <w:tc>
+          <w:tcPr>
+            <w:tcW w:type="dxa" w:w="1542"/>
+            <w:tcMar>
+              <w:top w:type="dxa" w:w="60"/>
+              <w:left w:type="dxa" w:w="100"/>
+              <w:bottom w:type="dxa" w:w="60"/>
+              <w:right w:type="dxa" w:w="100"/>
+            </w:tcMar>
+          </w:tcPr>
+          <w:p>
+            <w:pPr>
+              <w:spacing w:after="0"/>
+            </w:pPr>
+            <w:r>
+              <w:rPr>
+                <w:rFonts w:ascii="맑은 고딕" w:cs="맑은 고딕" w:eastAsia="맑은 고딕" w:hAnsi="맑은 고딕"/>
+                <w:b w:val="false"/>
+                <w:bCs w:val="false"/>
+                <w:sz w:val="18"/>
+                <w:szCs w:val="18"/>
+              </w:rPr>
+              <w:t xml:space="preserve">[계산]</w:t>
+            </w:r>
+          </w:p>
+        </w:tc>
+        <w:tc>
+          <w:tcPr>
+            <w:tcW w:type="dxa" w:w="1542"/>
+            <w:tcMar>
+              <w:top w:type="dxa" w:w="60"/>
+              <w:left w:type="dxa" w:w="100"/>
+              <w:bottom w:type="dxa" w:w="60"/>
+              <w:right w:type="dxa" w:w="100"/>
+            </w:tcMar>
+          </w:tcPr>
+          <w:p>
+            <w:pPr>
+              <w:spacing w:after="0"/>
+            </w:pPr>
+            <w:r>
+              <w:rPr>
+                <w:rFonts w:ascii="맑은 고딕" w:cs="맑은 고딕" w:eastAsia="맑은 고딕" w:hAnsi="맑은 고딕"/>
+                <w:b w:val="false"/>
+                <w:bCs w:val="false"/>
+                <w:sz w:val="18"/>
+                <w:szCs w:val="18"/>
+              </w:rPr>
+              <w:t xml:space="preserve">[기입]</w:t>
+            </w:r>
+          </w:p>
+        </w:tc>
+        <w:tc>
+          <w:tcPr>
+            <w:tcW w:type="dxa" w:w="1542"/>
+            <w:tcMar>
+              <w:top w:type="dxa" w:w="60"/>
+              <w:left w:type="dxa" w:w="100"/>
+              <w:bottom w:type="dxa" w:w="60"/>
+              <w:right w:type="dxa" w:w="100"/>
+            </w:tcMar>
+          </w:tcPr>
+          <w:p>
+            <w:pPr>
+              <w:spacing w:after="0"/>
+            </w:pPr>
+            <w:r>
+              <w:rPr>
+                <w:rFonts w:ascii="맑은 고딕" w:cs="맑은 고딕" w:eastAsia="맑은 고딕" w:hAnsi="맑은 고딕"/>
+                <w:b w:val="false"/>
+                <w:bCs w:val="false"/>
+                <w:sz w:val="18"/>
+                <w:szCs w:val="18"/>
+              </w:rPr>
+              <w:t xml:space="preserve">[계산]</w:t>
+            </w:r>
+          </w:p>
+        </w:tc>
+      </w:tr>
+      <w:tr>
+        <w:trPr>
+          <w:tblHeader w:val="false"/>
+        </w:trPr>
+        <w:tc>
+          <w:tcPr>
+            <w:tcW w:type="dxa" w:w="1928"/>
+            <w:tcMar>
+              <w:top w:type="dxa" w:w="60"/>
+              <w:left w:type="dxa" w:w="100"/>
+              <w:bottom w:type="dxa" w:w="60"/>
+              <w:right w:type="dxa" w:w="100"/>
+            </w:tcMar>
+          </w:tcPr>
+          <w:p>
+            <w:pPr>
+              <w:spacing w:after="0"/>
+            </w:pPr>
+            <w:r>
+              <w:rPr>
+                <w:rFonts w:ascii="맑은 고딕" w:cs="맑은 고딕" w:eastAsia="맑은 고딕" w:hAnsi="맑은 고딕"/>
+                <w:b w:val="false"/>
+                <w:bCs w:val="false"/>
+                <w:sz w:val="18"/>
+                <w:szCs w:val="18"/>
+              </w:rPr>
+              <w:t xml:space="preserve">2026년 1~8월</w:t>
+            </w:r>
+          </w:p>
+        </w:tc>
+        <w:tc>
+          <w:tcPr>
+            <w:tcW w:type="dxa" w:w="1542"/>
+            <w:tcMar>
+              <w:top w:type="dxa" w:w="60"/>
+              <w:left w:type="dxa" w:w="100"/>
+              <w:bottom w:type="dxa" w:w="60"/>
+              <w:right w:type="dxa" w:w="100"/>
+            </w:tcMar>
+          </w:tcPr>
+          <w:p>
+            <w:pPr>
+              <w:spacing w:after="0"/>
+            </w:pPr>
+            <w:r>
+              <w:rPr>
+                <w:rFonts w:ascii="맑은 고딕" w:cs="맑은 고딕" w:eastAsia="맑은 고딕" w:hAnsi="맑은 고딕"/>
+                <w:b w:val="false"/>
+                <w:bCs w:val="false"/>
+                <w:sz w:val="18"/>
+                <w:szCs w:val="18"/>
+              </w:rPr>
+              <w:t xml:space="preserve">[기입]</w:t>
+            </w:r>
+          </w:p>
+        </w:tc>
+        <w:tc>
+          <w:tcPr>
+            <w:tcW w:type="dxa" w:w="1542"/>
+            <w:tcMar>
+              <w:top w:type="dxa" w:w="60"/>
+              <w:left w:type="dxa" w:w="100"/>
+              <w:bottom w:type="dxa" w:w="60"/>
+              <w:right w:type="dxa" w:w="100"/>
+            </w:tcMar>
+          </w:tcPr>
+          <w:p>
+            <w:pPr>
+              <w:spacing w:after="0"/>
+            </w:pPr>
+            <w:r>
+              <w:rPr>
+                <w:rFonts w:ascii="맑은 고딕" w:cs="맑은 고딕" w:eastAsia="맑은 고딕" w:hAnsi="맑은 고딕"/>
+                <w:b w:val="false"/>
+                <w:bCs w:val="false"/>
+                <w:sz w:val="18"/>
+                <w:szCs w:val="18"/>
+              </w:rPr>
+              <w:t xml:space="preserve">[기입]</w:t>
+            </w:r>
+          </w:p>
+        </w:tc>
+        <w:tc>
+          <w:tcPr>
+            <w:tcW w:type="dxa" w:w="1542"/>
+            <w:tcMar>
+              <w:top w:type="dxa" w:w="60"/>
+              <w:left w:type="dxa" w:w="100"/>
+              <w:bottom w:type="dxa" w:w="60"/>
+              <w:right w:type="dxa" w:w="100"/>
+            </w:tcMar>
+          </w:tcPr>
+          <w:p>
+            <w:pPr>
+              <w:spacing w:after="0"/>
+            </w:pPr>
+            <w:r>
+              <w:rPr>
+                <w:rFonts w:ascii="맑은 고딕" w:cs="맑은 고딕" w:eastAsia="맑은 고딕" w:hAnsi="맑은 고딕"/>
+                <w:b w:val="false"/>
+                <w:bCs w:val="false"/>
+                <w:sz w:val="18"/>
+                <w:szCs w:val="18"/>
+              </w:rPr>
+              <w:t xml:space="preserve">[계산]</w:t>
+            </w:r>
+          </w:p>
+        </w:tc>
+        <w:tc>
+          <w:tcPr>
+            <w:tcW w:type="dxa" w:w="1542"/>
+            <w:tcMar>
+              <w:top w:type="dxa" w:w="60"/>
+              <w:left w:type="dxa" w:w="100"/>
+              <w:bottom w:type="dxa" w:w="60"/>
+              <w:right w:type="dxa" w:w="100"/>
+            </w:tcMar>
+          </w:tcPr>
+          <w:p>
+            <w:pPr>
+              <w:spacing w:after="0"/>
+            </w:pPr>
+            <w:r>
+              <w:rPr>
+                <w:rFonts w:ascii="맑은 고딕" w:cs="맑은 고딕" w:eastAsia="맑은 고딕" w:hAnsi="맑은 고딕"/>
+                <w:b w:val="false"/>
+                <w:bCs w:val="false"/>
+                <w:sz w:val="18"/>
+                <w:szCs w:val="18"/>
+              </w:rPr>
+              <w:t xml:space="preserve">[기입]</w:t>
+            </w:r>
+          </w:p>
+        </w:tc>
+        <w:tc>
+          <w:tcPr>
+            <w:tcW w:type="dxa" w:w="1542"/>
+            <w:tcMar>
+              <w:top w:type="dxa" w:w="60"/>
+              <w:left w:type="dxa" w:w="100"/>
+              <w:bottom w:type="dxa" w:w="60"/>
+              <w:right w:type="dxa" w:w="100"/>
+            </w:tcMar>
+          </w:tcPr>
+          <w:p>
+            <w:pPr>
+              <w:spacing w:after="0"/>
+            </w:pPr>
+            <w:r>
+              <w:rPr>
+                <w:rFonts w:ascii="맑은 고딕" w:cs="맑은 고딕" w:eastAsia="맑은 고딕" w:hAnsi="맑은 고딕"/>
+                <w:b w:val="false"/>
+                <w:bCs w:val="false"/>
+                <w:sz w:val="18"/>
+                <w:szCs w:val="18"/>
+              </w:rPr>
+              <w:t xml:space="preserve">[계산]</w:t>
+            </w:r>
+          </w:p>
+        </w:tc>
+      </w:tr>
+    </w:tbl>
+    <w:p>
+      <w:pPr>
+        <w:spacing w:after="80"/>
+      </w:pPr>
+    </w:p>
+    <w:p>
+      <w:pPr>
+        <w:pStyle w:val="ListParagraph"/>
+        <w:numPr>
+          <w:ilvl w:val="0"/>
+          <w:numId w:val="3"/>
+        </w:numPr>
+        <w:spacing w:after="60"/>
+      </w:pPr>
+      <w:r>
+        <w:rPr>
+          <w:rFonts w:ascii="맑은 고딕" w:cs="맑은 고딕" w:eastAsia="맑은 고딕" w:hAnsi="맑은 고딕"/>
+          <w:sz w:val="20"/>
+          <w:szCs w:val="20"/>
+        </w:rPr>
+        <w:t xml:space="preserve">출생아 수는 김포시 인구브리핑·통계연보, 지원 인원은 김포시 보건소, 담당 건수는 우리 회사 내부 기록에서 가져옵니다.</w:t>
+      </w:r>
+    </w:p>
+    <w:p>
+      <w:pPr>
+        <w:pStyle w:val="ListParagraph"/>
+        <w:numPr>
+          <w:ilvl w:val="0"/>
+          <w:numId w:val="3"/>
+        </w:numPr>
+        <w:spacing w:after="60"/>
+      </w:pPr>
+      <w:r>
+        <w:rPr>
+          <w:rFonts w:ascii="맑은 고딕" w:cs="맑은 고딕" w:eastAsia="맑은 고딕" w:hAnsi="맑은 고딕"/>
+          <w:sz w:val="20"/>
+          <w:szCs w:val="20"/>
+        </w:rPr>
+        <w:t xml:space="preserve">참고 비교 수치: 전국 2021년 48%, 경기도 2024년 72%, 경기도 2025년 상반기 72%.</w:t>
+      </w:r>
+    </w:p>
+    <w:p>
+      <w:pPr>
+        <w:pStyle w:val="Heading2"/>
+        <w:spacing w:after="100" w:before="200"/>
+      </w:pPr>
+      <w:r>
+        <w:rPr>
+          <w:rFonts w:ascii="맑은 고딕" w:cs="맑은 고딕" w:eastAsia="맑은 고딕" w:hAnsi="맑은 고딕"/>
+          <w:b/>
+          <w:bCs/>
+          <w:color w:val="2E5C8A"/>
+          <w:sz w:val="23"/>
+          <w:szCs w:val="23"/>
+        </w:rPr>
+        <w:t xml:space="preserve">A-5. 바우처 이용 현황 (공공 통계)</w:t>
       </w:r>
     </w:p>
     <w:tbl>

</xml_diff>